<commit_message>
Committee round 2: style, chart data, layout fixes and rebuilt outputs
Co-Authored-By: Claude Opus 5.5 <noreply@anthropic.com>
Claude-Session: https://claude.ai/code/session_011SJZihQQoizcK7ApWgRNEa
</commit_message>
<xml_diff>
--- a/outputs/LLC_AI_Infrastructure_Case_Study.docx
+++ b/outputs/LLC_AI_Infrastructure_Case_Study.docx
@@ -214,7 +214,7 @@
           <w:sz w:val="21"/>
           <w:szCs w:val="21"/>
         </w:rPr>
-        <w:t xml:space="preserve">AI infrastructure financing is the debt and structured capital used to build data centers and the compute inside them, and it has shifted from hyperscaler cash flow to the credit markets. The defining structure is the off balance sheet joint venture. A hyperscaler contributes a campus to a special purpose vehicle, a private capital partner takes majority equity, and the vehicle issues long dated bonds or loans secured by a lease back to the hyperscaler. The debt sits at the project level, which keeps leverage off the tenant's balance sheet in exchange for a higher borrowing cost. Meta's $27bn Hyperion campus in Louisiana set the template in October 2025, with Blue Owl holding 80%, Meta holding 20%, and A+ rated bonds priced at 6.58% versus roughly 5.5% on Meta's own corporate debt. It remains the largest private credit transaction ever. Oracle has taken the opposite route by borrowing directly on its own balance sheet.</w:t>
+        <w:t xml:space="preserve">AI infrastructure financing is the debt and structured capital used to build data centers and the compute inside them, and it has shifted from hyperscaler cash flow to the credit markets. The defining structure is the joint venture. A hyperscaler contributes a campus to a special purpose vehicle, the building block of last month's ABS case study. A private capital partner takes majority equity, and the vehicle issues long dated bonds secured by a lease back to the hyperscaler. The debt sits at the project level, which keeps leverage off the tenant's reported balance sheet in exchange for a higher borrowing cost. Meta's $27bn Hyperion campus in Louisiana set the template in October 2025, with Blue Owl holding 80%, Meta holding 20%, and A+ rated bonds priced at 6.58%, about 225bps over Treasuries, against roughly 5.5% on a comparable Meta corporate bond. Oracle has leaned more on its own balance sheet while also leasing campuses financed at the project level.</w:t>
       </w:r>
     </w:p>
     <w:p>
@@ -242,7 +242,7 @@
           <w:sz w:val="21"/>
           <w:szCs w:val="21"/>
         </w:rPr>
-        <w:t xml:space="preserve">The scale of the buildout is what ties this theme to credit. Goldman Sachs expects the largest hyperscalers to spend about $750bn on capital expenditure in 2026 against operating cash flow of roughly $778bn, with debt issuance covering about one third of that spending. Amazon, Alphabet, Meta and Oracle issued about $194bn of bonds through July 7, up 79% from all of 2025, and Goldman expects issuance across the five largest hyperscalers to reach roughly $250bn this year and $400bn in 2027. US investment grade supply set a record $145.2bn in August, the third straight monthly record, as hyperscalers rose from roughly 2% of dollar issuance in 2022 through 2024 to a projected 9% in 2026. Private capital is filling the rest of the gap, with Morgan Stanley estimating that tech companies and related parties could need up to $800bn of private credit through asset specific structures by 2028. The debt behind these structures is long dated, with bonds reaching 2048 and 2049 against GPUs that last three to five years.</w:t>
+        <w:t xml:space="preserve">The scale of the buildout is what ties this theme to credit. Goldman Sachs expects the five largest hyperscalers to spend about $750bn on capital expenditure in 2026 and to fund about one third of it with debt. Amazon, Alphabet, Meta and Oracle issued about $194bn of bonds through July 7, up 79% from all of 2025, and Goldman expects issuance across the five, adding Microsoft, to reach roughly $250bn this year and $400bn in 2027. That supply has landed in investment grade, while the August recap showed high yield issuance at a one year low of $12bn. Private capital is filling the rest of the gap, with Morgan Stanley estimating that private credit could supply more than $800bn of data center financing through 2028, led by asset based finance. Several of those lenders, Blue Owl among them, halted fund redemptions in March, as covered in that month's recap. The debt is long dated, with bonds maturing in 2048 and 2049, far beyond Hyperion's four year initial lease term.</w:t>
       </w:r>
     </w:p>
     <w:p>
@@ -270,7 +270,7 @@
           <w:sz w:val="21"/>
           <w:szCs w:val="21"/>
         </w:rPr>
-        <w:t xml:space="preserve">For credit investors, the question is who holds the risk. In the joint venture structure, the hyperscaler's lease supports the bonds, but the project still carries power, permitting, and construction risk that the tenant's rating does not remove. Pricing has started to reflect this, with the El Paso bonds priced at a higher yield than Hyperion. At the same time, Oracle's move to BBB- shows that borrowing directly puts the hyperscaler itself on the credit watchlist. Both paths point to the same place, which is that AI infrastructure is becoming a distinct credit sector with its own spread behavior.</w:t>
+        <w:t xml:space="preserve">For credit investors, the question is who holds the risk. In the joint venture structure, the hyperscaler's lease supports the bonds, but the project still carries power, permitting, and construction risk that the tenant's rating does not remove. Pricing has started to reflect this, with the El Paso bonds priced at a wider spread than Hyperion. Oracle's cut to BBB- shows that heavy borrowing can put a hyperscaler itself under ratings pressure. The divergence is that capital remains abundant while the risk concentrates in single tenant projects and a short list of tenants.</w:t>
       </w:r>
     </w:p>
     <w:tbl>
@@ -315,7 +315,7 @@
                 <w:sz w:val="22"/>
                 <w:szCs w:val="22"/>
               </w:rPr>
-              <w:t xml:space="preserve">Capex Versus Operating Cash Flow ($bn)</w:t>
+              <w:t xml:space="preserve">2026 Capex Versus Debt Funding ($bn)</w:t>
             </w:r>
           </w:p>
         </w:tc>
@@ -354,7 +354,7 @@
                 <w:sz w:val="22"/>
                 <w:szCs w:val="22"/>
               </w:rPr>
-              <w:t xml:space="preserve">Asset Life Versus Debt Maturity (years)</w:t>
+              <w:t xml:space="preserve">Lease Term Versus Debt Maturity (years)</w:t>
             </w:r>
           </w:p>
         </w:tc>
@@ -415,7 +415,7 @@
                 <w:sz w:val="18"/>
                 <w:szCs w:val="18"/>
               </w:rPr>
-              <w:t xml:space="preserve">2026 capex and operating cash flow</w:t>
+              <w:t xml:space="preserve">2026 capex and expected debt issuance</w:t>
             </w:r>
           </w:p>
         </w:tc>
@@ -483,7 +483,7 @@
                 <w:sz w:val="18"/>
                 <w:szCs w:val="18"/>
               </w:rPr>
-              <w:t xml:space="preserve">GPU life, lease terms, bond maturities</w:t>
+              <w:t xml:space="preserve">Lease terms and bond maturities</w:t>
             </w:r>
           </w:p>
         </w:tc>
@@ -492,8 +492,8 @@
     <w:p>
       <w:pPr>
         <w:sectPr>
-          <w:headerReference w:type="default" r:id="rId7"/>
-          <w:footerReference w:type="default" r:id="rId8"/>
+          <w:headerReference w:type="default" r:id="rId6"/>
+          <w:footerReference w:type="default" r:id="rId7"/>
           <w:pgSz w:w="10800" w:h="15600" w:orient="portrait"/>
           <w:pgMar w:top="1040" w:right="878" w:bottom="1250" w:left="878" w:header="280" w:footer="0" w:gutter="0"/>
           <w:pgNumType w:start="5"/>
@@ -542,7 +542,7 @@
           <w:sz w:val="21"/>
           <w:szCs w:val="21"/>
         </w:rPr>
-        <w:t xml:space="preserve">Hyperscaler borrowing is now carrying a cost. Of 91 hyperscaler bonds issued in 2026 with comparable pricing data, 78 traded at higher yields on July 28 than at issuance, with a median increase of about 22bps. The median new issue concession widened to 12bps from 2.25bps in 2025, and Amazon's $25bn deal pushed its existing 30 year bond about 20bps wider. Pressure is greater in project level debt. Meta's El Paso bonds priced in July at a 7.534% yield, about 287.5bps over 10 year Treasuries, and drew roughly $17bn of orders for a $12.55bn deal. In September, a Blue Owl sponsored data center leased entirely to CoreWeave sold $1.1bn of five year notes at 9.25%, roughly 270bps above similarly rated debt.</w:t>
+        <w:t xml:space="preserve">Hyperscaler borrowing is getting more expensive. Of 91 hyperscaler bonds issued in 2026 with comparable pricing data, 78 traded at higher yields on July 28 than at issuance, with a median increase of about 22bps, a move that blends rates and spread. The cleaner credit signal is the median new issue concession, which widened to 12bps from 2.25bps in 2025, and Amazon's $25bn deal pushed its existing 30 year bond about 20bps wider. Meta's El Paso bonds priced in July at about 7.5%, roughly 287.5bps over Treasuries, and drew roughly $20bn of orders, about 1.6 times the deal. In September, a Blue Owl sponsored data center leased to CoreWeave reportedly sold $1.1bn of five year high yield notes at 9.25%, about 270bps above similarly rated debt.</w:t>
       </w:r>
     </w:p>
     <w:tbl>
@@ -786,7 +786,7 @@
           <w:sz w:val="21"/>
           <w:szCs w:val="21"/>
         </w:rPr>
-        <w:t xml:space="preserve">The structural risks are familiar to credit investors. Long dated bonds rest on leases to a single tenant, while the equipment inside the buildings turns over every three to five years, and Hyperion's lease has a four year initial term backed by a residual value guarantee from Meta. Before a campus operates, execution risk sits with lenders, as power, permitting, and local opposition can delay rent. Disclosure is limited, since the BIS notes much of this borrowing sits in private placement vehicles, and Moody's has flagged that short lease terms and residual value guarantees can understate effective obligations. The key divergence is between abundant capital and its rising price.</w:t>
+        <w:t xml:space="preserve">Long dated bonds rest on leases to a single tenant, and Hyperion's leases carry a four year initial term, so repayment after year four depends on Meta renewing or on its residual value guarantee, which covers the first 16 years. The chips inside, which Moody's says can become obsolete within four to six years, turn over far faster. Before a campus operates, power, permitting, and local opposition can delay rent. The BIS notes this borrowing increasingly sits in vehicles funded through private placements, and Moody's has flagged that short leases can understate effective obligations. The key divergence is between abundant capital and its rising price.</w:t>
       </w:r>
     </w:p>
     <w:tbl>
@@ -849,7 +849,7 @@
                 <w:sz w:val="21"/>
                 <w:szCs w:val="21"/>
               </w:rPr>
-              <w:t xml:space="preserve">Meta has funded two campuses through joint ventures with private capital. Hyperion in Louisiana raised $27bn in October 2025 with A+ rated bonds priced at 6.58%. El Paso, a one gigawatt campus due online in 2028, followed in July with $12.55bn of A+ rated bonds due 2048 priced at 7.534%. Both place the debt at the project level behind a long lease to Meta. The higher cost on the same rating and the same tenant shows investors now charge for structure, supply, and duration.</w:t>
+              <w:t xml:space="preserve">Meta has funded two campuses through joint ventures with private capital. Hyperion in Louisiana raised $27bn in October 2025 with A+ rated bonds due 2049 priced at 6.58%, about 225bps over Treasuries. El Paso, a one gigawatt campus due online in 2028, followed in July with about $12.5bn of amortizing bonds due 2048, also rated A+ by S&amp;P, at about 7.5%. Both rest on leases to Meta. Higher Treasury yields explain part of the gap, but a spread roughly 60bps wider on the same S&amp;P rating and tenant suggests investors now charge more for structure, supply, and duration.</w:t>
             </w:r>
           </w:p>
         </w:tc>
@@ -906,7 +906,7 @@
                 <w:sz w:val="21"/>
                 <w:szCs w:val="21"/>
               </w:rPr>
-              <w:t xml:space="preserve">S&amp;P cut Oracle to BBB- on July 9, citing cash burn from its AI buildout, and said another downgrade is possible if leverage stays above 4.5x. Oracle raised roughly $43bn of debt in fiscal 2026. In September, about $18bn of bank loans tied to its Project Jupiter campus in New Mexico were quoted at 89 to 91 cents on the dollar, and Oracle sent a force majeure notice to the developer, a Blue Owl unit, citing power delays. A source told Reuters Oracle cannot terminate the lease and remains responsible for debt costs, and Oracle says the project is on schedule.</w:t>
+              <w:t xml:space="preserve">S&amp;P cut Oracle to BBB- on July 9, citing a widening cash flow deficit from its AI buildout, and said another downgrade is possible if leverage stays above 4.5x. In September, about $18bn of bank loans tied to its Project Jupiter campus in New Mexico were quoted at 89 to 91 cents, and Oracle sent a force majeure notice to the developer, a Blue Owl unit, citing power delays. Reuters reported that Oracle is not seeking to terminate the lease, could defer rent for up to three years, and would still owe rent for the full term. Oracle says the project is on schedule.</w:t>
             </w:r>
           </w:p>
         </w:tc>
@@ -915,8 +915,8 @@
     <w:p>
       <w:pPr>
         <w:sectPr>
-          <w:headerReference w:type="default" r:id="rId9"/>
-          <w:footerReference w:type="default" r:id="rId10"/>
+          <w:headerReference w:type="default" r:id="rId8"/>
+          <w:footerReference w:type="default" r:id="rId9"/>
           <w:pgSz w:w="10800" w:h="15600" w:orient="portrait"/>
           <w:pgMar w:top="1040" w:right="878" w:bottom="1250" w:left="878" w:header="280" w:footer="0" w:gutter="0"/>
           <w:pgNumType/>
@@ -1654,7 +1654,7 @@
         </w:numPr>
         <w:spacing w:after="50" w:before="0"/>
       </w:pPr>
-      <w:hyperlink w:history="1" r:id="rIdkowho7iwkt5nwbly72zvu">
+      <w:hyperlink w:history="1" r:id="rIdl32sgyzp5xwi30yjkyi8d">
         <w:r>
           <w:rPr>
             <w:rFonts w:ascii="Times New Roman" w:cs="Times New Roman" w:eastAsia="Times New Roman" w:hAnsi="Times New Roman"/>
@@ -1676,7 +1676,7 @@
         </w:numPr>
         <w:spacing w:after="50" w:before="0"/>
       </w:pPr>
-      <w:hyperlink w:history="1" r:id="rIdnqz_4bzsernwflynrvswb">
+      <w:hyperlink w:history="1" r:id="rIdzfo_m5kefdygeqlesbffs">
         <w:r>
           <w:rPr>
             <w:rFonts w:ascii="Times New Roman" w:cs="Times New Roman" w:eastAsia="Times New Roman" w:hAnsi="Times New Roman"/>
@@ -1698,7 +1698,7 @@
         </w:numPr>
         <w:spacing w:after="50" w:before="0"/>
       </w:pPr>
-      <w:hyperlink w:history="1" r:id="rIddwtv4bmacpdan4kau6vdx">
+      <w:hyperlink w:history="1" r:id="rIdktwqkmt-itucezeih9vpa">
         <w:r>
           <w:rPr>
             <w:rFonts w:ascii="Times New Roman" w:cs="Times New Roman" w:eastAsia="Times New Roman" w:hAnsi="Times New Roman"/>
@@ -1720,7 +1720,7 @@
         </w:numPr>
         <w:spacing w:after="50" w:before="0"/>
       </w:pPr>
-      <w:hyperlink w:history="1" r:id="rIdcps2knewnyf30inlrwfs3">
+      <w:hyperlink w:history="1" r:id="rId99lb-e_5l_csqoga9dlmj">
         <w:r>
           <w:rPr>
             <w:rFonts w:ascii="Times New Roman" w:cs="Times New Roman" w:eastAsia="Times New Roman" w:hAnsi="Times New Roman"/>
@@ -1742,7 +1742,7 @@
         </w:numPr>
         <w:spacing w:after="50" w:before="0"/>
       </w:pPr>
-      <w:hyperlink w:history="1" r:id="rIdgppxkkyv_8cuhuzowz_sy">
+      <w:hyperlink w:history="1" r:id="rIdd5k7dedxkszfeevrappxv">
         <w:r>
           <w:rPr>
             <w:rFonts w:ascii="Times New Roman" w:cs="Times New Roman" w:eastAsia="Times New Roman" w:hAnsi="Times New Roman"/>
@@ -1764,7 +1764,7 @@
         </w:numPr>
         <w:spacing w:after="50" w:before="0"/>
       </w:pPr>
-      <w:hyperlink w:history="1" r:id="rIdjshogaxskgvarp_rcq1_t">
+      <w:hyperlink w:history="1" r:id="rId8fa1w92z3ho-7pllid0mx">
         <w:r>
           <w:rPr>
             <w:rFonts w:ascii="Times New Roman" w:cs="Times New Roman" w:eastAsia="Times New Roman" w:hAnsi="Times New Roman"/>
@@ -2373,7 +2373,7 @@
         </w:numPr>
         <w:spacing w:after="50" w:before="0"/>
       </w:pPr>
-      <w:hyperlink w:history="1" r:id="rIdmilkxfikcrqqp-n9oia6l">
+      <w:hyperlink w:history="1" r:id="rIdaqjrpuxvq-tvo7vpsllko">
         <w:r>
           <w:rPr>
             <w:rFonts w:ascii="Times New Roman" w:cs="Times New Roman" w:eastAsia="Times New Roman" w:hAnsi="Times New Roman"/>
@@ -2395,7 +2395,7 @@
         </w:numPr>
         <w:spacing w:after="50" w:before="0"/>
       </w:pPr>
-      <w:hyperlink w:history="1" r:id="rIdi9iwfuv8rqiqhqspnobq6">
+      <w:hyperlink w:history="1" r:id="rId4n9ny7zfsipv4ojwitgio">
         <w:r>
           <w:rPr>
             <w:rFonts w:ascii="Times New Roman" w:cs="Times New Roman" w:eastAsia="Times New Roman" w:hAnsi="Times New Roman"/>
@@ -2417,7 +2417,7 @@
         </w:numPr>
         <w:spacing w:after="50" w:before="0"/>
       </w:pPr>
-      <w:hyperlink w:history="1" r:id="rIdku1og2anmasuqgdfmkfna">
+      <w:hyperlink w:history="1" r:id="rIdzoezkhxk2zgxlgruqwykc">
         <w:r>
           <w:rPr>
             <w:rFonts w:ascii="Times New Roman" w:cs="Times New Roman" w:eastAsia="Times New Roman" w:hAnsi="Times New Roman"/>
@@ -2439,7 +2439,7 @@
         </w:numPr>
         <w:spacing w:after="50" w:before="0"/>
       </w:pPr>
-      <w:hyperlink w:history="1" r:id="rIdmbmnk4dg2b_nw-qsp51db">
+      <w:hyperlink w:history="1" r:id="rIdx6d9cwxz6dbfmkrfhswsz">
         <w:r>
           <w:rPr>
             <w:rFonts w:ascii="Times New Roman" w:cs="Times New Roman" w:eastAsia="Times New Roman" w:hAnsi="Times New Roman"/>
@@ -2944,7 +2944,7 @@
         </w:numPr>
         <w:spacing w:after="50" w:before="0"/>
       </w:pPr>
-      <w:hyperlink w:history="1" r:id="rIdzyrycenhuv-n7vvdyjg-q">
+      <w:hyperlink w:history="1" r:id="rIdjunfzmxtl4gnflm6ngq7m">
         <w:r>
           <w:rPr>
             <w:rFonts w:ascii="Times New Roman" w:cs="Times New Roman" w:eastAsia="Times New Roman" w:hAnsi="Times New Roman"/>
@@ -2966,7 +2966,7 @@
         </w:numPr>
         <w:spacing w:after="50" w:before="0"/>
       </w:pPr>
-      <w:hyperlink w:history="1" r:id="rIdanegtgybvh3x12alohs1q">
+      <w:hyperlink w:history="1" r:id="rIdgx27mrifiskjvmongjz-x">
         <w:r>
           <w:rPr>
             <w:rFonts w:ascii="Times New Roman" w:cs="Times New Roman" w:eastAsia="Times New Roman" w:hAnsi="Times New Roman"/>
@@ -3679,7 +3679,7 @@
         </w:numPr>
         <w:spacing w:after="50" w:before="0"/>
       </w:pPr>
-      <w:hyperlink w:history="1" r:id="rId56wk6qc59ytseu42zjtuj">
+      <w:hyperlink w:history="1" r:id="rIdlhjskztxxmjyvjfdsvnru">
         <w:r>
           <w:rPr>
             <w:rFonts w:ascii="Times New Roman" w:cs="Times New Roman" w:eastAsia="Times New Roman" w:hAnsi="Times New Roman"/>
@@ -3701,7 +3701,7 @@
         </w:numPr>
         <w:spacing w:after="50" w:before="0"/>
       </w:pPr>
-      <w:hyperlink w:history="1" r:id="rIdkpaoam8pgqbxdppkkjs8d">
+      <w:hyperlink w:history="1" r:id="rIdhik6pvoxzbphr8lfc0vzy">
         <w:r>
           <w:rPr>
             <w:rFonts w:ascii="Times New Roman" w:cs="Times New Roman" w:eastAsia="Times New Roman" w:hAnsi="Times New Roman"/>
@@ -3723,7 +3723,7 @@
         </w:numPr>
         <w:spacing w:after="50" w:before="0"/>
       </w:pPr>
-      <w:hyperlink w:history="1" r:id="rIdexmu4af5rdzy9h4fko4e8">
+      <w:hyperlink w:history="1" r:id="rIdrsqlpvzgtuowxlje7wl25">
         <w:r>
           <w:rPr>
             <w:rFonts w:ascii="Times New Roman" w:cs="Times New Roman" w:eastAsia="Times New Roman" w:hAnsi="Times New Roman"/>
@@ -4228,7 +4228,7 @@
         </w:numPr>
         <w:spacing w:after="50" w:before="0"/>
       </w:pPr>
-      <w:hyperlink w:history="1" r:id="rIdemlwi4qv8tg6qowuichbt">
+      <w:hyperlink w:history="1" r:id="rIdkxdipfg8u6xrtdzycirxi">
         <w:r>
           <w:rPr>
             <w:rFonts w:ascii="Times New Roman" w:cs="Times New Roman" w:eastAsia="Times New Roman" w:hAnsi="Times New Roman"/>
@@ -4250,7 +4250,7 @@
         </w:numPr>
         <w:spacing w:after="50" w:before="0"/>
       </w:pPr>
-      <w:hyperlink w:history="1" r:id="rIdojbvqioadulzabqbr6sn5">
+      <w:hyperlink w:history="1" r:id="rIddhzo8jhg3uhx4zj0yb8yi">
         <w:r>
           <w:rPr>
             <w:rFonts w:ascii="Times New Roman" w:cs="Times New Roman" w:eastAsia="Times New Roman" w:hAnsi="Times New Roman"/>
@@ -4272,7 +4272,7 @@
         </w:numPr>
         <w:spacing w:after="50" w:before="0"/>
       </w:pPr>
-      <w:hyperlink w:history="1" r:id="rIdhvgdemh5bw2ofqy2x2_1m">
+      <w:hyperlink w:history="1" r:id="rIdpmy7uq31314p1x2jejzvb">
         <w:r>
           <w:rPr>
             <w:rFonts w:ascii="Times New Roman" w:cs="Times New Roman" w:eastAsia="Times New Roman" w:hAnsi="Times New Roman"/>
@@ -4294,7 +4294,7 @@
         </w:numPr>
         <w:spacing w:after="50" w:before="0"/>
       </w:pPr>
-      <w:hyperlink w:history="1" r:id="rIdbi2pkeq3gpdlm4x0v-f7a">
+      <w:hyperlink w:history="1" r:id="rIdyhfye1w_raqm7u5tvcgh9">
         <w:r>
           <w:rPr>
             <w:rFonts w:ascii="Times New Roman" w:cs="Times New Roman" w:eastAsia="Times New Roman" w:hAnsi="Times New Roman"/>
@@ -5111,7 +5111,7 @@
         </w:numPr>
         <w:spacing w:after="50" w:before="0"/>
       </w:pPr>
-      <w:hyperlink w:history="1" r:id="rId6jtombltxndtnccwkldvh">
+      <w:hyperlink w:history="1" r:id="rIdsn9vjxvz-0ovxqpzbbjhh">
         <w:r>
           <w:rPr>
             <w:rFonts w:ascii="Times New Roman" w:cs="Times New Roman" w:eastAsia="Times New Roman" w:hAnsi="Times New Roman"/>
@@ -5133,7 +5133,7 @@
         </w:numPr>
         <w:spacing w:after="50" w:before="0"/>
       </w:pPr>
-      <w:hyperlink w:history="1" r:id="rIdr8fc4bb4xd7m_oi0dxvmr">
+      <w:hyperlink w:history="1" r:id="rIdxeekmld8yroak-qk6bvq_">
         <w:r>
           <w:rPr>
             <w:rFonts w:ascii="Times New Roman" w:cs="Times New Roman" w:eastAsia="Times New Roman" w:hAnsi="Times New Roman"/>
@@ -5155,7 +5155,7 @@
         </w:numPr>
         <w:spacing w:after="50" w:before="0"/>
       </w:pPr>
-      <w:hyperlink w:history="1" r:id="rIdu1hreqpz0pqkiyhl1vnnk">
+      <w:hyperlink w:history="1" r:id="rIdkj17vbrasicfvptfinh_v">
         <w:r>
           <w:rPr>
             <w:rFonts w:ascii="Times New Roman" w:cs="Times New Roman" w:eastAsia="Times New Roman" w:hAnsi="Times New Roman"/>
@@ -5177,7 +5177,7 @@
         </w:numPr>
         <w:spacing w:after="50" w:before="0"/>
       </w:pPr>
-      <w:hyperlink w:history="1" r:id="rIdro52ytxoubd6ureo1ynd9">
+      <w:hyperlink w:history="1" r:id="rIdjar8erg6h4nla2k6gb2vr">
         <w:r>
           <w:rPr>
             <w:rFonts w:ascii="Times New Roman" w:cs="Times New Roman" w:eastAsia="Times New Roman" w:hAnsi="Times New Roman"/>
@@ -5786,7 +5786,7 @@
         </w:numPr>
         <w:spacing w:after="50" w:before="0"/>
       </w:pPr>
-      <w:hyperlink w:history="1" r:id="rIdw2waqdihnearqhlxmb9fs">
+      <w:hyperlink w:history="1" r:id="rId2wfb6tlapep1-0nhkdzch">
         <w:r>
           <w:rPr>
             <w:rFonts w:ascii="Times New Roman" w:cs="Times New Roman" w:eastAsia="Times New Roman" w:hAnsi="Times New Roman"/>
@@ -5808,7 +5808,7 @@
         </w:numPr>
         <w:spacing w:after="50" w:before="0"/>
       </w:pPr>
-      <w:hyperlink w:history="1" r:id="rIdveri_oazqezyzldgowjcu">
+      <w:hyperlink w:history="1" r:id="rIdi92sehikfrrkwrz_i6rlm">
         <w:r>
           <w:rPr>
             <w:rFonts w:ascii="Times New Roman" w:cs="Times New Roman" w:eastAsia="Times New Roman" w:hAnsi="Times New Roman"/>
@@ -5830,7 +5830,7 @@
         </w:numPr>
         <w:spacing w:after="50" w:before="0"/>
       </w:pPr>
-      <w:hyperlink w:history="1" r:id="rIddtgjtvfn5gd-f3cbt_vci">
+      <w:hyperlink w:history="1" r:id="rIdkeraupj_wdef_mmt_hnqu">
         <w:r>
           <w:rPr>
             <w:rFonts w:ascii="Times New Roman" w:cs="Times New Roman" w:eastAsia="Times New Roman" w:hAnsi="Times New Roman"/>
@@ -8155,8 +8155,8 @@
       </w:r>
     </w:p>
     <w:sectPr>
-      <w:headerReference w:type="default" r:id="rId11"/>
-      <w:footerReference w:type="default" r:id="rId12"/>
+      <w:headerReference w:type="default" r:id="rId10"/>
+      <w:footerReference w:type="default" r:id="rId11"/>
       <w:pgSz w:w="10800" w:h="15600" w:orient="portrait"/>
       <w:pgMar w:top="1100" w:right="1100" w:bottom="1000" w:left="1100" w:header="500" w:footer="400" w:gutter="0"/>
       <w:pgNumType w:start="1"/>
@@ -8164,10 +8164,6 @@
     </w:sectPr>
   </w:body>
 </w:document>
-</file>
-
-<file path=word/comments.xml><?xml version="1.0" encoding="utf-8"?>
-<w:comments xmlns:cx="http://schemas.microsoft.com/office/drawing/2014/chartex" xmlns:cx1="http://schemas.microsoft.com/office/drawing/2015/9/8/chartex" xmlns:cx2="http://schemas.microsoft.com/office/drawing/2015/10/21/chartex" xmlns:cx3="http://schemas.microsoft.com/office/drawing/2016/5/9/chartex" xmlns:cx4="http://schemas.microsoft.com/office/drawing/2016/5/10/chartex" xmlns:cx5="http://schemas.microsoft.com/office/drawing/2016/5/11/chartex" xmlns:cx6="http://schemas.microsoft.com/office/drawing/2016/5/12/chartex" xmlns:cx7="http://schemas.microsoft.com/office/drawing/2016/5/13/chartex" xmlns:cx8="http://schemas.microsoft.com/office/drawing/2016/5/14/chartex" xmlns:mc="http://schemas.openxmlformats.org/markup-compatibility/2006" xmlns:aink="http://schemas.microsoft.com/office/drawing/2016/ink" xmlns:am3d="http://schemas.microsoft.com/office/drawing/2017/model3d" xmlns:o="urn:schemas-microsoft-com:office:office" xmlns:r="http://schemas.openxmlformats.org/officeDocument/2006/relationships" xmlns:m="http://schemas.openxmlformats.org/officeDocument/2006/math" xmlns:v="urn:schemas-microsoft-com:vml" xmlns:wp14="http://schemas.microsoft.com/office/word/2010/wordprocessingDrawing" xmlns:wp="http://schemas.openxmlformats.org/drawingml/2006/wordprocessingDrawing" xmlns:w10="urn:schemas-microsoft-com:office:word" xmlns:w="http://schemas.openxmlformats.org/wordprocessingml/2006/main" xmlns:w14="http://schemas.microsoft.com/office/word/2010/wordml" xmlns:w15="http://schemas.microsoft.com/office/word/2012/wordml" xmlns:w16cex="http://schemas.microsoft.com/office/word/2018/wordml/cex" xmlns:w16cid="http://schemas.microsoft.com/office/word/2016/wordml/cid" xmlns:w16="http://schemas.microsoft.com/office/word/2018/wordml" xmlns:w16sdtdh="http://schemas.microsoft.com/office/word/2020/wordml/sdtdatahash" xmlns:w16se="http://schemas.microsoft.com/office/word/2015/wordml/symex" xmlns:wpg="http://schemas.microsoft.com/office/word/2010/wordprocessingGroup" xmlns:wpi="http://schemas.microsoft.com/office/word/2010/wordprocessingInk" xmlns:wne="http://schemas.microsoft.com/office/word/2006/wordml" xmlns:wps="http://schemas.microsoft.com/office/word/2010/wordprocessingShape"/>
 </file>
 
 <file path=word/endnotes.xml><?xml version="1.0" encoding="utf-8"?>
@@ -8222,7 +8218,7 @@
         <w:sz w:val="15"/>
         <w:szCs w:val="15"/>
       </w:rPr>
-      <w:t xml:space="preserve">Sources: Reuters, LSEG, Goldman Sachs, Bloomberg, Morgan Stanley, S&amp;P Global Ratings, The Asset</w:t>
+      <w:t xml:space="preserve">Sources: Meta, Bloomberg, Reuters, LSEG, Goldman Sachs, Morgan Stanley, S&amp;P Global Ratings</w:t>
     </w:r>
   </w:p>
   <w:p>
@@ -8258,7 +8254,7 @@
         <w:sz w:val="15"/>
         <w:szCs w:val="15"/>
       </w:rPr>
-      <w:t xml:space="preserve">Sources: Bloomberg, Reuters, LSEG, S&amp;P Global Ratings, Financial Times, BIS, Moody's, Capacity</w:t>
+      <w:t xml:space="preserve">Sources: Bloomberg, Reuters, LSEG, Meta, S&amp;P Global Ratings, Financial Times, BIS, Moody's</w:t>
     </w:r>
   </w:p>
   <w:p>
@@ -8590,7 +8586,7 @@
 <w:numbering xmlns:wpc="http://schemas.microsoft.com/office/word/2010/wordprocessingCanvas" xmlns:mc="http://schemas.openxmlformats.org/markup-compatibility/2006" xmlns:o="urn:schemas-microsoft-com:office:office" xmlns:r="http://schemas.openxmlformats.org/officeDocument/2006/relationships" xmlns:m="http://schemas.openxmlformats.org/officeDocument/2006/math" xmlns:v="urn:schemas-microsoft-com:vml" xmlns:wp14="http://schemas.microsoft.com/office/word/2010/wordprocessingDrawing" xmlns:wp="http://schemas.openxmlformats.org/drawingml/2006/wordprocessingDrawing" xmlns:w10="urn:schemas-microsoft-com:office:word" xmlns:w="http://schemas.openxmlformats.org/wordprocessingml/2006/main" xmlns:w14="http://schemas.microsoft.com/office/word/2010/wordml" xmlns:w15="http://schemas.microsoft.com/office/word/2012/wordml" xmlns:wpg="http://schemas.microsoft.com/office/word/2010/wordprocessingGroup" xmlns:wpi="http://schemas.microsoft.com/office/word/2010/wordprocessingInk" xmlns:wne="http://schemas.microsoft.com/office/word/2006/wordml" xmlns:wps="http://schemas.microsoft.com/office/word/2010/wordprocessingShape" mc:Ignorable="w14 w15 wp14">
   <w:abstractNum w:abstractNumId="1" w15:restartNumberingAfterBreak="0">
     <w:multiLevelType w:val="hybridMultilevel"/>
-    <w:lvl w:ilvl="0" w15:tentative="1">
+    <w:lvl w:ilvl="0" w:tentative="1">
       <w:start w:val="1"/>
       <w:numFmt w:val="bullet"/>
       <w:lvlText w:val="●"/>
@@ -8599,7 +8595,7 @@
         <w:ind w:left="720" w:hanging="360"/>
       </w:pPr>
     </w:lvl>
-    <w:lvl w:ilvl="1" w15:tentative="1">
+    <w:lvl w:ilvl="1" w:tentative="1">
       <w:start w:val="1"/>
       <w:numFmt w:val="bullet"/>
       <w:lvlText w:val="○"/>
@@ -8608,7 +8604,7 @@
         <w:ind w:left="1440" w:hanging="360"/>
       </w:pPr>
     </w:lvl>
-    <w:lvl w:ilvl="2" w15:tentative="1">
+    <w:lvl w:ilvl="2" w:tentative="1">
       <w:start w:val="1"/>
       <w:numFmt w:val="bullet"/>
       <w:lvlText w:val="■"/>
@@ -8617,7 +8613,7 @@
         <w:ind w:left="2160" w:hanging="360"/>
       </w:pPr>
     </w:lvl>
-    <w:lvl w:ilvl="3" w15:tentative="1">
+    <w:lvl w:ilvl="3" w:tentative="1">
       <w:start w:val="1"/>
       <w:numFmt w:val="bullet"/>
       <w:lvlText w:val="●"/>
@@ -8626,7 +8622,7 @@
         <w:ind w:left="2880" w:hanging="360"/>
       </w:pPr>
     </w:lvl>
-    <w:lvl w:ilvl="4" w15:tentative="1">
+    <w:lvl w:ilvl="4" w:tentative="1">
       <w:start w:val="1"/>
       <w:numFmt w:val="bullet"/>
       <w:lvlText w:val="○"/>
@@ -8635,7 +8631,7 @@
         <w:ind w:left="3600" w:hanging="360"/>
       </w:pPr>
     </w:lvl>
-    <w:lvl w:ilvl="5" w15:tentative="1">
+    <w:lvl w:ilvl="5" w:tentative="1">
       <w:start w:val="1"/>
       <w:numFmt w:val="bullet"/>
       <w:lvlText w:val="■"/>
@@ -8644,7 +8640,7 @@
         <w:ind w:left="4320" w:hanging="360"/>
       </w:pPr>
     </w:lvl>
-    <w:lvl w:ilvl="6" w15:tentative="1">
+    <w:lvl w:ilvl="6" w:tentative="1">
       <w:start w:val="1"/>
       <w:numFmt w:val="bullet"/>
       <w:lvlText w:val="●"/>
@@ -8653,7 +8649,7 @@
         <w:ind w:left="5040" w:hanging="360"/>
       </w:pPr>
     </w:lvl>
-    <w:lvl w:ilvl="7" w15:tentative="1">
+    <w:lvl w:ilvl="7" w:tentative="1">
       <w:start w:val="1"/>
       <w:numFmt w:val="bullet"/>
       <w:lvlText w:val="●"/>
@@ -8662,7 +8658,7 @@
         <w:ind w:left="5760" w:hanging="360"/>
       </w:pPr>
     </w:lvl>
-    <w:lvl w:ilvl="8" w15:tentative="1">
+    <w:lvl w:ilvl="8" w:tentative="1">
       <w:start w:val="1"/>
       <w:numFmt w:val="bullet"/>
       <w:lvlText w:val="●"/>
@@ -8674,7 +8670,7 @@
   </w:abstractNum>
   <w:abstractNum w:abstractNumId="2" w15:restartNumberingAfterBreak="0">
     <w:multiLevelType w:val="hybridMultilevel"/>
-    <w:lvl w:ilvl="0" w15:tentative="1">
+    <w:lvl w:ilvl="0" w:tentative="1">
       <w:start w:val="1"/>
       <w:numFmt w:val="bullet"/>
       <w:lvlText w:val="•"/>
@@ -8711,6 +8707,10 @@
     </w:rPrDefault>
     <w:pPrDefault/>
   </w:docDefaults>
+  <w:style w:type="paragraph" w:styleId="Normal" w:default="1">
+    <w:name w:val="Normal"/>
+    <w:qFormat/>
+  </w:style>
   <w:style w:type="paragraph" w:styleId="Title">
     <w:name w:val="Title"/>
     <w:basedOn w:val="Normal"/>
@@ -8719,28 +8719,6 @@
     <w:rPr>
       <w:sz w:val="56"/>
       <w:szCs w:val="56"/>
-    </w:rPr>
-  </w:style>
-  <w:style w:type="paragraph" w:styleId="Heading1">
-    <w:name w:val="Heading 1"/>
-    <w:basedOn w:val="Normal"/>
-    <w:next w:val="Normal"/>
-    <w:qFormat/>
-    <w:rPr>
-      <w:color w:val="2E74B5"/>
-      <w:sz w:val="32"/>
-      <w:szCs w:val="32"/>
-    </w:rPr>
-  </w:style>
-  <w:style w:type="paragraph" w:styleId="Heading2">
-    <w:name w:val="Heading 2"/>
-    <w:basedOn w:val="Normal"/>
-    <w:next w:val="Normal"/>
-    <w:qFormat/>
-    <w:rPr>
-      <w:color w:val="2E74B5"/>
-      <w:sz w:val="26"/>
-      <w:szCs w:val="26"/>
     </w:rPr>
   </w:style>
   <w:style w:type="paragraph" w:styleId="Heading3">
@@ -8915,4 +8893,294 @@
     </w:rPr>
   </w:style>
 </w:styles>
+</file>
+
+<file path=word/theme/theme1.xml><?xml version="1.0" encoding="utf-8"?>
+<a:theme xmlns:a="http://schemas.openxmlformats.org/drawingml/2006/main" name="Office Theme">
+  <a:themeElements>
+    <a:clrScheme name="Office">
+      <a:dk1>
+        <a:sysClr val="windowText" lastClr="000000"/>
+      </a:dk1>
+      <a:lt1>
+        <a:sysClr val="window" lastClr="FFFFFF"/>
+      </a:lt1>
+      <a:dk2>
+        <a:srgbClr val="44546A"/>
+      </a:dk2>
+      <a:lt2>
+        <a:srgbClr val="E7E6E6"/>
+      </a:lt2>
+      <a:accent1>
+        <a:srgbClr val="4472C4"/>
+      </a:accent1>
+      <a:accent2>
+        <a:srgbClr val="ED7D31"/>
+      </a:accent2>
+      <a:accent3>
+        <a:srgbClr val="A5A5A5"/>
+      </a:accent3>
+      <a:accent4>
+        <a:srgbClr val="FFC000"/>
+      </a:accent4>
+      <a:accent5>
+        <a:srgbClr val="5B9BD5"/>
+      </a:accent5>
+      <a:accent6>
+        <a:srgbClr val="70AD47"/>
+      </a:accent6>
+      <a:hlink>
+        <a:srgbClr val="0563C1"/>
+      </a:hlink>
+      <a:folHlink>
+        <a:srgbClr val="954F72"/>
+      </a:folHlink>
+    </a:clrScheme>
+    <a:fontScheme name="Office">
+      <a:majorFont>
+        <a:latin typeface="Calibri Light" panose="020F0302020204030204"/>
+        <a:ea typeface=""/>
+        <a:cs typeface=""/>
+        <a:font script="Jpan" typeface="游ゴシック Light"/>
+        <a:font script="Hang" typeface="맑은 고딕"/>
+        <a:font script="Hans" typeface="等线 Light"/>
+        <a:font script="Hant" typeface="新細明體"/>
+        <a:font script="Arab" typeface="Times New Roman"/>
+        <a:font script="Hebr" typeface="Times New Roman"/>
+        <a:font script="Thai" typeface="Angsana New"/>
+        <a:font script="Ethi" typeface="Nyala"/>
+        <a:font script="Beng" typeface="Vrinda"/>
+        <a:font script="Gujr" typeface="Shruti"/>
+        <a:font script="Khmr" typeface="MoolBoran"/>
+        <a:font script="Knda" typeface="Tunga"/>
+        <a:font script="Guru" typeface="Raavi"/>
+        <a:font script="Cans" typeface="Euphemia"/>
+        <a:font script="Cher" typeface="Plantagenet Cherokee"/>
+        <a:font script="Yiii" typeface="Microsoft Yi Baiti"/>
+        <a:font script="Tibt" typeface="Microsoft Himalaya"/>
+        <a:font script="Thaa" typeface="MV Boli"/>
+        <a:font script="Deva" typeface="Mangal"/>
+        <a:font script="Telu" typeface="Gautami"/>
+        <a:font script="Taml" typeface="Latha"/>
+        <a:font script="Syrc" typeface="Estrangelo Edessa"/>
+        <a:font script="Orya" typeface="Kalinga"/>
+        <a:font script="Mlym" typeface="Kartika"/>
+        <a:font script="Laoo" typeface="DokChampa"/>
+        <a:font script="Sinh" typeface="Iskoola Pota"/>
+        <a:font script="Mong" typeface="Mongolian Baiti"/>
+        <a:font script="Viet" typeface="Times New Roman"/>
+        <a:font script="Uigh" typeface="Microsoft Uighur"/>
+        <a:font script="Geor" typeface="Sylfaen"/>
+        <a:font script="Armn" typeface="Arial"/>
+        <a:font script="Bugi" typeface="Leelawadee UI"/>
+        <a:font script="Bopo" typeface="Microsoft JhengHei"/>
+        <a:font script="Java" typeface="Javanese Text"/>
+        <a:font script="Lisu" typeface="Segoe UI"/>
+        <a:font script="Mymr" typeface="Myanmar Text"/>
+        <a:font script="Nkoo" typeface="Ebrima"/>
+        <a:font script="Olck" typeface="Nirmala UI"/>
+        <a:font script="Osma" typeface="Ebrima"/>
+        <a:font script="Phag" typeface="Phagspa"/>
+        <a:font script="Syrn" typeface="Estrangelo Edessa"/>
+        <a:font script="Syrj" typeface="Estrangelo Edessa"/>
+        <a:font script="Syre" typeface="Estrangelo Edessa"/>
+        <a:font script="Sora" typeface="Nirmala UI"/>
+        <a:font script="Tale" typeface="Microsoft Tai Le"/>
+        <a:font script="Talu" typeface="Microsoft New Tai Lue"/>
+        <a:font script="Tfng" typeface="Ebrima"/>
+      </a:majorFont>
+      <a:minorFont>
+        <a:latin typeface="Calibri" panose="020F0502020204030204"/>
+        <a:ea typeface=""/>
+        <a:cs typeface=""/>
+        <a:font script="Jpan" typeface="游明朝"/>
+        <a:font script="Hang" typeface="맑은 고딕"/>
+        <a:font script="Hans" typeface="等线"/>
+        <a:font script="Hant" typeface="新細明體"/>
+        <a:font script="Arab" typeface="Arial"/>
+        <a:font script="Hebr" typeface="Arial"/>
+        <a:font script="Thai" typeface="Cordia New"/>
+        <a:font script="Ethi" typeface="Nyala"/>
+        <a:font script="Beng" typeface="Vrinda"/>
+        <a:font script="Gujr" typeface="Shruti"/>
+        <a:font script="Khmr" typeface="DaunPenh"/>
+        <a:font script="Knda" typeface="Tunga"/>
+        <a:font script="Guru" typeface="Raavi"/>
+        <a:font script="Cans" typeface="Euphemia"/>
+        <a:font script="Cher" typeface="Plantagenet Cherokee"/>
+        <a:font script="Yiii" typeface="Microsoft Yi Baiti"/>
+        <a:font script="Tibt" typeface="Microsoft Himalaya"/>
+        <a:font script="Thaa" typeface="MV Boli"/>
+        <a:font script="Deva" typeface="Mangal"/>
+        <a:font script="Telu" typeface="Gautami"/>
+        <a:font script="Taml" typeface="Latha"/>
+        <a:font script="Syrc" typeface="Estrangelo Edessa"/>
+        <a:font script="Orya" typeface="Kalinga"/>
+        <a:font script="Mlym" typeface="Kartika"/>
+        <a:font script="Laoo" typeface="DokChampa"/>
+        <a:font script="Sinh" typeface="Iskoola Pota"/>
+        <a:font script="Mong" typeface="Mongolian Baiti"/>
+        <a:font script="Viet" typeface="Arial"/>
+        <a:font script="Uigh" typeface="Microsoft Uighur"/>
+        <a:font script="Geor" typeface="Sylfaen"/>
+        <a:font script="Armn" typeface="Arial"/>
+        <a:font script="Bugi" typeface="Leelawadee UI"/>
+        <a:font script="Bopo" typeface="Microsoft JhengHei"/>
+        <a:font script="Java" typeface="Javanese Text"/>
+        <a:font script="Lisu" typeface="Segoe UI"/>
+        <a:font script="Mymr" typeface="Myanmar Text"/>
+        <a:font script="Nkoo" typeface="Ebrima"/>
+        <a:font script="Olck" typeface="Nirmala UI"/>
+        <a:font script="Osma" typeface="Ebrima"/>
+        <a:font script="Phag" typeface="Phagspa"/>
+        <a:font script="Syrn" typeface="Estrangelo Edessa"/>
+        <a:font script="Syrj" typeface="Estrangelo Edessa"/>
+        <a:font script="Syre" typeface="Estrangelo Edessa"/>
+        <a:font script="Sora" typeface="Nirmala UI"/>
+        <a:font script="Tale" typeface="Microsoft Tai Le"/>
+        <a:font script="Talu" typeface="Microsoft New Tai Lue"/>
+        <a:font script="Tfng" typeface="Ebrima"/>
+      </a:minorFont>
+    </a:fontScheme>
+    <a:fmtScheme name="Office">
+      <a:fillStyleLst>
+        <a:solidFill>
+          <a:schemeClr val="phClr"/>
+        </a:solidFill>
+        <a:gradFill rotWithShape="true">
+          <a:gsLst>
+            <a:gs pos="0">
+              <a:schemeClr val="phClr">
+                <a:lumMod val="110000"/>
+                <a:satMod val="105000"/>
+                <a:tint val="67000"/>
+              </a:schemeClr>
+            </a:gs>
+            <a:gs pos="50000">
+              <a:schemeClr val="phClr">
+                <a:lumMod val="105000"/>
+                <a:satMod val="103000"/>
+                <a:tint val="73000"/>
+              </a:schemeClr>
+            </a:gs>
+            <a:gs pos="100000">
+              <a:schemeClr val="phClr">
+                <a:lumMod val="105000"/>
+                <a:satMod val="109000"/>
+                <a:tint val="81000"/>
+              </a:schemeClr>
+            </a:gs>
+          </a:gsLst>
+          <a:lin ang="5400000" scaled="false"/>
+        </a:gradFill>
+        <a:gradFill rotWithShape="true">
+          <a:gsLst>
+            <a:gs pos="0">
+              <a:schemeClr val="phClr">
+                <a:satMod val="103000"/>
+                <a:lumMod val="102000"/>
+                <a:tint val="94000"/>
+              </a:schemeClr>
+            </a:gs>
+            <a:gs pos="50000">
+              <a:schemeClr val="phClr">
+                <a:satMod val="110000"/>
+                <a:lumMod val="100000"/>
+                <a:shade val="100000"/>
+              </a:schemeClr>
+            </a:gs>
+            <a:gs pos="100000">
+              <a:schemeClr val="phClr">
+                <a:lumMod val="99000"/>
+                <a:satMod val="120000"/>
+                <a:shade val="78000"/>
+              </a:schemeClr>
+            </a:gs>
+          </a:gsLst>
+          <a:lin ang="5400000" scaled="false"/>
+        </a:gradFill>
+      </a:fillStyleLst>
+      <a:lnStyleLst>
+        <a:ln w="6350" cap="flat" cmpd="sng" algn="ctr">
+          <a:solidFill>
+            <a:schemeClr val="phClr"/>
+          </a:solidFill>
+          <a:prstDash val="solid"/>
+          <a:miter lim="800000"/>
+        </a:ln>
+        <a:ln w="12700" cap="flat" cmpd="sng" algn="ctr">
+          <a:solidFill>
+            <a:schemeClr val="phClr"/>
+          </a:solidFill>
+          <a:prstDash val="solid"/>
+          <a:miter lim="800000"/>
+        </a:ln>
+        <a:ln w="19050" cap="flat" cmpd="sng" algn="ctr">
+          <a:solidFill>
+            <a:schemeClr val="phClr"/>
+          </a:solidFill>
+          <a:prstDash val="solid"/>
+          <a:miter lim="800000"/>
+        </a:ln>
+      </a:lnStyleLst>
+      <a:effectStyleLst>
+        <a:effectStyle>
+          <a:effectLst/>
+        </a:effectStyle>
+        <a:effectStyle>
+          <a:effectLst/>
+        </a:effectStyle>
+        <a:effectStyle>
+          <a:effectLst>
+            <a:outerShdw blurRad="57150" dist="19050" dir="5400000" algn="ctr" rotWithShape="false">
+              <a:srgbClr val="000000">
+                <a:alpha val="63000"/>
+              </a:srgbClr>
+            </a:outerShdw>
+          </a:effectLst>
+        </a:effectStyle>
+      </a:effectStyleLst>
+      <a:bgFillStyleLst>
+        <a:solidFill>
+          <a:schemeClr val="phClr"/>
+        </a:solidFill>
+        <a:solidFill>
+          <a:schemeClr val="phClr">
+            <a:tint val="95000"/>
+            <a:satMod val="170000"/>
+          </a:schemeClr>
+        </a:solidFill>
+        <a:gradFill rotWithShape="true">
+          <a:gsLst>
+            <a:gs pos="0">
+              <a:schemeClr val="phClr">
+                <a:tint val="93000"/>
+                <a:satMod val="150000"/>
+                <a:shade val="98000"/>
+                <a:lumMod val="102000"/>
+              </a:schemeClr>
+            </a:gs>
+            <a:gs pos="50000">
+              <a:schemeClr val="phClr">
+                <a:tint val="98000"/>
+                <a:satMod val="130000"/>
+                <a:shade val="90000"/>
+                <a:lumMod val="103000"/>
+              </a:schemeClr>
+            </a:gs>
+            <a:gs pos="100000">
+              <a:schemeClr val="phClr">
+                <a:shade val="63000"/>
+                <a:satMod val="120000"/>
+              </a:schemeClr>
+            </a:gs>
+          </a:gsLst>
+          <a:lin ang="5400000" scaled="false"/>
+        </a:gradFill>
+      </a:bgFillStyleLst>
+    </a:fmtScheme>
+  </a:themeElements>
+  <a:objectDefaults/>
+  <a:extraClrSchemeLst/>
+</a:theme>
 </file>
</xml_diff>

<commit_message>
Committee final: 2 rounds complete, fact check rerun fixes, chart D held, layout pass
Round count: 2 (round 1 review and merge, round 2 style, charts, build,
layout; fact checker rerun followed by a second round 2 pass).

Co-Authored-By: Claude Opus 5.5 <noreply@anthropic.com>
Claude-Session: https://claude.ai/code/session_011SJZihQQoizcK7ApWgRNEa
</commit_message>
<xml_diff>
--- a/outputs/LLC_AI_Infrastructure_Case_Study.docx
+++ b/outputs/LLC_AI_Infrastructure_Case_Study.docx
@@ -242,7 +242,7 @@
           <w:sz w:val="21"/>
           <w:szCs w:val="21"/>
         </w:rPr>
-        <w:t xml:space="preserve">The scale of the buildout is what ties this theme to credit. Goldman Sachs expects the five largest hyperscalers to spend about $750bn on capital expenditure in 2026 and to fund about one third of it with debt. Amazon, Alphabet, Meta and Oracle issued about $194bn of bonds through July 7, up 79% from all of 2025, and Goldman expects issuance across the five, adding Microsoft, to reach roughly $250bn this year and $400bn in 2027. That supply has landed in investment grade, while the August recap showed high yield issuance at a one year low of $12bn. Private capital is filling the rest of the gap, with Morgan Stanley estimating that private credit could supply more than $800bn of data center financing through 2028, led by asset based finance. Several of those lenders, Blue Owl among them, halted fund redemptions in March, as covered in that month's recap. The debt is long dated, with bonds maturing in 2048 and 2049, far beyond Hyperion's four year initial lease term.</w:t>
+        <w:t xml:space="preserve">The scale of the buildout is what ties this theme to credit. Goldman Sachs expects the five largest hyperscalers to spend about $750bn on capital expenditure in 2026 and to fund about one third of it with debt. Amazon, Alphabet, Meta and Oracle issued about $194bn of bonds through July 7, up 79% from all of 2025, and Goldman expects issuance across the five, adding Microsoft, to reach roughly $250bn this year and $400bn in 2027. Goldman's 2027 figure equals about 35% of that year's expected capex. Private capital is filling the rest of the gap, with Morgan Stanley estimating that private credit could supply more than $800bn of global data center financing through 2028, led by asset based finance. Several of those lenders halted or capped fund redemptions early this year, Blue Owl among them, as covered in the March recap. The debt is long dated, with bonds maturing in 2048 and 2049, far beyond the four year initial lease terms at both Hyperion and El Paso.</w:t>
       </w:r>
     </w:p>
     <w:p>
@@ -542,7 +542,7 @@
           <w:sz w:val="21"/>
           <w:szCs w:val="21"/>
         </w:rPr>
-        <w:t xml:space="preserve">Hyperscaler borrowing is getting more expensive. Of 91 hyperscaler bonds issued in 2026 with comparable pricing data, 78 traded at higher yields on July 28 than at issuance, with a median increase of about 22bps, a move that blends rates and spread. The cleaner credit signal is the median new issue concession, which widened to 12bps from 2.25bps in 2025, and Amazon's $25bn deal pushed its existing 30 year bond about 20bps wider. Meta's El Paso bonds priced in July at about 7.5%, roughly 287.5bps over Treasuries, and drew roughly $20bn of orders, about 1.6 times the deal. In September, a Blue Owl sponsored data center leased to CoreWeave reportedly sold $1.1bn of five year high yield notes at 9.25%, about 270bps above similarly rated debt.</w:t>
+        <w:t xml:space="preserve">Hyperscaler borrowing is getting more expensive. Of 91 hyperscaler bonds issued in 2026 with comparable pricing data, 78 traded at higher yields on July 28 than at issuance, with a median increase of about 22bps, a move that blends rates and spread. The cleaner credit signal is the median new issue concession, which widened to 12bps from 2.25bps in 2025, and Amazon's $25bn deal pushed its existing 30 year bond about 20bps wider. The El Paso joint venture bonds priced in July at about 7.5%, roughly 287.5bps over Treasuries, with orders peaking near $20bn, about 1.6 times the deal. In September, a Blue Owl sponsored data center leased to CoreWeave sold $1.1bn of BB- rated five year notes at 9.25%, about 270bps above the average yield on similarly rated debt.</w:t>
       </w:r>
     </w:p>
     <w:tbl>
@@ -786,7 +786,7 @@
           <w:sz w:val="21"/>
           <w:szCs w:val="21"/>
         </w:rPr>
-        <w:t xml:space="preserve">Long dated bonds rest on leases to a single tenant, and Hyperion's leases carry a four year initial term, so repayment after year four depends on Meta renewing or on its residual value guarantee, which covers the first 16 years. The chips inside, which Moody's says can become obsolete within four to six years, turn over far faster. Before a campus operates, power, permitting, and local opposition can delay rent. The BIS notes this borrowing increasingly sits in vehicles funded through private placements, and Moody's has flagged that short leases can understate effective obligations. The key divergence is between abundant capital and its rising price.</w:t>
+        <w:t xml:space="preserve">Long dated bonds rest on leases to a single tenant, and Hyperion's leases carry a four year initial term, so repayment after year four depends on Meta renewing or on its capped residual value guarantee, which covers the first 16 years. The chips inside, which Moody's says can become obsolete within four to six years, turn over far faster. Before a campus operates, power, permitting, and local opposition can delay rent. The BIS notes this borrowing increasingly sits in vehicles funded through private placements, and Moody's has flagged that short leases can understate effective obligations. The key divergence is between abundant capital and its rising price.</w:t>
       </w:r>
     </w:p>
     <w:tbl>
@@ -849,7 +849,7 @@
                 <w:sz w:val="21"/>
                 <w:szCs w:val="21"/>
               </w:rPr>
-              <w:t xml:space="preserve">Meta has funded two campuses through joint ventures with private capital. Hyperion in Louisiana raised $27bn in October 2025 with A+ rated bonds due 2049 priced at 6.58%, about 225bps over Treasuries. El Paso, a one gigawatt campus due online in 2028, followed in July with about $12.5bn of amortizing bonds due 2048, also rated A+ by S&amp;P, at about 7.5%. Both rest on leases to Meta. Higher Treasury yields explain part of the gap, but a spread roughly 60bps wider on the same S&amp;P rating and tenant suggests investors now charge more for structure, supply, and duration.</w:t>
+              <w:t xml:space="preserve">Meta has funded two campuses through joint ventures with private capital. Hyperion in Louisiana raised $27bn in October 2025 with A+ rated bonds due 2049 priced at 6.58%, about 225bps over Treasuries. El Paso, a one gigawatt campus due online in 2028, followed in July with about $12.5bn of amortizing bonds due 2048, also rated A+ by S&amp;P, at about 7.5%. Both rest on leases to Meta. Higher Treasury yields explain part of the gap, but a spread roughly 60bps wider on the same S&amp;P rating and tenant suggests investors now charge more for structure and supply.</w:t>
             </w:r>
           </w:p>
         </w:tc>
@@ -1654,7 +1654,7 @@
         </w:numPr>
         <w:spacing w:after="50" w:before="0"/>
       </w:pPr>
-      <w:hyperlink w:history="1" r:id="rIdl32sgyzp5xwi30yjkyi8d">
+      <w:hyperlink w:history="1" r:id="rIdemsh486vcnciv0zemetvj">
         <w:r>
           <w:rPr>
             <w:rFonts w:ascii="Times New Roman" w:cs="Times New Roman" w:eastAsia="Times New Roman" w:hAnsi="Times New Roman"/>
@@ -1676,7 +1676,7 @@
         </w:numPr>
         <w:spacing w:after="50" w:before="0"/>
       </w:pPr>
-      <w:hyperlink w:history="1" r:id="rIdzfo_m5kefdygeqlesbffs">
+      <w:hyperlink w:history="1" r:id="rIdfflrvrykxrphcxr06-uvp">
         <w:r>
           <w:rPr>
             <w:rFonts w:ascii="Times New Roman" w:cs="Times New Roman" w:eastAsia="Times New Roman" w:hAnsi="Times New Roman"/>
@@ -1698,7 +1698,7 @@
         </w:numPr>
         <w:spacing w:after="50" w:before="0"/>
       </w:pPr>
-      <w:hyperlink w:history="1" r:id="rIdktwqkmt-itucezeih9vpa">
+      <w:hyperlink w:history="1" r:id="rIdtrch5iinl6ra6fiedj32i">
         <w:r>
           <w:rPr>
             <w:rFonts w:ascii="Times New Roman" w:cs="Times New Roman" w:eastAsia="Times New Roman" w:hAnsi="Times New Roman"/>
@@ -1720,7 +1720,7 @@
         </w:numPr>
         <w:spacing w:after="50" w:before="0"/>
       </w:pPr>
-      <w:hyperlink w:history="1" r:id="rId99lb-e_5l_csqoga9dlmj">
+      <w:hyperlink w:history="1" r:id="rId-97gkftsm5jbv4ncm1xxa">
         <w:r>
           <w:rPr>
             <w:rFonts w:ascii="Times New Roman" w:cs="Times New Roman" w:eastAsia="Times New Roman" w:hAnsi="Times New Roman"/>
@@ -1742,7 +1742,7 @@
         </w:numPr>
         <w:spacing w:after="50" w:before="0"/>
       </w:pPr>
-      <w:hyperlink w:history="1" r:id="rIdd5k7dedxkszfeevrappxv">
+      <w:hyperlink w:history="1" r:id="rIdsc0qpz1w44x6aevusnvna">
         <w:r>
           <w:rPr>
             <w:rFonts w:ascii="Times New Roman" w:cs="Times New Roman" w:eastAsia="Times New Roman" w:hAnsi="Times New Roman"/>
@@ -1764,7 +1764,7 @@
         </w:numPr>
         <w:spacing w:after="50" w:before="0"/>
       </w:pPr>
-      <w:hyperlink w:history="1" r:id="rId8fa1w92z3ho-7pllid0mx">
+      <w:hyperlink w:history="1" r:id="rIdat9b0l9jd8wxktkrj9o1k">
         <w:r>
           <w:rPr>
             <w:rFonts w:ascii="Times New Roman" w:cs="Times New Roman" w:eastAsia="Times New Roman" w:hAnsi="Times New Roman"/>
@@ -2373,7 +2373,7 @@
         </w:numPr>
         <w:spacing w:after="50" w:before="0"/>
       </w:pPr>
-      <w:hyperlink w:history="1" r:id="rIdaqjrpuxvq-tvo7vpsllko">
+      <w:hyperlink w:history="1" r:id="rIduj7yvmxvppxbohbi3pluy">
         <w:r>
           <w:rPr>
             <w:rFonts w:ascii="Times New Roman" w:cs="Times New Roman" w:eastAsia="Times New Roman" w:hAnsi="Times New Roman"/>
@@ -2395,7 +2395,7 @@
         </w:numPr>
         <w:spacing w:after="50" w:before="0"/>
       </w:pPr>
-      <w:hyperlink w:history="1" r:id="rId4n9ny7zfsipv4ojwitgio">
+      <w:hyperlink w:history="1" r:id="rIdf9xqki32b0j_dykjb5ejm">
         <w:r>
           <w:rPr>
             <w:rFonts w:ascii="Times New Roman" w:cs="Times New Roman" w:eastAsia="Times New Roman" w:hAnsi="Times New Roman"/>
@@ -2417,7 +2417,7 @@
         </w:numPr>
         <w:spacing w:after="50" w:before="0"/>
       </w:pPr>
-      <w:hyperlink w:history="1" r:id="rIdzoezkhxk2zgxlgruqwykc">
+      <w:hyperlink w:history="1" r:id="rIdyvdm8sn0dop4re-luhoob">
         <w:r>
           <w:rPr>
             <w:rFonts w:ascii="Times New Roman" w:cs="Times New Roman" w:eastAsia="Times New Roman" w:hAnsi="Times New Roman"/>
@@ -2439,7 +2439,7 @@
         </w:numPr>
         <w:spacing w:after="50" w:before="0"/>
       </w:pPr>
-      <w:hyperlink w:history="1" r:id="rIdx6d9cwxz6dbfmkrfhswsz">
+      <w:hyperlink w:history="1" r:id="rIdwmsuobt2gz1zpyfp6fo_y">
         <w:r>
           <w:rPr>
             <w:rFonts w:ascii="Times New Roman" w:cs="Times New Roman" w:eastAsia="Times New Roman" w:hAnsi="Times New Roman"/>
@@ -2944,7 +2944,7 @@
         </w:numPr>
         <w:spacing w:after="50" w:before="0"/>
       </w:pPr>
-      <w:hyperlink w:history="1" r:id="rIdjunfzmxtl4gnflm6ngq7m">
+      <w:hyperlink w:history="1" r:id="rIdk6pg1y7nz022wfd8le4sj">
         <w:r>
           <w:rPr>
             <w:rFonts w:ascii="Times New Roman" w:cs="Times New Roman" w:eastAsia="Times New Roman" w:hAnsi="Times New Roman"/>
@@ -2966,7 +2966,7 @@
         </w:numPr>
         <w:spacing w:after="50" w:before="0"/>
       </w:pPr>
-      <w:hyperlink w:history="1" r:id="rIdgx27mrifiskjvmongjz-x">
+      <w:hyperlink w:history="1" r:id="rIdhqdzmmcqiyqr-rayf2-u9">
         <w:r>
           <w:rPr>
             <w:rFonts w:ascii="Times New Roman" w:cs="Times New Roman" w:eastAsia="Times New Roman" w:hAnsi="Times New Roman"/>
@@ -3679,7 +3679,7 @@
         </w:numPr>
         <w:spacing w:after="50" w:before="0"/>
       </w:pPr>
-      <w:hyperlink w:history="1" r:id="rIdlhjskztxxmjyvjfdsvnru">
+      <w:hyperlink w:history="1" r:id="rIdo8byzn94gb5vvnx_1oxwm">
         <w:r>
           <w:rPr>
             <w:rFonts w:ascii="Times New Roman" w:cs="Times New Roman" w:eastAsia="Times New Roman" w:hAnsi="Times New Roman"/>
@@ -3701,7 +3701,7 @@
         </w:numPr>
         <w:spacing w:after="50" w:before="0"/>
       </w:pPr>
-      <w:hyperlink w:history="1" r:id="rIdhik6pvoxzbphr8lfc0vzy">
+      <w:hyperlink w:history="1" r:id="rIdpfy_tg_zfjo4fkb_dcsvf">
         <w:r>
           <w:rPr>
             <w:rFonts w:ascii="Times New Roman" w:cs="Times New Roman" w:eastAsia="Times New Roman" w:hAnsi="Times New Roman"/>
@@ -3723,7 +3723,7 @@
         </w:numPr>
         <w:spacing w:after="50" w:before="0"/>
       </w:pPr>
-      <w:hyperlink w:history="1" r:id="rIdrsqlpvzgtuowxlje7wl25">
+      <w:hyperlink w:history="1" r:id="rId_aeele-vpi2thjffy2qsp">
         <w:r>
           <w:rPr>
             <w:rFonts w:ascii="Times New Roman" w:cs="Times New Roman" w:eastAsia="Times New Roman" w:hAnsi="Times New Roman"/>
@@ -4228,7 +4228,7 @@
         </w:numPr>
         <w:spacing w:after="50" w:before="0"/>
       </w:pPr>
-      <w:hyperlink w:history="1" r:id="rIdkxdipfg8u6xrtdzycirxi">
+      <w:hyperlink w:history="1" r:id="rIdjg0-bou3oussjustl5spj">
         <w:r>
           <w:rPr>
             <w:rFonts w:ascii="Times New Roman" w:cs="Times New Roman" w:eastAsia="Times New Roman" w:hAnsi="Times New Roman"/>
@@ -4250,7 +4250,7 @@
         </w:numPr>
         <w:spacing w:after="50" w:before="0"/>
       </w:pPr>
-      <w:hyperlink w:history="1" r:id="rIddhzo8jhg3uhx4zj0yb8yi">
+      <w:hyperlink w:history="1" r:id="rIdjxkssqxjodxvsllfuaf0n">
         <w:r>
           <w:rPr>
             <w:rFonts w:ascii="Times New Roman" w:cs="Times New Roman" w:eastAsia="Times New Roman" w:hAnsi="Times New Roman"/>
@@ -4272,7 +4272,7 @@
         </w:numPr>
         <w:spacing w:after="50" w:before="0"/>
       </w:pPr>
-      <w:hyperlink w:history="1" r:id="rIdpmy7uq31314p1x2jejzvb">
+      <w:hyperlink w:history="1" r:id="rId6mdkaz3www-ub3_khiq6k">
         <w:r>
           <w:rPr>
             <w:rFonts w:ascii="Times New Roman" w:cs="Times New Roman" w:eastAsia="Times New Roman" w:hAnsi="Times New Roman"/>
@@ -4294,7 +4294,7 @@
         </w:numPr>
         <w:spacing w:after="50" w:before="0"/>
       </w:pPr>
-      <w:hyperlink w:history="1" r:id="rIdyhfye1w_raqm7u5tvcgh9">
+      <w:hyperlink w:history="1" r:id="rId4qczuw3sbsxkipizzdl-l">
         <w:r>
           <w:rPr>
             <w:rFonts w:ascii="Times New Roman" w:cs="Times New Roman" w:eastAsia="Times New Roman" w:hAnsi="Times New Roman"/>
@@ -5111,7 +5111,7 @@
         </w:numPr>
         <w:spacing w:after="50" w:before="0"/>
       </w:pPr>
-      <w:hyperlink w:history="1" r:id="rIdsn9vjxvz-0ovxqpzbbjhh">
+      <w:hyperlink w:history="1" r:id="rIddh04sypt-q9yqsss4w5ob">
         <w:r>
           <w:rPr>
             <w:rFonts w:ascii="Times New Roman" w:cs="Times New Roman" w:eastAsia="Times New Roman" w:hAnsi="Times New Roman"/>
@@ -5133,7 +5133,7 @@
         </w:numPr>
         <w:spacing w:after="50" w:before="0"/>
       </w:pPr>
-      <w:hyperlink w:history="1" r:id="rIdxeekmld8yroak-qk6bvq_">
+      <w:hyperlink w:history="1" r:id="rIdks9o2hguplzlc8dh2hnlv">
         <w:r>
           <w:rPr>
             <w:rFonts w:ascii="Times New Roman" w:cs="Times New Roman" w:eastAsia="Times New Roman" w:hAnsi="Times New Roman"/>
@@ -5155,7 +5155,7 @@
         </w:numPr>
         <w:spacing w:after="50" w:before="0"/>
       </w:pPr>
-      <w:hyperlink w:history="1" r:id="rIdkj17vbrasicfvptfinh_v">
+      <w:hyperlink w:history="1" r:id="rIdtguur7zdqzwey8eflex1n">
         <w:r>
           <w:rPr>
             <w:rFonts w:ascii="Times New Roman" w:cs="Times New Roman" w:eastAsia="Times New Roman" w:hAnsi="Times New Roman"/>
@@ -5177,7 +5177,7 @@
         </w:numPr>
         <w:spacing w:after="50" w:before="0"/>
       </w:pPr>
-      <w:hyperlink w:history="1" r:id="rIdjar8erg6h4nla2k6gb2vr">
+      <w:hyperlink w:history="1" r:id="rIdjylcwxb3q4jpfncxbpg7p">
         <w:r>
           <w:rPr>
             <w:rFonts w:ascii="Times New Roman" w:cs="Times New Roman" w:eastAsia="Times New Roman" w:hAnsi="Times New Roman"/>
@@ -5786,7 +5786,7 @@
         </w:numPr>
         <w:spacing w:after="50" w:before="0"/>
       </w:pPr>
-      <w:hyperlink w:history="1" r:id="rId2wfb6tlapep1-0nhkdzch">
+      <w:hyperlink w:history="1" r:id="rIdgmk7grdllo5b6gehjlk2a">
         <w:r>
           <w:rPr>
             <w:rFonts w:ascii="Times New Roman" w:cs="Times New Roman" w:eastAsia="Times New Roman" w:hAnsi="Times New Roman"/>
@@ -5808,7 +5808,7 @@
         </w:numPr>
         <w:spacing w:after="50" w:before="0"/>
       </w:pPr>
-      <w:hyperlink w:history="1" r:id="rIdi92sehikfrrkwrz_i6rlm">
+      <w:hyperlink w:history="1" r:id="rIdsfhfgykl2olc4rukdzsuj">
         <w:r>
           <w:rPr>
             <w:rFonts w:ascii="Times New Roman" w:cs="Times New Roman" w:eastAsia="Times New Roman" w:hAnsi="Times New Roman"/>
@@ -5830,7 +5830,7 @@
         </w:numPr>
         <w:spacing w:after="50" w:before="0"/>
       </w:pPr>
-      <w:hyperlink w:history="1" r:id="rIdkeraupj_wdef_mmt_hnqu">
+      <w:hyperlink w:history="1" r:id="rIdzdhrp36v0uci5dr_1k9_p">
         <w:r>
           <w:rPr>
             <w:rFonts w:ascii="Times New Roman" w:cs="Times New Roman" w:eastAsia="Times New Roman" w:hAnsi="Times New Roman"/>

</xml_diff>

<commit_message>
Committee v2 round 1: merge fact check, skeptic and continuity findings
Co-Authored-By: Claude Opus 5.5 <noreply@anthropic.com>
Claude-Session: https://claude.ai/code/session_011SJZihQQoizcK7ApWgRNEa
</commit_message>
<xml_diff>
--- a/outputs/LLC_AI_Infrastructure_Case_Study.docx
+++ b/outputs/LLC_AI_Infrastructure_Case_Study.docx
@@ -214,7 +214,7 @@
           <w:sz w:val="21"/>
           <w:szCs w:val="21"/>
         </w:rPr>
-        <w:t xml:space="preserve">AI infrastructure financing is the debt raised to build data centers and the computing equipment inside them, and in 2026 it has become one of the largest sources of new supply in credit. Lenders reach the same assets through five routes. Hyperscalers borrow directly in the investment grade bond market. Joint ventures issue project bonds secured by a lease to a hyperscaler, as with Meta's $27.3bn Hyperion financing, where Blue Owl owns 80% of the vehicle, Meta owns 20%, and the A+ rated bonds amortize to 2049. Developers take construction loans against leases to Oracle and OpenAI. Neoclouds such as CoreWeave borrow against GPUs and the customer contracts that pay for them. Stabilized campuses are refinanced through data center ABS and CMBS. In every route the lender is underwriting the tenant. Rating agencies start from the tenant's rating and subtract notches for construction, lease length, and operator risk, so the same type of building can support A+ debt or BB- debt depending on who signs the lease.</w:t>
+        <w:t xml:space="preserve">AI infrastructure financing is the debt raised to build data centers and the computing equipment inside them, and in 2026 it has become one of the largest sources of new supply in credit. Lenders reach the same assets through five routes. Hyperscalers borrow directly in the investment grade market. Joint ventures issue project bonds secured by a lease to a hyperscaler, as with Meta's $27.3bn Hyperion financing, where Blue Owl owns 80% of the vehicle and the A+ rated bonds amortize to 2049. Developers take construction loans against leases to Oracle and OpenAI. Neoclouds such as CoreWeave borrow against GPUs and the customer contracts that pay for them. Stabilized campuses are refinanced through data center ABS and CMBS. In every route the lender is underwriting the tenant, and agencies start from the tenant's rating and subtract notches for construction, lease length, and operator risk.</w:t>
       </w:r>
     </w:p>
     <w:p>
@@ -242,7 +242,7 @@
           <w:sz w:val="21"/>
           <w:szCs w:val="21"/>
         </w:rPr>
-        <w:t xml:space="preserve">Leverage rises with the strength of the lease. Hut 8's $4.25bn Beacon Point bonds, backed by a tenant rated AA- or better, financed 95% of project cost at T+165, the highest loan to cost on record for a data center bond. Oracle's Saline Township campus in Michigan raised about $14bn of bonds against $16.3bn of cost, leaving roughly 15% equity. Bank construction loans run lower, with $9.6bn of JPMorgan loans on Stargate Abilene equal to about two thirds of cost. Stabilized campuses are sized on appraised value, and Aligned's $1.18bn ABS in July priced at a 70% loan to value with an A- senior class. GPU lenders advance less because the collateral depreciates, and Apollo's $3.5bn for the vehicle that leases chips to xAI covers about 65% of a $5.4bn purchase. Agencies cut these numbers hard. KBRA valued the single tenant Ohio campus behind BX 2026 VLT10 27.2% below appraisal, lifting leverage on the $1.26bn loan to 108.4%.</w:t>
+        <w:t xml:space="preserve">Lease backed debt is sized so that contracted rent covers debt service with a thin cushion and the bonds amortize before the lease and its renewals run out, so leverage rises with the strength of the tenant. Hut 8's $4.25bn Beacon Point bonds, backed by a tenant rated AA- or better, financed 95% of project cost at T+165, which Hut 8 calls the highest loan to cost for an HPC data center bond. Oracle's Saline Township campus in Michigan raised about $14bn of bonds against $16.3bn of cost, leaving roughly 15% equity. Stabilized campuses are sized on appraised value, and Aligned's ABS master trust, which added $1.18bn in July, caps its senior notes at 70% of appraised value. GPU lenders lend less because the collateral depreciates, and Apollo's $3.5bn for the vehicle that leases chips to xAI equals about 65% of a $5.4bn purchase. Agencies stress all of these. KBRA cut the cash flow on the single tenant Ohio campus behind BX 2026 VLT10 to 18.9% below the issuer's figure and its value to 27.2% below appraisal, lifting leverage on the $1.26bn loan to 108.4%.</w:t>
       </w:r>
     </w:p>
     <w:p>
@@ -270,7 +270,7 @@
           <w:sz w:val="21"/>
           <w:szCs w:val="21"/>
         </w:rPr>
-        <w:t xml:space="preserve">The debt is only as long as the lease behind it, and hyperscaler leases are short. Hyperion and El Paso both carry four year initial terms against bonds amortizing to 2049 and 2048, with Meta's capped residual value guarantee covering the gap for 16 years. Moody's counts $662bn of hyperscaler data center leases not yet commenced and held off balance sheet, equal to 113% of their adjusted debt, and says it will treat part of them as debt, while S&amp;P accepted Hyperion as off balance sheet for Meta. The divergence is that one obligation is a lease to one agency and debt to another, and any tenant downgrade passes straight through to the structures built on it.</w:t>
+        <w:t xml:space="preserve">The debt is only as long as the lease behind it, and hyperscaler leases are short. Hyperion and El Paso both carry four year initial terms against bonds amortizing to 2049 and 2048, and Meta's residual value guarantee on Hyperion, about $28bn and covering the first 16 years, is what bridges the gap. Moody's counted $662bn of hyperscaler data center leases not yet commenced at the end of 2025, held off balance sheet and equal to 113% of their adjusted debt, and says it will treat part of them as debt, while S&amp;P accepted Hyperion as off balance sheet for Meta. The divergence is that one obligation is a lease to one agency and debt to another, and any tenant downgrade passes straight through to the structures built on it.</w:t>
       </w:r>
     </w:p>
     <w:tbl>
@@ -542,7 +542,7 @@
           <w:sz w:val="21"/>
           <w:szCs w:val="21"/>
         </w:rPr>
-        <w:t xml:space="preserve">Investors are still funding the buildout, but they are charging more for it. Meta's El Paso joint venture priced $12.5bn of A+ rated amortizing notes on July 27 at 7.534%, or T+287.5, with orders peaking near $20bn, about 1.6 times the deal, against an average book of close to four times for large 2026 deals. Hyperion's 6.581% bonds, issued at par in October 2025, traded in the low 90s by late September without any change in Meta's credit. On September 23 a Blue Owl affiliated campus in Virginia leased to CoreWeave sold $1.1bn of BB- rated five year notes at 98.5 to yield 9.25%, about 270bps above similarly rated debt. GPU loans show the same split. CoreWeave borrowed at SOFR plus 225 in March on an A3 rated facility backed by its Meta contract, then paid SOFR plus 550 in August on a Ba2 facility backed by shorter contracts, 100bps wider than its May loan at the same ratings.</w:t>
+        <w:t xml:space="preserve">Investors are still funding the buildout, but they are charging more for it. Apollo estimates that order cover on hyperscaler bonds fell from about five times in February to below two times by July. Meta's El Paso joint venture priced $12.5bn of A+ rated amortizing notes on July 27 at 7.534%, or T+287.5, with orders peaking near $20bn, about 1.6 times the deal, while the average bond sale this year drew close to four times. That was 62.5bps wider than Hyperion's T+225 in October 2025 on the same tenant, rating, and template. On September 23 a Blue Owl affiliated campus in Virginia leased to CoreWeave sold $1.1bn of BB- rated five year notes at 98.5 to yield 9.25%, about 270bps above similarly rated debt. GPU loans show the same split. CoreWeave borrowed at SOFR plus 225 in March on an A3 rated facility backed by its Meta contract, then paid SOFR plus 550 in August on a Ba2 facility, 100bps wider than its May loan at the same ratings.</w:t>
       </w:r>
     </w:p>
     <w:p>
@@ -575,11 +575,12 @@
         <w:tblLayout w:type="fixed"/>
       </w:tblPr>
       <w:tblGrid>
-        <w:gridCol w:w="2500"/>
-        <w:gridCol w:w="1000"/>
-        <w:gridCol w:w="1000"/>
-        <w:gridCol w:w="1300"/>
-        <w:gridCol w:w="1550"/>
+        <w:gridCol w:w="2250"/>
+        <w:gridCol w:w="900"/>
+        <w:gridCol w:w="900"/>
+        <w:gridCol w:w="1150"/>
+        <w:gridCol w:w="1450"/>
+        <w:gridCol w:w="700"/>
         <w:gridCol w:w="1694"/>
       </w:tblGrid>
       <w:tr>
@@ -588,7 +589,7 @@
         </w:trPr>
         <w:tc>
           <w:tcPr>
-            <w:tcW w:type="dxa" w:w="2500"/>
+            <w:tcW w:type="dxa" w:w="2250"/>
             <w:tcBorders>
               <w:top w:val="single" w:color="C9B3B0" w:sz="4"/>
               <w:left w:val="single" w:color="C9B3B0" w:sz="4"/>
@@ -622,7 +623,7 @@
         </w:tc>
         <w:tc>
           <w:tcPr>
-            <w:tcW w:type="dxa" w:w="1000"/>
+            <w:tcW w:type="dxa" w:w="900"/>
             <w:tcBorders>
               <w:top w:val="single" w:color="C9B3B0" w:sz="4"/>
               <w:left w:val="single" w:color="C9B3B0" w:sz="4"/>
@@ -656,7 +657,7 @@
         </w:tc>
         <w:tc>
           <w:tcPr>
-            <w:tcW w:type="dxa" w:w="1000"/>
+            <w:tcW w:type="dxa" w:w="900"/>
             <w:tcBorders>
               <w:top w:val="single" w:color="C9B3B0" w:sz="4"/>
               <w:left w:val="single" w:color="C9B3B0" w:sz="4"/>
@@ -690,7 +691,7 @@
         </w:tc>
         <w:tc>
           <w:tcPr>
-            <w:tcW w:type="dxa" w:w="1300"/>
+            <w:tcW w:type="dxa" w:w="1150"/>
             <w:tcBorders>
               <w:top w:val="single" w:color="C9B3B0" w:sz="4"/>
               <w:left w:val="single" w:color="C9B3B0" w:sz="4"/>
@@ -724,7 +725,7 @@
         </w:tc>
         <w:tc>
           <w:tcPr>
-            <w:tcW w:type="dxa" w:w="1550"/>
+            <w:tcW w:type="dxa" w:w="1450"/>
             <w:tcBorders>
               <w:top w:val="single" w:color="C9B3B0" w:sz="4"/>
               <w:left w:val="single" w:color="C9B3B0" w:sz="4"/>
@@ -753,6 +754,40 @@
                 <w:szCs w:val="18"/>
               </w:rPr>
               <w:t xml:space="preserve">Pricing</w:t>
+            </w:r>
+          </w:p>
+        </w:tc>
+        <w:tc>
+          <w:tcPr>
+            <w:tcW w:type="dxa" w:w="700"/>
+            <w:tcBorders>
+              <w:top w:val="single" w:color="C9B3B0" w:sz="4"/>
+              <w:left w:val="single" w:color="C9B3B0" w:sz="4"/>
+              <w:bottom w:val="single" w:color="C9B3B0" w:sz="4"/>
+              <w:right w:val="single" w:color="C9B3B0" w:sz="4"/>
+            </w:tcBorders>
+            <w:shd w:fill="4F1D1B" w:color="auto" w:val="clear"/>
+            <w:tcMar>
+              <w:top w:type="dxa" w:w="60"/>
+              <w:left w:type="dxa" w:w="90"/>
+              <w:bottom w:type="dxa" w:w="60"/>
+              <w:right w:type="dxa" w:w="90"/>
+            </w:tcMar>
+          </w:tcPr>
+          <w:p>
+            <w:pPr>
+              <w:spacing w:after="0" w:before="0"/>
+            </w:pPr>
+            <w:r>
+              <w:rPr>
+                <w:rFonts w:ascii="Times New Roman" w:cs="Times New Roman" w:eastAsia="Times New Roman" w:hAnsi="Times New Roman"/>
+                <w:b/>
+                <w:bCs/>
+                <w:color w:val="FFFFFF"/>
+                <w:sz w:val="18"/>
+                <w:szCs w:val="18"/>
+              </w:rPr>
+              <w:t xml:space="preserve">Final</w:t>
             </w:r>
           </w:p>
         </w:tc>
@@ -797,7 +832,7 @@
         </w:trPr>
         <w:tc>
           <w:tcPr>
-            <w:tcW w:type="dxa" w:w="2500"/>
+            <w:tcW w:type="dxa" w:w="2250"/>
             <w:tcBorders>
               <w:top w:val="single" w:color="C9B3B0" w:sz="4"/>
               <w:left w:val="single" w:color="C9B3B0" w:sz="4"/>
@@ -830,7 +865,7 @@
         </w:tc>
         <w:tc>
           <w:tcPr>
-            <w:tcW w:type="dxa" w:w="1000"/>
+            <w:tcW w:type="dxa" w:w="900"/>
             <w:tcBorders>
               <w:top w:val="single" w:color="C9B3B0" w:sz="4"/>
               <w:left w:val="single" w:color="C9B3B0" w:sz="4"/>
@@ -863,7 +898,7 @@
         </w:tc>
         <w:tc>
           <w:tcPr>
-            <w:tcW w:type="dxa" w:w="1000"/>
+            <w:tcW w:type="dxa" w:w="900"/>
             <w:tcBorders>
               <w:top w:val="single" w:color="C9B3B0" w:sz="4"/>
               <w:left w:val="single" w:color="C9B3B0" w:sz="4"/>
@@ -896,7 +931,7 @@
         </w:tc>
         <w:tc>
           <w:tcPr>
-            <w:tcW w:type="dxa" w:w="1300"/>
+            <w:tcW w:type="dxa" w:w="1150"/>
             <w:tcBorders>
               <w:top w:val="single" w:color="C9B3B0" w:sz="4"/>
               <w:left w:val="single" w:color="C9B3B0" w:sz="4"/>
@@ -929,7 +964,7 @@
         </w:tc>
         <w:tc>
           <w:tcPr>
-            <w:tcW w:type="dxa" w:w="1550"/>
+            <w:tcW w:type="dxa" w:w="1450"/>
             <w:tcBorders>
               <w:top w:val="single" w:color="C9B3B0" w:sz="4"/>
               <w:left w:val="single" w:color="C9B3B0" w:sz="4"/>
@@ -957,6 +992,39 @@
                 <w:szCs w:val="18"/>
               </w:rPr>
               <w:t xml:space="preserve">6.129%, T+165</w:t>
+            </w:r>
+          </w:p>
+        </w:tc>
+        <w:tc>
+          <w:tcPr>
+            <w:tcW w:type="dxa" w:w="700"/>
+            <w:tcBorders>
+              <w:top w:val="single" w:color="C9B3B0" w:sz="4"/>
+              <w:left w:val="single" w:color="C9B3B0" w:sz="4"/>
+              <w:bottom w:val="single" w:color="C9B3B0" w:sz="4"/>
+              <w:right w:val="single" w:color="C9B3B0" w:sz="4"/>
+            </w:tcBorders>
+            <w:tcMar>
+              <w:top w:type="dxa" w:w="60"/>
+              <w:left w:type="dxa" w:w="90"/>
+              <w:bottom w:type="dxa" w:w="60"/>
+              <w:right w:type="dxa" w:w="90"/>
+            </w:tcMar>
+          </w:tcPr>
+          <w:p>
+            <w:pPr>
+              <w:spacing w:after="0" w:before="0"/>
+            </w:pPr>
+            <w:r>
+              <w:rPr>
+                <w:rFonts w:ascii="Times New Roman" w:cs="Times New Roman" w:eastAsia="Times New Roman" w:hAnsi="Times New Roman"/>
+                <w:b w:val="false"/>
+                <w:bCs w:val="false"/>
+                <w:color w:val="000000"/>
+                <w:sz w:val="18"/>
+                <w:szCs w:val="18"/>
+              </w:rPr>
+              <w:t xml:space="preserve">2042</w:t>
             </w:r>
           </w:p>
         </w:tc>
@@ -1000,7 +1068,7 @@
         </w:trPr>
         <w:tc>
           <w:tcPr>
-            <w:tcW w:type="dxa" w:w="2500"/>
+            <w:tcW w:type="dxa" w:w="2250"/>
             <w:tcBorders>
               <w:top w:val="single" w:color="C9B3B0" w:sz="4"/>
               <w:left w:val="single" w:color="C9B3B0" w:sz="4"/>
@@ -1033,7 +1101,7 @@
         </w:tc>
         <w:tc>
           <w:tcPr>
-            <w:tcW w:type="dxa" w:w="1000"/>
+            <w:tcW w:type="dxa" w:w="900"/>
             <w:tcBorders>
               <w:top w:val="single" w:color="C9B3B0" w:sz="4"/>
               <w:left w:val="single" w:color="C9B3B0" w:sz="4"/>
@@ -1066,7 +1134,7 @@
         </w:tc>
         <w:tc>
           <w:tcPr>
-            <w:tcW w:type="dxa" w:w="1000"/>
+            <w:tcW w:type="dxa" w:w="900"/>
             <w:tcBorders>
               <w:top w:val="single" w:color="C9B3B0" w:sz="4"/>
               <w:left w:val="single" w:color="C9B3B0" w:sz="4"/>
@@ -1099,67 +1167,100 @@
         </w:tc>
         <w:tc>
           <w:tcPr>
-            <w:tcW w:type="dxa" w:w="1300"/>
-            <w:tcBorders>
-              <w:top w:val="single" w:color="C9B3B0" w:sz="4"/>
-              <w:left w:val="single" w:color="C9B3B0" w:sz="4"/>
-              <w:bottom w:val="single" w:color="C9B3B0" w:sz="4"/>
-              <w:right w:val="single" w:color="C9B3B0" w:sz="4"/>
-            </w:tcBorders>
-            <w:tcMar>
-              <w:top w:type="dxa" w:w="60"/>
-              <w:left w:type="dxa" w:w="90"/>
-              <w:bottom w:type="dxa" w:w="60"/>
-              <w:right w:type="dxa" w:w="90"/>
-            </w:tcMar>
-          </w:tcPr>
-          <w:p>
-            <w:pPr>
-              <w:spacing w:after="0" w:before="0"/>
-            </w:pPr>
-            <w:r>
-              <w:rPr>
-                <w:rFonts w:ascii="Times New Roman" w:cs="Times New Roman" w:eastAsia="Times New Roman" w:hAnsi="Times New Roman"/>
-                <w:b w:val="false"/>
-                <w:bCs w:val="false"/>
-                <w:color w:val="000000"/>
-                <w:sz w:val="18"/>
-                <w:szCs w:val="18"/>
-              </w:rPr>
-              <w:t xml:space="preserve">Not public</w:t>
-            </w:r>
-          </w:p>
-        </w:tc>
-        <w:tc>
-          <w:tcPr>
-            <w:tcW w:type="dxa" w:w="1550"/>
-            <w:tcBorders>
-              <w:top w:val="single" w:color="C9B3B0" w:sz="4"/>
-              <w:left w:val="single" w:color="C9B3B0" w:sz="4"/>
-              <w:bottom w:val="single" w:color="C9B3B0" w:sz="4"/>
-              <w:right w:val="single" w:color="C9B3B0" w:sz="4"/>
-            </w:tcBorders>
-            <w:tcMar>
-              <w:top w:type="dxa" w:w="60"/>
-              <w:left w:type="dxa" w:w="90"/>
-              <w:bottom w:type="dxa" w:w="60"/>
-              <w:right w:type="dxa" w:w="90"/>
-            </w:tcMar>
-          </w:tcPr>
-          <w:p>
-            <w:pPr>
-              <w:spacing w:after="0" w:before="0"/>
-            </w:pPr>
-            <w:r>
-              <w:rPr>
-                <w:rFonts w:ascii="Times New Roman" w:cs="Times New Roman" w:eastAsia="Times New Roman" w:hAnsi="Times New Roman"/>
-                <w:b w:val="false"/>
-                <w:bCs w:val="false"/>
-                <w:color w:val="000000"/>
-                <w:sz w:val="18"/>
-                <w:szCs w:val="18"/>
-              </w:rPr>
-              <w:t xml:space="preserve">Guided ~7.5%</w:t>
+            <w:tcW w:type="dxa" w:w="1150"/>
+            <w:tcBorders>
+              <w:top w:val="single" w:color="C9B3B0" w:sz="4"/>
+              <w:left w:val="single" w:color="C9B3B0" w:sz="4"/>
+              <w:bottom w:val="single" w:color="C9B3B0" w:sz="4"/>
+              <w:right w:val="single" w:color="C9B3B0" w:sz="4"/>
+            </w:tcBorders>
+            <w:tcMar>
+              <w:top w:type="dxa" w:w="60"/>
+              <w:left w:type="dxa" w:w="90"/>
+              <w:bottom w:type="dxa" w:w="60"/>
+              <w:right w:type="dxa" w:w="90"/>
+            </w:tcMar>
+          </w:tcPr>
+          <w:p>
+            <w:pPr>
+              <w:spacing w:after="0" w:before="0"/>
+            </w:pPr>
+            <w:r>
+              <w:rPr>
+                <w:rFonts w:ascii="Times New Roman" w:cs="Times New Roman" w:eastAsia="Times New Roman" w:hAnsi="Times New Roman"/>
+                <w:b w:val="false"/>
+                <w:bCs w:val="false"/>
+                <w:color w:val="000000"/>
+                <w:sz w:val="18"/>
+                <w:szCs w:val="18"/>
+              </w:rPr>
+              <w:t xml:space="preserve">Not disclosed</w:t>
+            </w:r>
+          </w:p>
+        </w:tc>
+        <w:tc>
+          <w:tcPr>
+            <w:tcW w:type="dxa" w:w="1450"/>
+            <w:tcBorders>
+              <w:top w:val="single" w:color="C9B3B0" w:sz="4"/>
+              <w:left w:val="single" w:color="C9B3B0" w:sz="4"/>
+              <w:bottom w:val="single" w:color="C9B3B0" w:sz="4"/>
+              <w:right w:val="single" w:color="C9B3B0" w:sz="4"/>
+            </w:tcBorders>
+            <w:tcMar>
+              <w:top w:type="dxa" w:w="60"/>
+              <w:left w:type="dxa" w:w="90"/>
+              <w:bottom w:type="dxa" w:w="60"/>
+              <w:right w:type="dxa" w:w="90"/>
+            </w:tcMar>
+          </w:tcPr>
+          <w:p>
+            <w:pPr>
+              <w:spacing w:after="0" w:before="0"/>
+            </w:pPr>
+            <w:r>
+              <w:rPr>
+                <w:rFonts w:ascii="Times New Roman" w:cs="Times New Roman" w:eastAsia="Times New Roman" w:hAnsi="Times New Roman"/>
+                <w:b w:val="false"/>
+                <w:bCs w:val="false"/>
+                <w:color w:val="000000"/>
+                <w:sz w:val="18"/>
+                <w:szCs w:val="18"/>
+              </w:rPr>
+              <w:t xml:space="preserve">7.5% at 98.75</w:t>
+            </w:r>
+          </w:p>
+        </w:tc>
+        <w:tc>
+          <w:tcPr>
+            <w:tcW w:type="dxa" w:w="700"/>
+            <w:tcBorders>
+              <w:top w:val="single" w:color="C9B3B0" w:sz="4"/>
+              <w:left w:val="single" w:color="C9B3B0" w:sz="4"/>
+              <w:bottom w:val="single" w:color="C9B3B0" w:sz="4"/>
+              <w:right w:val="single" w:color="C9B3B0" w:sz="4"/>
+            </w:tcBorders>
+            <w:tcMar>
+              <w:top w:type="dxa" w:w="60"/>
+              <w:left w:type="dxa" w:w="90"/>
+              <w:bottom w:type="dxa" w:w="60"/>
+              <w:right w:type="dxa" w:w="90"/>
+            </w:tcMar>
+          </w:tcPr>
+          <w:p>
+            <w:pPr>
+              <w:spacing w:after="0" w:before="0"/>
+            </w:pPr>
+            <w:r>
+              <w:rPr>
+                <w:rFonts w:ascii="Times New Roman" w:cs="Times New Roman" w:eastAsia="Times New Roman" w:hAnsi="Times New Roman"/>
+                <w:b w:val="false"/>
+                <w:bCs w:val="false"/>
+                <w:color w:val="000000"/>
+                <w:sz w:val="18"/>
+                <w:szCs w:val="18"/>
+              </w:rPr>
+              <w:t xml:space="preserve">2045</w:t>
             </w:r>
           </w:p>
         </w:tc>
@@ -1203,7 +1304,7 @@
         </w:trPr>
         <w:tc>
           <w:tcPr>
-            <w:tcW w:type="dxa" w:w="2500"/>
+            <w:tcW w:type="dxa" w:w="2250"/>
             <w:tcBorders>
               <w:top w:val="single" w:color="C9B3B0" w:sz="4"/>
               <w:left w:val="single" w:color="C9B3B0" w:sz="4"/>
@@ -1236,7 +1337,7 @@
         </w:tc>
         <w:tc>
           <w:tcPr>
-            <w:tcW w:type="dxa" w:w="1000"/>
+            <w:tcW w:type="dxa" w:w="900"/>
             <w:tcBorders>
               <w:top w:val="single" w:color="C9B3B0" w:sz="4"/>
               <w:left w:val="single" w:color="C9B3B0" w:sz="4"/>
@@ -1269,7 +1370,7 @@
         </w:tc>
         <w:tc>
           <w:tcPr>
-            <w:tcW w:type="dxa" w:w="1000"/>
+            <w:tcW w:type="dxa" w:w="900"/>
             <w:tcBorders>
               <w:top w:val="single" w:color="C9B3B0" w:sz="4"/>
               <w:left w:val="single" w:color="C9B3B0" w:sz="4"/>
@@ -1302,7 +1403,7 @@
         </w:tc>
         <w:tc>
           <w:tcPr>
-            <w:tcW w:type="dxa" w:w="1300"/>
+            <w:tcW w:type="dxa" w:w="1150"/>
             <w:tcBorders>
               <w:top w:val="single" w:color="C9B3B0" w:sz="4"/>
               <w:left w:val="single" w:color="C9B3B0" w:sz="4"/>
@@ -1335,7 +1436,7 @@
         </w:tc>
         <w:tc>
           <w:tcPr>
-            <w:tcW w:type="dxa" w:w="1550"/>
+            <w:tcW w:type="dxa" w:w="1450"/>
             <w:tcBorders>
               <w:top w:val="single" w:color="C9B3B0" w:sz="4"/>
               <w:left w:val="single" w:color="C9B3B0" w:sz="4"/>
@@ -1368,6 +1469,39 @@
         </w:tc>
         <w:tc>
           <w:tcPr>
+            <w:tcW w:type="dxa" w:w="700"/>
+            <w:tcBorders>
+              <w:top w:val="single" w:color="C9B3B0" w:sz="4"/>
+              <w:left w:val="single" w:color="C9B3B0" w:sz="4"/>
+              <w:bottom w:val="single" w:color="C9B3B0" w:sz="4"/>
+              <w:right w:val="single" w:color="C9B3B0" w:sz="4"/>
+            </w:tcBorders>
+            <w:tcMar>
+              <w:top w:type="dxa" w:w="60"/>
+              <w:left w:type="dxa" w:w="90"/>
+              <w:bottom w:type="dxa" w:w="60"/>
+              <w:right w:type="dxa" w:w="90"/>
+            </w:tcMar>
+          </w:tcPr>
+          <w:p>
+            <w:pPr>
+              <w:spacing w:after="0" w:before="0"/>
+            </w:pPr>
+            <w:r>
+              <w:rPr>
+                <w:rFonts w:ascii="Times New Roman" w:cs="Times New Roman" w:eastAsia="Times New Roman" w:hAnsi="Times New Roman"/>
+                <w:b w:val="false"/>
+                <w:bCs w:val="false"/>
+                <w:color w:val="000000"/>
+                <w:sz w:val="18"/>
+                <w:szCs w:val="18"/>
+              </w:rPr>
+              <w:t xml:space="preserve">2049</w:t>
+            </w:r>
+          </w:p>
+        </w:tc>
+        <w:tc>
+          <w:tcPr>
             <w:tcW w:type="dxa" w:w="1694"/>
             <w:tcBorders>
               <w:top w:val="single" w:color="C9B3B0" w:sz="4"/>
@@ -1395,7 +1529,7 @@
                 <w:sz w:val="18"/>
                 <w:szCs w:val="18"/>
               </w:rPr>
-              <w:t xml:space="preserve">Meta lease and RVG</w:t>
+              <w:t xml:space="preserve">Meta lease, ~$28bn RVG</w:t>
             </w:r>
           </w:p>
         </w:tc>
@@ -1406,7 +1540,7 @@
         </w:trPr>
         <w:tc>
           <w:tcPr>
-            <w:tcW w:type="dxa" w:w="2500"/>
+            <w:tcW w:type="dxa" w:w="2250"/>
             <w:tcBorders>
               <w:top w:val="single" w:color="C9B3B0" w:sz="4"/>
               <w:left w:val="single" w:color="C9B3B0" w:sz="4"/>
@@ -1439,7 +1573,7 @@
         </w:tc>
         <w:tc>
           <w:tcPr>
-            <w:tcW w:type="dxa" w:w="1000"/>
+            <w:tcW w:type="dxa" w:w="900"/>
             <w:tcBorders>
               <w:top w:val="single" w:color="C9B3B0" w:sz="4"/>
               <w:left w:val="single" w:color="C9B3B0" w:sz="4"/>
@@ -1472,7 +1606,7 @@
         </w:tc>
         <w:tc>
           <w:tcPr>
-            <w:tcW w:type="dxa" w:w="1000"/>
+            <w:tcW w:type="dxa" w:w="900"/>
             <w:tcBorders>
               <w:top w:val="single" w:color="C9B3B0" w:sz="4"/>
               <w:left w:val="single" w:color="C9B3B0" w:sz="4"/>
@@ -1505,7 +1639,7 @@
         </w:tc>
         <w:tc>
           <w:tcPr>
-            <w:tcW w:type="dxa" w:w="1300"/>
+            <w:tcW w:type="dxa" w:w="1150"/>
             <w:tcBorders>
               <w:top w:val="single" w:color="C9B3B0" w:sz="4"/>
               <w:left w:val="single" w:color="C9B3B0" w:sz="4"/>
@@ -1538,7 +1672,7 @@
         </w:tc>
         <w:tc>
           <w:tcPr>
-            <w:tcW w:type="dxa" w:w="1550"/>
+            <w:tcW w:type="dxa" w:w="1450"/>
             <w:tcBorders>
               <w:top w:val="single" w:color="C9B3B0" w:sz="4"/>
               <w:left w:val="single" w:color="C9B3B0" w:sz="4"/>
@@ -1566,6 +1700,39 @@
                 <w:szCs w:val="18"/>
               </w:rPr>
               <w:t xml:space="preserve">7.534%, T+287.5</w:t>
+            </w:r>
+          </w:p>
+        </w:tc>
+        <w:tc>
+          <w:tcPr>
+            <w:tcW w:type="dxa" w:w="700"/>
+            <w:tcBorders>
+              <w:top w:val="single" w:color="C9B3B0" w:sz="4"/>
+              <w:left w:val="single" w:color="C9B3B0" w:sz="4"/>
+              <w:bottom w:val="single" w:color="C9B3B0" w:sz="4"/>
+              <w:right w:val="single" w:color="C9B3B0" w:sz="4"/>
+            </w:tcBorders>
+            <w:tcMar>
+              <w:top w:type="dxa" w:w="60"/>
+              <w:left w:type="dxa" w:w="90"/>
+              <w:bottom w:type="dxa" w:w="60"/>
+              <w:right w:type="dxa" w:w="90"/>
+            </w:tcMar>
+          </w:tcPr>
+          <w:p>
+            <w:pPr>
+              <w:spacing w:after="0" w:before="0"/>
+            </w:pPr>
+            <w:r>
+              <w:rPr>
+                <w:rFonts w:ascii="Times New Roman" w:cs="Times New Roman" w:eastAsia="Times New Roman" w:hAnsi="Times New Roman"/>
+                <w:b w:val="false"/>
+                <w:bCs w:val="false"/>
+                <w:color w:val="000000"/>
+                <w:sz w:val="18"/>
+                <w:szCs w:val="18"/>
+              </w:rPr>
+              <w:t xml:space="preserve">2048</w:t>
             </w:r>
           </w:p>
         </w:tc>
@@ -1609,7 +1776,7 @@
         </w:trPr>
         <w:tc>
           <w:tcPr>
-            <w:tcW w:type="dxa" w:w="2500"/>
+            <w:tcW w:type="dxa" w:w="2250"/>
             <w:tcBorders>
               <w:top w:val="single" w:color="C9B3B0" w:sz="4"/>
               <w:left w:val="single" w:color="C9B3B0" w:sz="4"/>
@@ -1642,7 +1809,7 @@
         </w:tc>
         <w:tc>
           <w:tcPr>
-            <w:tcW w:type="dxa" w:w="1000"/>
+            <w:tcW w:type="dxa" w:w="900"/>
             <w:tcBorders>
               <w:top w:val="single" w:color="C9B3B0" w:sz="4"/>
               <w:left w:val="single" w:color="C9B3B0" w:sz="4"/>
@@ -1675,7 +1842,7 @@
         </w:tc>
         <w:tc>
           <w:tcPr>
-            <w:tcW w:type="dxa" w:w="1000"/>
+            <w:tcW w:type="dxa" w:w="900"/>
             <w:tcBorders>
               <w:top w:val="single" w:color="C9B3B0" w:sz="4"/>
               <w:left w:val="single" w:color="C9B3B0" w:sz="4"/>
@@ -1708,7 +1875,7 @@
         </w:tc>
         <w:tc>
           <w:tcPr>
-            <w:tcW w:type="dxa" w:w="1300"/>
+            <w:tcW w:type="dxa" w:w="1150"/>
             <w:tcBorders>
               <w:top w:val="single" w:color="C9B3B0" w:sz="4"/>
               <w:left w:val="single" w:color="C9B3B0" w:sz="4"/>
@@ -1741,7 +1908,7 @@
         </w:tc>
         <w:tc>
           <w:tcPr>
-            <w:tcW w:type="dxa" w:w="1550"/>
+            <w:tcW w:type="dxa" w:w="1450"/>
             <w:tcBorders>
               <w:top w:val="single" w:color="C9B3B0" w:sz="4"/>
               <w:left w:val="single" w:color="C9B3B0" w:sz="4"/>
@@ -1774,6 +1941,39 @@
         </w:tc>
         <w:tc>
           <w:tcPr>
+            <w:tcW w:type="dxa" w:w="700"/>
+            <w:tcBorders>
+              <w:top w:val="single" w:color="C9B3B0" w:sz="4"/>
+              <w:left w:val="single" w:color="C9B3B0" w:sz="4"/>
+              <w:bottom w:val="single" w:color="C9B3B0" w:sz="4"/>
+              <w:right w:val="single" w:color="C9B3B0" w:sz="4"/>
+            </w:tcBorders>
+            <w:tcMar>
+              <w:top w:type="dxa" w:w="60"/>
+              <w:left w:type="dxa" w:w="90"/>
+              <w:bottom w:type="dxa" w:w="60"/>
+              <w:right w:type="dxa" w:w="90"/>
+            </w:tcMar>
+          </w:tcPr>
+          <w:p>
+            <w:pPr>
+              <w:spacing w:after="0" w:before="0"/>
+            </w:pPr>
+            <w:r>
+              <w:rPr>
+                <w:rFonts w:ascii="Times New Roman" w:cs="Times New Roman" w:eastAsia="Times New Roman" w:hAnsi="Times New Roman"/>
+                <w:b w:val="false"/>
+                <w:bCs w:val="false"/>
+                <w:color w:val="000000"/>
+                <w:sz w:val="18"/>
+                <w:szCs w:val="18"/>
+              </w:rPr>
+              <w:t xml:space="preserve">5 yr</w:t>
+            </w:r>
+          </w:p>
+        </w:tc>
+        <w:tc>
+          <w:tcPr>
             <w:tcW w:type="dxa" w:w="1694"/>
             <w:tcBorders>
               <w:top w:val="single" w:color="C9B3B0" w:sz="4"/>
@@ -1801,7 +2001,7 @@
                 <w:sz w:val="18"/>
                 <w:szCs w:val="18"/>
               </w:rPr>
-              <w:t xml:space="preserve">15 yr CoreWeave lease</w:t>
+              <w:t xml:space="preserve">CoreWeave lease</w:t>
             </w:r>
           </w:p>
         </w:tc>
@@ -1812,7 +2012,7 @@
         </w:trPr>
         <w:tc>
           <w:tcPr>
-            <w:tcW w:type="dxa" w:w="2500"/>
+            <w:tcW w:type="dxa" w:w="2250"/>
             <w:tcBorders>
               <w:top w:val="single" w:color="C9B3B0" w:sz="4"/>
               <w:left w:val="single" w:color="C9B3B0" w:sz="4"/>
@@ -1845,7 +2045,7 @@
         </w:tc>
         <w:tc>
           <w:tcPr>
-            <w:tcW w:type="dxa" w:w="1000"/>
+            <w:tcW w:type="dxa" w:w="900"/>
             <w:tcBorders>
               <w:top w:val="single" w:color="C9B3B0" w:sz="4"/>
               <w:left w:val="single" w:color="C9B3B0" w:sz="4"/>
@@ -1878,7 +2078,7 @@
         </w:tc>
         <w:tc>
           <w:tcPr>
-            <w:tcW w:type="dxa" w:w="1000"/>
+            <w:tcW w:type="dxa" w:w="900"/>
             <w:tcBorders>
               <w:top w:val="single" w:color="C9B3B0" w:sz="4"/>
               <w:left w:val="single" w:color="C9B3B0" w:sz="4"/>
@@ -1911,7 +2111,7 @@
         </w:tc>
         <w:tc>
           <w:tcPr>
-            <w:tcW w:type="dxa" w:w="1300"/>
+            <w:tcW w:type="dxa" w:w="1150"/>
             <w:tcBorders>
               <w:top w:val="single" w:color="C9B3B0" w:sz="4"/>
               <w:left w:val="single" w:color="C9B3B0" w:sz="4"/>
@@ -1944,7 +2144,7 @@
         </w:tc>
         <w:tc>
           <w:tcPr>
-            <w:tcW w:type="dxa" w:w="1550"/>
+            <w:tcW w:type="dxa" w:w="1450"/>
             <w:tcBorders>
               <w:top w:val="single" w:color="C9B3B0" w:sz="4"/>
               <w:left w:val="single" w:color="C9B3B0" w:sz="4"/>
@@ -1977,6 +2177,39 @@
         </w:tc>
         <w:tc>
           <w:tcPr>
+            <w:tcW w:type="dxa" w:w="700"/>
+            <w:tcBorders>
+              <w:top w:val="single" w:color="C9B3B0" w:sz="4"/>
+              <w:left w:val="single" w:color="C9B3B0" w:sz="4"/>
+              <w:bottom w:val="single" w:color="C9B3B0" w:sz="4"/>
+              <w:right w:val="single" w:color="C9B3B0" w:sz="4"/>
+            </w:tcBorders>
+            <w:tcMar>
+              <w:top w:type="dxa" w:w="60"/>
+              <w:left w:type="dxa" w:w="90"/>
+              <w:bottom w:type="dxa" w:w="60"/>
+              <w:right w:type="dxa" w:w="90"/>
+            </w:tcMar>
+          </w:tcPr>
+          <w:p>
+            <w:pPr>
+              <w:spacing w:after="0" w:before="0"/>
+            </w:pPr>
+            <w:r>
+              <w:rPr>
+                <w:rFonts w:ascii="Times New Roman" w:cs="Times New Roman" w:eastAsia="Times New Roman" w:hAnsi="Times New Roman"/>
+                <w:b w:val="false"/>
+                <w:bCs w:val="false"/>
+                <w:color w:val="000000"/>
+                <w:sz w:val="18"/>
+                <w:szCs w:val="18"/>
+              </w:rPr>
+              <w:t xml:space="preserve">5 yr ARD</w:t>
+            </w:r>
+          </w:p>
+        </w:tc>
+        <w:tc>
+          <w:tcPr>
             <w:tcW w:type="dxa" w:w="1694"/>
             <w:tcBorders>
               <w:top w:val="single" w:color="C9B3B0" w:sz="4"/>
@@ -2004,7 +2237,7 @@
                 <w:sz w:val="18"/>
                 <w:szCs w:val="18"/>
               </w:rPr>
-              <w:t xml:space="preserve">70% LTV</w:t>
+              <w:t xml:space="preserve">70% LTV cap</w:t>
             </w:r>
           </w:p>
         </w:tc>
@@ -2015,7 +2248,7 @@
         </w:trPr>
         <w:tc>
           <w:tcPr>
-            <w:tcW w:type="dxa" w:w="2500"/>
+            <w:tcW w:type="dxa" w:w="2250"/>
             <w:tcBorders>
               <w:top w:val="single" w:color="C9B3B0" w:sz="4"/>
               <w:left w:val="single" w:color="C9B3B0" w:sz="4"/>
@@ -2048,7 +2281,7 @@
         </w:tc>
         <w:tc>
           <w:tcPr>
-            <w:tcW w:type="dxa" w:w="1000"/>
+            <w:tcW w:type="dxa" w:w="900"/>
             <w:tcBorders>
               <w:top w:val="single" w:color="C9B3B0" w:sz="4"/>
               <w:left w:val="single" w:color="C9B3B0" w:sz="4"/>
@@ -2081,7 +2314,7 @@
         </w:tc>
         <w:tc>
           <w:tcPr>
-            <w:tcW w:type="dxa" w:w="1000"/>
+            <w:tcW w:type="dxa" w:w="900"/>
             <w:tcBorders>
               <w:top w:val="single" w:color="C9B3B0" w:sz="4"/>
               <w:left w:val="single" w:color="C9B3B0" w:sz="4"/>
@@ -2114,7 +2347,7 @@
         </w:tc>
         <w:tc>
           <w:tcPr>
-            <w:tcW w:type="dxa" w:w="1300"/>
+            <w:tcW w:type="dxa" w:w="1150"/>
             <w:tcBorders>
               <w:top w:val="single" w:color="C9B3B0" w:sz="4"/>
               <w:left w:val="single" w:color="C9B3B0" w:sz="4"/>
@@ -2147,7 +2380,7 @@
         </w:tc>
         <w:tc>
           <w:tcPr>
-            <w:tcW w:type="dxa" w:w="1550"/>
+            <w:tcW w:type="dxa" w:w="1450"/>
             <w:tcBorders>
               <w:top w:val="single" w:color="C9B3B0" w:sz="4"/>
               <w:left w:val="single" w:color="C9B3B0" w:sz="4"/>
@@ -2175,6 +2408,39 @@
                 <w:szCs w:val="18"/>
               </w:rPr>
               <w:t xml:space="preserve">Not disclosed</w:t>
+            </w:r>
+          </w:p>
+        </w:tc>
+        <w:tc>
+          <w:tcPr>
+            <w:tcW w:type="dxa" w:w="700"/>
+            <w:tcBorders>
+              <w:top w:val="single" w:color="C9B3B0" w:sz="4"/>
+              <w:left w:val="single" w:color="C9B3B0" w:sz="4"/>
+              <w:bottom w:val="single" w:color="C9B3B0" w:sz="4"/>
+              <w:right w:val="single" w:color="C9B3B0" w:sz="4"/>
+            </w:tcBorders>
+            <w:tcMar>
+              <w:top w:type="dxa" w:w="60"/>
+              <w:left w:type="dxa" w:w="90"/>
+              <w:bottom w:type="dxa" w:w="60"/>
+              <w:right w:type="dxa" w:w="90"/>
+            </w:tcMar>
+          </w:tcPr>
+          <w:p>
+            <w:pPr>
+              <w:spacing w:after="0" w:before="0"/>
+            </w:pPr>
+            <w:r>
+              <w:rPr>
+                <w:rFonts w:ascii="Times New Roman" w:cs="Times New Roman" w:eastAsia="Times New Roman" w:hAnsi="Times New Roman"/>
+                <w:b w:val="false"/>
+                <w:bCs w:val="false"/>
+                <w:color w:val="000000"/>
+                <w:sz w:val="18"/>
+                <w:szCs w:val="18"/>
+              </w:rPr>
+              <w:t xml:space="preserve">10 yr ARD</w:t>
             </w:r>
           </w:p>
         </w:tc>
@@ -2218,7 +2484,7 @@
         </w:trPr>
         <w:tc>
           <w:tcPr>
-            <w:tcW w:type="dxa" w:w="2500"/>
+            <w:tcW w:type="dxa" w:w="2250"/>
             <w:tcBorders>
               <w:top w:val="single" w:color="C9B3B0" w:sz="4"/>
               <w:left w:val="single" w:color="C9B3B0" w:sz="4"/>
@@ -2251,7 +2517,7 @@
         </w:tc>
         <w:tc>
           <w:tcPr>
-            <w:tcW w:type="dxa" w:w="1000"/>
+            <w:tcW w:type="dxa" w:w="900"/>
             <w:tcBorders>
               <w:top w:val="single" w:color="C9B3B0" w:sz="4"/>
               <w:left w:val="single" w:color="C9B3B0" w:sz="4"/>
@@ -2284,7 +2550,7 @@
         </w:tc>
         <w:tc>
           <w:tcPr>
-            <w:tcW w:type="dxa" w:w="1000"/>
+            <w:tcW w:type="dxa" w:w="900"/>
             <w:tcBorders>
               <w:top w:val="single" w:color="C9B3B0" w:sz="4"/>
               <w:left w:val="single" w:color="C9B3B0" w:sz="4"/>
@@ -2317,7 +2583,7 @@
         </w:tc>
         <w:tc>
           <w:tcPr>
-            <w:tcW w:type="dxa" w:w="1300"/>
+            <w:tcW w:type="dxa" w:w="1150"/>
             <w:tcBorders>
               <w:top w:val="single" w:color="C9B3B0" w:sz="4"/>
               <w:left w:val="single" w:color="C9B3B0" w:sz="4"/>
@@ -2350,7 +2616,7 @@
         </w:tc>
         <w:tc>
           <w:tcPr>
-            <w:tcW w:type="dxa" w:w="1550"/>
+            <w:tcW w:type="dxa" w:w="1450"/>
             <w:tcBorders>
               <w:top w:val="single" w:color="C9B3B0" w:sz="4"/>
               <w:left w:val="single" w:color="C9B3B0" w:sz="4"/>
@@ -2378,6 +2644,39 @@
                 <w:szCs w:val="18"/>
               </w:rPr>
               <w:t xml:space="preserve">SOFR+225</w:t>
+            </w:r>
+          </w:p>
+        </w:tc>
+        <w:tc>
+          <w:tcPr>
+            <w:tcW w:type="dxa" w:w="700"/>
+            <w:tcBorders>
+              <w:top w:val="single" w:color="C9B3B0" w:sz="4"/>
+              <w:left w:val="single" w:color="C9B3B0" w:sz="4"/>
+              <w:bottom w:val="single" w:color="C9B3B0" w:sz="4"/>
+              <w:right w:val="single" w:color="C9B3B0" w:sz="4"/>
+            </w:tcBorders>
+            <w:tcMar>
+              <w:top w:type="dxa" w:w="60"/>
+              <w:left w:type="dxa" w:w="90"/>
+              <w:bottom w:type="dxa" w:w="60"/>
+              <w:right w:type="dxa" w:w="90"/>
+            </w:tcMar>
+          </w:tcPr>
+          <w:p>
+            <w:pPr>
+              <w:spacing w:after="0" w:before="0"/>
+            </w:pPr>
+            <w:r>
+              <w:rPr>
+                <w:rFonts w:ascii="Times New Roman" w:cs="Times New Roman" w:eastAsia="Times New Roman" w:hAnsi="Times New Roman"/>
+                <w:b w:val="false"/>
+                <w:bCs w:val="false"/>
+                <w:color w:val="000000"/>
+                <w:sz w:val="18"/>
+                <w:szCs w:val="18"/>
+              </w:rPr>
+              <w:t xml:space="preserve">2032</w:t>
             </w:r>
           </w:p>
         </w:tc>
@@ -2421,7 +2720,7 @@
         </w:trPr>
         <w:tc>
           <w:tcPr>
-            <w:tcW w:type="dxa" w:w="2500"/>
+            <w:tcW w:type="dxa" w:w="2250"/>
             <w:tcBorders>
               <w:top w:val="single" w:color="C9B3B0" w:sz="4"/>
               <w:left w:val="single" w:color="C9B3B0" w:sz="4"/>
@@ -2454,7 +2753,7 @@
         </w:tc>
         <w:tc>
           <w:tcPr>
-            <w:tcW w:type="dxa" w:w="1000"/>
+            <w:tcW w:type="dxa" w:w="900"/>
             <w:tcBorders>
               <w:top w:val="single" w:color="C9B3B0" w:sz="4"/>
               <w:left w:val="single" w:color="C9B3B0" w:sz="4"/>
@@ -2487,7 +2786,7 @@
         </w:tc>
         <w:tc>
           <w:tcPr>
-            <w:tcW w:type="dxa" w:w="1000"/>
+            <w:tcW w:type="dxa" w:w="900"/>
             <w:tcBorders>
               <w:top w:val="single" w:color="C9B3B0" w:sz="4"/>
               <w:left w:val="single" w:color="C9B3B0" w:sz="4"/>
@@ -2520,7 +2819,7 @@
         </w:tc>
         <w:tc>
           <w:tcPr>
-            <w:tcW w:type="dxa" w:w="1300"/>
+            <w:tcW w:type="dxa" w:w="1150"/>
             <w:tcBorders>
               <w:top w:val="single" w:color="C9B3B0" w:sz="4"/>
               <w:left w:val="single" w:color="C9B3B0" w:sz="4"/>
@@ -2553,7 +2852,7 @@
         </w:tc>
         <w:tc>
           <w:tcPr>
-            <w:tcW w:type="dxa" w:w="1550"/>
+            <w:tcW w:type="dxa" w:w="1450"/>
             <w:tcBorders>
               <w:top w:val="single" w:color="C9B3B0" w:sz="4"/>
               <w:left w:val="single" w:color="C9B3B0" w:sz="4"/>
@@ -2581,6 +2880,39 @@
                 <w:szCs w:val="18"/>
               </w:rPr>
               <w:t xml:space="preserve">SOFR+550</w:t>
+            </w:r>
+          </w:p>
+        </w:tc>
+        <w:tc>
+          <w:tcPr>
+            <w:tcW w:type="dxa" w:w="700"/>
+            <w:tcBorders>
+              <w:top w:val="single" w:color="C9B3B0" w:sz="4"/>
+              <w:left w:val="single" w:color="C9B3B0" w:sz="4"/>
+              <w:bottom w:val="single" w:color="C9B3B0" w:sz="4"/>
+              <w:right w:val="single" w:color="C9B3B0" w:sz="4"/>
+            </w:tcBorders>
+            <w:tcMar>
+              <w:top w:type="dxa" w:w="60"/>
+              <w:left w:type="dxa" w:w="90"/>
+              <w:bottom w:type="dxa" w:w="60"/>
+              <w:right w:type="dxa" w:w="90"/>
+            </w:tcMar>
+          </w:tcPr>
+          <w:p>
+            <w:pPr>
+              <w:spacing w:after="0" w:before="0"/>
+            </w:pPr>
+            <w:r>
+              <w:rPr>
+                <w:rFonts w:ascii="Times New Roman" w:cs="Times New Roman" w:eastAsia="Times New Roman" w:hAnsi="Times New Roman"/>
+                <w:b w:val="false"/>
+                <w:bCs w:val="false"/>
+                <w:color w:val="000000"/>
+                <w:sz w:val="18"/>
+                <w:szCs w:val="18"/>
+              </w:rPr>
+              <w:t xml:space="preserve">2031</w:t>
             </w:r>
           </w:p>
         </w:tc>
@@ -2624,7 +2956,7 @@
         </w:trPr>
         <w:tc>
           <w:tcPr>
-            <w:tcW w:type="dxa" w:w="2500"/>
+            <w:tcW w:type="dxa" w:w="2250"/>
             <w:tcBorders>
               <w:top w:val="single" w:color="C9B3B0" w:sz="4"/>
               <w:left w:val="single" w:color="C9B3B0" w:sz="4"/>
@@ -2657,7 +2989,7 @@
         </w:tc>
         <w:tc>
           <w:tcPr>
-            <w:tcW w:type="dxa" w:w="1000"/>
+            <w:tcW w:type="dxa" w:w="900"/>
             <w:tcBorders>
               <w:top w:val="single" w:color="C9B3B0" w:sz="4"/>
               <w:left w:val="single" w:color="C9B3B0" w:sz="4"/>
@@ -2690,7 +3022,7 @@
         </w:tc>
         <w:tc>
           <w:tcPr>
-            <w:tcW w:type="dxa" w:w="1000"/>
+            <w:tcW w:type="dxa" w:w="900"/>
             <w:tcBorders>
               <w:top w:val="single" w:color="C9B3B0" w:sz="4"/>
               <w:left w:val="single" w:color="C9B3B0" w:sz="4"/>
@@ -2723,7 +3055,7 @@
         </w:tc>
         <w:tc>
           <w:tcPr>
-            <w:tcW w:type="dxa" w:w="1300"/>
+            <w:tcW w:type="dxa" w:w="1150"/>
             <w:tcBorders>
               <w:top w:val="single" w:color="C9B3B0" w:sz="4"/>
               <w:left w:val="single" w:color="C9B3B0" w:sz="4"/>
@@ -2756,7 +3088,7 @@
         </w:tc>
         <w:tc>
           <w:tcPr>
-            <w:tcW w:type="dxa" w:w="1550"/>
+            <w:tcW w:type="dxa" w:w="1450"/>
             <w:tcBorders>
               <w:top w:val="single" w:color="C9B3B0" w:sz="4"/>
               <w:left w:val="single" w:color="C9B3B0" w:sz="4"/>
@@ -2784,6 +3116,39 @@
                 <w:szCs w:val="18"/>
               </w:rPr>
               <w:t xml:space="preserve">SOFR+300</w:t>
+            </w:r>
+          </w:p>
+        </w:tc>
+        <w:tc>
+          <w:tcPr>
+            <w:tcW w:type="dxa" w:w="700"/>
+            <w:tcBorders>
+              <w:top w:val="single" w:color="C9B3B0" w:sz="4"/>
+              <w:left w:val="single" w:color="C9B3B0" w:sz="4"/>
+              <w:bottom w:val="single" w:color="C9B3B0" w:sz="4"/>
+              <w:right w:val="single" w:color="C9B3B0" w:sz="4"/>
+            </w:tcBorders>
+            <w:tcMar>
+              <w:top w:type="dxa" w:w="60"/>
+              <w:left w:type="dxa" w:w="90"/>
+              <w:bottom w:type="dxa" w:w="60"/>
+              <w:right w:type="dxa" w:w="90"/>
+            </w:tcMar>
+          </w:tcPr>
+          <w:p>
+            <w:pPr>
+              <w:spacing w:after="0" w:before="0"/>
+            </w:pPr>
+            <w:r>
+              <w:rPr>
+                <w:rFonts w:ascii="Times New Roman" w:cs="Times New Roman" w:eastAsia="Times New Roman" w:hAnsi="Times New Roman"/>
+                <w:b w:val="false"/>
+                <w:bCs w:val="false"/>
+                <w:color w:val="000000"/>
+                <w:sz w:val="18"/>
+                <w:szCs w:val="18"/>
+              </w:rPr>
+              <w:t xml:space="preserve">2030</w:t>
             </w:r>
           </w:p>
         </w:tc>
@@ -2827,7 +3192,7 @@
         </w:trPr>
         <w:tc>
           <w:tcPr>
-            <w:tcW w:type="dxa" w:w="2500"/>
+            <w:tcW w:type="dxa" w:w="2250"/>
             <w:tcBorders>
               <w:top w:val="single" w:color="C9B3B0" w:sz="4"/>
               <w:left w:val="single" w:color="C9B3B0" w:sz="4"/>
@@ -2860,7 +3225,7 @@
         </w:tc>
         <w:tc>
           <w:tcPr>
-            <w:tcW w:type="dxa" w:w="1000"/>
+            <w:tcW w:type="dxa" w:w="900"/>
             <w:tcBorders>
               <w:top w:val="single" w:color="C9B3B0" w:sz="4"/>
               <w:left w:val="single" w:color="C9B3B0" w:sz="4"/>
@@ -2893,7 +3258,7 @@
         </w:tc>
         <w:tc>
           <w:tcPr>
-            <w:tcW w:type="dxa" w:w="1000"/>
+            <w:tcW w:type="dxa" w:w="900"/>
             <w:tcBorders>
               <w:top w:val="single" w:color="C9B3B0" w:sz="4"/>
               <w:left w:val="single" w:color="C9B3B0" w:sz="4"/>
@@ -2926,40 +3291,40 @@
         </w:tc>
         <w:tc>
           <w:tcPr>
-            <w:tcW w:type="dxa" w:w="1300"/>
-            <w:tcBorders>
-              <w:top w:val="single" w:color="C9B3B0" w:sz="4"/>
-              <w:left w:val="single" w:color="C9B3B0" w:sz="4"/>
-              <w:bottom w:val="single" w:color="C9B3B0" w:sz="4"/>
-              <w:right w:val="single" w:color="C9B3B0" w:sz="4"/>
-            </w:tcBorders>
-            <w:tcMar>
-              <w:top w:type="dxa" w:w="60"/>
-              <w:left w:type="dxa" w:w="90"/>
-              <w:bottom w:type="dxa" w:w="60"/>
-              <w:right w:type="dxa" w:w="90"/>
-            </w:tcMar>
-          </w:tcPr>
-          <w:p>
-            <w:pPr>
-              <w:spacing w:after="0" w:before="0"/>
-            </w:pPr>
-            <w:r>
-              <w:rPr>
-                <w:rFonts w:ascii="Times New Roman" w:cs="Times New Roman" w:eastAsia="Times New Roman" w:hAnsi="Times New Roman"/>
-                <w:b w:val="false"/>
-                <w:bCs w:val="false"/>
-                <w:color w:val="000000"/>
-                <w:sz w:val="18"/>
-                <w:szCs w:val="18"/>
-              </w:rPr>
-              <w:t xml:space="preserve">Unrated</w:t>
-            </w:r>
-          </w:p>
-        </w:tc>
-        <w:tc>
-          <w:tcPr>
-            <w:tcW w:type="dxa" w:w="1550"/>
+            <w:tcW w:type="dxa" w:w="1150"/>
+            <w:tcBorders>
+              <w:top w:val="single" w:color="C9B3B0" w:sz="4"/>
+              <w:left w:val="single" w:color="C9B3B0" w:sz="4"/>
+              <w:bottom w:val="single" w:color="C9B3B0" w:sz="4"/>
+              <w:right w:val="single" w:color="C9B3B0" w:sz="4"/>
+            </w:tcBorders>
+            <w:tcMar>
+              <w:top w:type="dxa" w:w="60"/>
+              <w:left w:type="dxa" w:w="90"/>
+              <w:bottom w:type="dxa" w:w="60"/>
+              <w:right w:type="dxa" w:w="90"/>
+            </w:tcMar>
+          </w:tcPr>
+          <w:p>
+            <w:pPr>
+              <w:spacing w:after="0" w:before="0"/>
+            </w:pPr>
+            <w:r>
+              <w:rPr>
+                <w:rFonts w:ascii="Times New Roman" w:cs="Times New Roman" w:eastAsia="Times New Roman" w:hAnsi="Times New Roman"/>
+                <w:b w:val="false"/>
+                <w:bCs w:val="false"/>
+                <w:color w:val="000000"/>
+                <w:sz w:val="18"/>
+                <w:szCs w:val="18"/>
+              </w:rPr>
+              <w:t xml:space="preserve">Not disclosed</w:t>
+            </w:r>
+          </w:p>
+        </w:tc>
+        <w:tc>
+          <w:tcPr>
+            <w:tcW w:type="dxa" w:w="1450"/>
             <w:tcBorders>
               <w:top w:val="single" w:color="C9B3B0" w:sz="4"/>
               <w:left w:val="single" w:color="C9B3B0" w:sz="4"/>
@@ -2987,6 +3352,39 @@
                 <w:szCs w:val="18"/>
               </w:rPr>
               <w:t xml:space="preserve">Quoted 89 to 91</w:t>
+            </w:r>
+          </w:p>
+        </w:tc>
+        <w:tc>
+          <w:tcPr>
+            <w:tcW w:type="dxa" w:w="700"/>
+            <w:tcBorders>
+              <w:top w:val="single" w:color="C9B3B0" w:sz="4"/>
+              <w:left w:val="single" w:color="C9B3B0" w:sz="4"/>
+              <w:bottom w:val="single" w:color="C9B3B0" w:sz="4"/>
+              <w:right w:val="single" w:color="C9B3B0" w:sz="4"/>
+            </w:tcBorders>
+            <w:tcMar>
+              <w:top w:type="dxa" w:w="60"/>
+              <w:left w:type="dxa" w:w="90"/>
+              <w:bottom w:type="dxa" w:w="60"/>
+              <w:right w:type="dxa" w:w="90"/>
+            </w:tcMar>
+          </w:tcPr>
+          <w:p>
+            <w:pPr>
+              <w:spacing w:after="0" w:before="0"/>
+            </w:pPr>
+            <w:r>
+              <w:rPr>
+                <w:rFonts w:ascii="Times New Roman" w:cs="Times New Roman" w:eastAsia="Times New Roman" w:hAnsi="Times New Roman"/>
+                <w:b w:val="false"/>
+                <w:bCs w:val="false"/>
+                <w:color w:val="000000"/>
+                <w:sz w:val="18"/>
+                <w:szCs w:val="18"/>
+              </w:rPr>
+              <w:t xml:space="preserve">n/a</w:t>
             </w:r>
           </w:p>
         </w:tc>
@@ -3037,7 +3435,7 @@
           <w:sz w:val="14"/>
           <w:szCs w:val="14"/>
         </w:rPr>
-        <w:t xml:space="preserve">LTC is loan to cost and LTV is loan to value. Ratings are S&amp;P, Moody's, Fitch or KBRA as reported. Saline pricing is guidance and its LTC is derived from the reported 15% equity.</w:t>
+        <w:t xml:space="preserve">LTC is loan to cost and LTV is loan to value. Ratings are S&amp;P, Moody's, Fitch or KBRA as reported, and El Paso shows S&amp;P then Fitch. Saline LTC is derived from the reported 15% equity.</w:t>
       </w:r>
     </w:p>
     <w:p>
@@ -3065,7 +3463,7 @@
           <w:sz w:val="21"/>
           <w:szCs w:val="21"/>
         </w:rPr>
-        <w:t xml:space="preserve">The table shows that pricing tracks the lease counterparty more than the asset. Beacon Point, with a tenant rated AA- or better, priced at T+165 despite 95% leverage, while El Paso, with an A+ rating on Meta's lease, needed T+287.5 nine months after Hyperion priced at T+225. Below investment grade the step is larger, and CoreWeave linked paper now clears near 9.25% even on a secured basis. Hyperscaler corporate bonds are repricing as well. Amazon paid a new issue concession of 10 to 12bps on its $25bn July deal against a 2026 average near 4bps, and Meta's April deal priced its 2066 bonds at T+147 against T+110 for its October 2025 deal, on a book of $96bn versus $125bn. Oracle's $25bn February deal drew a record $129bn book, yet its 10 year priced near T+145 against roughly T+95 for BBB peers. The divergence is between steady demand for the largest tickets and a rising price for every notch of tenant risk.</w:t>
+        <w:t xml:space="preserve">The table shows that the tenant sets the starting point and tenor and timing set the rest. Beacon Point, with a tenant rated AA- or better and bonds that amortize to 2042, priced at T+165 despite 95% leverage. El Paso, with A+ rated notes backed by Meta's lease and a 2048 final maturity, needed T+287.5 nine months after Hyperion, by which time order books for hyperscaler debt had thinned. Below investment grade the step is larger, and CoreWeave linked paper now clears near 9.25% even on a secured basis. Hyperscaler corporate bonds are repricing as well. Amazon paid a new issue concession of 10 to 12bps on its $25bn July deal against a 2026 average near 4bps, and Meta's $25bn April deal drew a $96bn book against $125bn for its October 2025 deal. Oracle's $25bn February deal drew a $129bn book, yet its 10 year priced near T+145 while the US BBB index traded around T+95. The divergence is between steady demand for the largest tickets and a rising price for every notch of tenant risk.</w:t>
       </w:r>
     </w:p>
     <w:p>
@@ -3121,7 +3519,7 @@
           <w:sz w:val="21"/>
           <w:szCs w:val="21"/>
         </w:rPr>
-        <w:t xml:space="preserve">Oracle is the clearest test of what happens when the tenant weakens. S&amp;P cut Oracle to BBB- on July 9, citing OpenAI as about half of its contracted backlog and a projected fiscal 2027 free operating cash flow deficit of about $42bn. Oracle's September 10 results showed remaining performance obligations of $664bn, quarterly capex of $28.5bn against $8.5bn a year earlier, negative free cash flow of $5.4bn, and fiscal 2027 capex guidance of $90bn to $95bn. The strain has reached project debt. The $18bn construction loan on Project Jupiter, a 2.45 gigawatt campus in New Mexico developed by a Blue Owl unit and leased to Oracle, was quoted at 89 to 91 cents as banks struggled to sell it down. On September 24 Oracle sent the developer a force majeure notice after a gas pipeline slipped to February 2027, which could let it defer rent for up to three years. Oracle's long bonds yielded above 8% for the first time.</w:t>
+        <w:t xml:space="preserve">Oracle is the clearest test of what happens when the tenant weakens. S&amp;P cut Oracle to BBB- on July 9, citing OpenAI as about half of its contracted backlog and a projected fiscal 2027 free operating cash flow deficit of about $42bn, and said another downgrade is possible if leverage stays above 4.5x. Oracle's September 10 results showed remaining performance obligations of $664bn, quarterly capex of $28.5bn, and fiscal 2027 capex guidance of $90bn to $95bn. The strain has reached project debt. The $18bn construction loan on Project Jupiter, a 2.45 gigawatt campus in New Mexico developed by a Blue Owl unit and leased to Oracle, was quoted at 89 to 91 cents in September, with syndicate banks holding more of it than planned. On September 24 Oracle sent the developer a force majeure notice after a gas pipeline slipped to February 2027, which could let it defer rent for up to three years. Oracle says the project remains on schedule.</w:t>
       </w:r>
     </w:p>
     <w:tbl>
@@ -3365,7 +3763,7 @@
           <w:sz w:val="21"/>
           <w:szCs w:val="21"/>
         </w:rPr>
-        <w:t xml:space="preserve">Three risks sit beneath the pricing. Duration is the first, since four year initial leases support bonds amortizing over more than 20 years, and CoreWeave's August facility runs about five years against customer contracts averaging about three. Construction is the second, because rent does not begin until a campus is finished, leaving lenders exposed to power, permitting, and local opposition. Concentration is the third, with OpenAI behind about half of Oracle's backlog and OpenAI contracts backing two of CoreWeave's GPU facilities, so one counterparty links bank loans, project bonds, and GPU debt. The key divergence is that structures rated on a strong tenant now carry spreads that price a weaker one.</w:t>
+        <w:t xml:space="preserve">Three risks sit beneath the pricing. Duration is the first, since four year initial leases support bonds amortizing over more than 20 years, and CoreWeave's August facility runs about five years against customer contracts averaging about three. Construction is the second, because rent does not begin until a campus is finished, leaving lenders exposed to power, permitting, and local opposition. Concentration is the third, with OpenAI behind about half of Oracle's backlog and an OpenAI contract backing one of CoreWeave's GPU facilities, so one counterparty links bank loans, project bonds, and GPU debt. The key divergence is that structures rated on a strong tenant now carry spreads that price a weaker one.</w:t>
       </w:r>
     </w:p>
     <w:tbl>
@@ -3428,7 +3826,7 @@
                 <w:sz w:val="21"/>
                 <w:szCs w:val="21"/>
               </w:rPr>
-              <w:t xml:space="preserve">Meta's two joint ventures share one template, a four year initial lease, a capped residual value guarantee covering 16 years, and A+ rated amortizing bonds. Hyperion priced $27.3bn at 6.581%, or T+225, in October 2025. El Paso priced $12.5bn at 7.534%, or T+287.5, in July, with Fitch one notch higher at AA-. By late September Hyperion was trading in the low 90s, near T+230. Holders took a loss of close to ten points on paper whose credit never changed, which shows that long lease backed bonds carry rate and spread risk even when the tenant is strong.</w:t>
+              <w:t xml:space="preserve">Meta's two joint ventures share one template, a four year initial lease, a residual value guarantee covering the first 16 years, and A+ rated amortizing bonds. On Hyperion the guarantee totals about $28bn against $27.3bn of bonds, and rent begins in June 2029. Hyperion priced at 6.581%, or T+225, in October 2025. El Paso priced $12.5bn at 7.534%, or T+287.5, in July, with Fitch one notch higher at AA-. The 62.5bps wider spread on the same tenant shows that investors now price supply, structure, and timing on top of Meta's credit.</w:t>
             </w:r>
           </w:p>
         </w:tc>
@@ -3485,7 +3883,7 @@
                 <w:sz w:val="21"/>
                 <w:szCs w:val="21"/>
               </w:rPr>
-              <w:t xml:space="preserve">CoreWeave borrows across the credit spectrum, and its pricing depends on who pays. Its $8.5bn DDTL 4.0, backed by GPUs serving Meta, is rated A3 by Moody's and priced at SOFR plus 225. DDTL 3.0, tied to OpenAI, priced at SOFR plus 400. The $3.1bn DDTL 5.0 in May priced at SOFR plus 450 with Ba2 and BB+ ratings, and the $2.6bn DDTL 5.5 in August priced at SOFR plus 550 at the same ratings. The company itself is rated B+ by S&amp;P. The 325bps gap between its best and worst secured loans is the market's price for counterparty risk.</w:t>
+              <w:t xml:space="preserve">CoreWeave borrows across the credit spectrum, and its pricing depends on who pays. Its $8.5bn DDTL 4.0, backed by GPUs serving Meta, is rated A3 by Moody's and priced at SOFR plus 225. DDTL 3.0, tied to OpenAI, priced at SOFR plus 400. The $3.1bn DDTL 5.0 in May priced at SOFR plus 450 with Ba2 and BB+ ratings, and the $2.6bn DDTL 5.5 in August priced at SOFR plus 550 at the same ratings. The company itself is rated B+ by S&amp;P. The 325bps gap between its A3 and Ba2 facilities this year mostly prices counterparty risk, though the 100bps move between May and August shows timing matters too.</w:t>
             </w:r>
           </w:p>
         </w:tc>
@@ -4233,7 +4631,7 @@
         </w:numPr>
         <w:spacing w:after="50" w:before="0"/>
       </w:pPr>
-      <w:hyperlink w:history="1" r:id="rIdft63fug6yzexrdiqbwd8c">
+      <w:hyperlink w:history="1" r:id="rIdj7xvquc0tdat-8lf2uusl">
         <w:r>
           <w:rPr>
             <w:rFonts w:ascii="Times New Roman" w:cs="Times New Roman" w:eastAsia="Times New Roman" w:hAnsi="Times New Roman"/>
@@ -4255,7 +4653,7 @@
         </w:numPr>
         <w:spacing w:after="50" w:before="0"/>
       </w:pPr>
-      <w:hyperlink w:history="1" r:id="rIdd7fixqjo9frafbnk_wnvi">
+      <w:hyperlink w:history="1" r:id="rId8s-3p1eyvheegdmj-yjts">
         <w:r>
           <w:rPr>
             <w:rFonts w:ascii="Times New Roman" w:cs="Times New Roman" w:eastAsia="Times New Roman" w:hAnsi="Times New Roman"/>
@@ -4277,7 +4675,7 @@
         </w:numPr>
         <w:spacing w:after="50" w:before="0"/>
       </w:pPr>
-      <w:hyperlink w:history="1" r:id="rIdhhjoltxivuk9_a2q08xqt">
+      <w:hyperlink w:history="1" r:id="rId3hytzsn1c8nvusx5gq-ia">
         <w:r>
           <w:rPr>
             <w:rFonts w:ascii="Times New Roman" w:cs="Times New Roman" w:eastAsia="Times New Roman" w:hAnsi="Times New Roman"/>
@@ -4299,7 +4697,7 @@
         </w:numPr>
         <w:spacing w:after="50" w:before="0"/>
       </w:pPr>
-      <w:hyperlink w:history="1" r:id="rIdfeicod6yfdvrgexnea1w_">
+      <w:hyperlink w:history="1" r:id="rIdwx8ceg7est19_hpscmijv">
         <w:r>
           <w:rPr>
             <w:rFonts w:ascii="Times New Roman" w:cs="Times New Roman" w:eastAsia="Times New Roman" w:hAnsi="Times New Roman"/>
@@ -4321,7 +4719,7 @@
         </w:numPr>
         <w:spacing w:after="50" w:before="0"/>
       </w:pPr>
-      <w:hyperlink w:history="1" r:id="rIdnixdluh1dqb6884qdwku6">
+      <w:hyperlink w:history="1" r:id="rIddf_tvzrum0xsxbxpjyvnn">
         <w:r>
           <w:rPr>
             <w:rFonts w:ascii="Times New Roman" w:cs="Times New Roman" w:eastAsia="Times New Roman" w:hAnsi="Times New Roman"/>
@@ -4343,7 +4741,7 @@
         </w:numPr>
         <w:spacing w:after="50" w:before="0"/>
       </w:pPr>
-      <w:hyperlink w:history="1" r:id="rIdn2igqu9uggb-4srcc4wuv">
+      <w:hyperlink w:history="1" r:id="rIdsalboc4kyphgos2ept6vv">
         <w:r>
           <w:rPr>
             <w:rFonts w:ascii="Times New Roman" w:cs="Times New Roman" w:eastAsia="Times New Roman" w:hAnsi="Times New Roman"/>
@@ -4952,7 +5350,7 @@
         </w:numPr>
         <w:spacing w:after="50" w:before="0"/>
       </w:pPr>
-      <w:hyperlink w:history="1" r:id="rIdarnqyz01bs626p3zv_iup">
+      <w:hyperlink w:history="1" r:id="rIddusc2n2txrnko1_3pzuq2">
         <w:r>
           <w:rPr>
             <w:rFonts w:ascii="Times New Roman" w:cs="Times New Roman" w:eastAsia="Times New Roman" w:hAnsi="Times New Roman"/>
@@ -4974,7 +5372,7 @@
         </w:numPr>
         <w:spacing w:after="50" w:before="0"/>
       </w:pPr>
-      <w:hyperlink w:history="1" r:id="rIdrc9ceqbgha5m_ltqe-m0s">
+      <w:hyperlink w:history="1" r:id="rIdxdjwgqannqna2gfkvvnmj">
         <w:r>
           <w:rPr>
             <w:rFonts w:ascii="Times New Roman" w:cs="Times New Roman" w:eastAsia="Times New Roman" w:hAnsi="Times New Roman"/>
@@ -5583,7 +5981,7 @@
         </w:numPr>
         <w:spacing w:after="50" w:before="0"/>
       </w:pPr>
-      <w:hyperlink w:history="1" r:id="rIdzu7v7xml6lrjcwlvkktw2">
+      <w:hyperlink w:history="1" r:id="rIddegpbozb8vvzi7ocm2i0q">
         <w:r>
           <w:rPr>
             <w:rFonts w:ascii="Times New Roman" w:cs="Times New Roman" w:eastAsia="Times New Roman" w:hAnsi="Times New Roman"/>
@@ -5605,7 +6003,7 @@
         </w:numPr>
         <w:spacing w:after="50" w:before="0"/>
       </w:pPr>
-      <w:hyperlink w:history="1" r:id="rIdaaxvdskcalhbclfw_qxz-">
+      <w:hyperlink w:history="1" r:id="rId0xlezxcw4szfy2absj3zd">
         <w:r>
           <w:rPr>
             <w:rFonts w:ascii="Times New Roman" w:cs="Times New Roman" w:eastAsia="Times New Roman" w:hAnsi="Times New Roman"/>
@@ -5627,7 +6025,7 @@
         </w:numPr>
         <w:spacing w:after="50" w:before="0"/>
       </w:pPr>
-      <w:hyperlink w:history="1" r:id="rId9pbmc8bgwrwaprdcmtefp">
+      <w:hyperlink w:history="1" r:id="rIdcgh3miwtnmkaubu0q9-cv">
         <w:r>
           <w:rPr>
             <w:rFonts w:ascii="Times New Roman" w:cs="Times New Roman" w:eastAsia="Times New Roman" w:hAnsi="Times New Roman"/>
@@ -5649,7 +6047,7 @@
         </w:numPr>
         <w:spacing w:after="50" w:before="0"/>
       </w:pPr>
-      <w:hyperlink w:history="1" r:id="rIdrs3vx5ikqhz7xvjc8crp-">
+      <w:hyperlink w:history="1" r:id="rIdlqqzimf3-srg5nhpqasgr">
         <w:r>
           <w:rPr>
             <w:rFonts w:ascii="Times New Roman" w:cs="Times New Roman" w:eastAsia="Times New Roman" w:hAnsi="Times New Roman"/>
@@ -6362,7 +6760,7 @@
         </w:numPr>
         <w:spacing w:after="50" w:before="0"/>
       </w:pPr>
-      <w:hyperlink w:history="1" r:id="rIdrs5dycmoy10fobigu-qkp">
+      <w:hyperlink w:history="1" r:id="rIdjg6xkp09gliwx9kr1rmcx">
         <w:r>
           <w:rPr>
             <w:rFonts w:ascii="Times New Roman" w:cs="Times New Roman" w:eastAsia="Times New Roman" w:hAnsi="Times New Roman"/>
@@ -6384,7 +6782,7 @@
         </w:numPr>
         <w:spacing w:after="50" w:before="0"/>
       </w:pPr>
-      <w:hyperlink w:history="1" r:id="rIdb7_eppeynnl5wxjzu7vwl">
+      <w:hyperlink w:history="1" r:id="rIdgfxrke3a9apa5ayyqohin">
         <w:r>
           <w:rPr>
             <w:rFonts w:ascii="Times New Roman" w:cs="Times New Roman" w:eastAsia="Times New Roman" w:hAnsi="Times New Roman"/>
@@ -6406,7 +6804,7 @@
         </w:numPr>
         <w:spacing w:after="50" w:before="0"/>
       </w:pPr>
-      <w:hyperlink w:history="1" r:id="rIded7depl2xocu08ycmnqod">
+      <w:hyperlink w:history="1" r:id="rIdexbuoemp50tvnd3wkax6y">
         <w:r>
           <w:rPr>
             <w:rFonts w:ascii="Times New Roman" w:cs="Times New Roman" w:eastAsia="Times New Roman" w:hAnsi="Times New Roman"/>
@@ -6428,7 +6826,7 @@
         </w:numPr>
         <w:spacing w:after="50" w:before="0"/>
       </w:pPr>
-      <w:hyperlink w:history="1" r:id="rIdoocotupskv2w2cf_tjzar">
+      <w:hyperlink w:history="1" r:id="rId2uj2f4m_k98ceupxeij-9">
         <w:r>
           <w:rPr>
             <w:rFonts w:ascii="Times New Roman" w:cs="Times New Roman" w:eastAsia="Times New Roman" w:hAnsi="Times New Roman"/>
@@ -6450,7 +6848,7 @@
         </w:numPr>
         <w:spacing w:after="50" w:before="0"/>
       </w:pPr>
-      <w:hyperlink w:history="1" r:id="rIdqr-fwodacjhscuwgktgcc">
+      <w:hyperlink w:history="1" r:id="rIdimojwomusd-o_4xqj0h_j">
         <w:r>
           <w:rPr>
             <w:rFonts w:ascii="Times New Roman" w:cs="Times New Roman" w:eastAsia="Times New Roman" w:hAnsi="Times New Roman"/>
@@ -7267,7 +7665,7 @@
         </w:numPr>
         <w:spacing w:after="50" w:before="0"/>
       </w:pPr>
-      <w:hyperlink w:history="1" r:id="rId5ft639ouzq76atus6iq08">
+      <w:hyperlink w:history="1" r:id="rIdgp5q-gkayhruyg68lg9eu">
         <w:r>
           <w:rPr>
             <w:rFonts w:ascii="Times New Roman" w:cs="Times New Roman" w:eastAsia="Times New Roman" w:hAnsi="Times New Roman"/>
@@ -7289,7 +7687,7 @@
         </w:numPr>
         <w:spacing w:after="50" w:before="0"/>
       </w:pPr>
-      <w:hyperlink w:history="1" r:id="rIdckcbsfdy29svdrg3muoy-">
+      <w:hyperlink w:history="1" r:id="rIdf3zclwvmtafhwxbwj1our">
         <w:r>
           <w:rPr>
             <w:rFonts w:ascii="Times New Roman" w:cs="Times New Roman" w:eastAsia="Times New Roman" w:hAnsi="Times New Roman"/>
@@ -7311,7 +7709,7 @@
         </w:numPr>
         <w:spacing w:after="50" w:before="0"/>
       </w:pPr>
-      <w:hyperlink w:history="1" r:id="rIdxnuez0vjrnfifvhkpkjl6">
+      <w:hyperlink w:history="1" r:id="rIdgg2amiyyitqqv0yamlkdx">
         <w:r>
           <w:rPr>
             <w:rFonts w:ascii="Times New Roman" w:cs="Times New Roman" w:eastAsia="Times New Roman" w:hAnsi="Times New Roman"/>
@@ -7712,7 +8110,7 @@
         </w:numPr>
         <w:spacing w:after="50" w:before="0"/>
       </w:pPr>
-      <w:hyperlink w:history="1" r:id="rIdq-vnxqptc3xn0kdurgc7h">
+      <w:hyperlink w:history="1" r:id="rIdviiy-ufxcvl9qtmx9n8nn">
         <w:r>
           <w:rPr>
             <w:rFonts w:ascii="Times New Roman" w:cs="Times New Roman" w:eastAsia="Times New Roman" w:hAnsi="Times New Roman"/>
@@ -7734,7 +8132,7 @@
         </w:numPr>
         <w:spacing w:after="50" w:before="0"/>
       </w:pPr>
-      <w:hyperlink w:history="1" r:id="rIdflo4lgsz3hkucvyiimtr5">
+      <w:hyperlink w:history="1" r:id="rIdlfjtdiizotnsu3sxhme1j">
         <w:r>
           <w:rPr>
             <w:rFonts w:ascii="Times New Roman" w:cs="Times New Roman" w:eastAsia="Times New Roman" w:hAnsi="Times New Roman"/>

</xml_diff>

<commit_message>
Committee v2 round 2: apply style redlines and rebuild
Co-Authored-By: Claude Opus 5.5 <noreply@anthropic.com>
Claude-Session: https://claude.ai/code/session_011SJZihQQoizcK7ApWgRNEa
</commit_message>
<xml_diff>
--- a/outputs/LLC_AI_Infrastructure_Case_Study.docx
+++ b/outputs/LLC_AI_Infrastructure_Case_Study.docx
@@ -214,7 +214,7 @@
           <w:sz w:val="21"/>
           <w:szCs w:val="21"/>
         </w:rPr>
-        <w:t xml:space="preserve">AI infrastructure financing is the debt raised to build data centers and the computing equipment inside them, and in 2026 it has become one of the largest sources of new supply in credit. Lenders reach the same assets through five routes. Hyperscalers borrow directly in the investment grade market. Joint ventures issue project bonds secured by a lease to a hyperscaler, as with Meta's $27.3bn Hyperion financing, where Blue Owl owns 80% of the vehicle and the A+ rated bonds amortize to 2049. Developers take construction loans against leases to Oracle and OpenAI. Neoclouds such as CoreWeave borrow against GPUs and the customer contracts that pay for them. Stabilized campuses are refinanced through data center ABS and CMBS. In every route the lender is underwriting the tenant, and agencies start from the tenant's rating and subtract notches for construction, lease length, and operator risk.</w:t>
+        <w:t xml:space="preserve">AI infrastructure financing is the debt raised to build data centers and the computing equipment inside them, and in 2026 it has become one of the largest sources of new supply in credit. Lenders reach the same assets through five routes. Hyperscalers borrow directly in the investment grade market on their corporate ratings. Joint ventures issue project bonds secured by a lease to a hyperscaler, as with Meta's $27.3bn Hyperion financing, where Blue Owl owns 80% of the vehicle and the A+ rated bonds amortize to 2049. Developers take construction loans against leases to Oracle and OpenAI, before any rent is paid. Neoclouds such as CoreWeave borrow against GPUs and the customer contracts that pay for them. Stabilized campuses are refinanced through data center ABS and CMBS once rent is flowing. In every route the lender is underwriting the tenant, and agencies start from the tenant's rating and subtract notches for construction, lease length, and operator risk.</w:t>
       </w:r>
     </w:p>
     <w:p>
@@ -242,7 +242,7 @@
           <w:sz w:val="21"/>
           <w:szCs w:val="21"/>
         </w:rPr>
-        <w:t xml:space="preserve">Lease backed debt is sized so that contracted rent covers debt service with a thin cushion and the bonds amortize before the lease and its renewals run out, so leverage rises with the strength of the tenant. Hut 8's $4.25bn Beacon Point bonds, backed by a tenant rated AA- or better, financed 95% of project cost at T+165, which Hut 8 calls the highest loan to cost for an HPC data center bond. Oracle's Saline Township campus in Michigan raised about $14bn of bonds against $16.3bn of cost, leaving roughly 15% equity. Stabilized campuses are sized on appraised value, and Aligned's ABS master trust, which added $1.18bn in July, caps its senior notes at 70% of appraised value. GPU lenders lend less because the collateral depreciates, and Apollo's $3.5bn for the vehicle that leases chips to xAI equals about 65% of a $5.4bn purchase. Agencies stress all of these. KBRA cut the cash flow on the single tenant Ohio campus behind BX 2026 VLT10 to 18.9% below the issuer's figure and its value to 27.2% below appraisal, lifting leverage on the $1.26bn loan to 108.4%.</w:t>
+        <w:t xml:space="preserve">Lease backed debt is sized so contracted rent covers debt service with a thin cushion and bonds amortize before the lease and its renewals run out, so leverage rises with tenant strength. Hut 8's $4.25bn Beacon Point bonds, backed by a tenant rated AA- or better, financed 95% of project cost at T+165, which Hut 8 calls the highest loan to cost for an HPC data center bond. Oracle's Saline Township campus in Michigan raised about $14bn of bonds against $16.3bn of cost, or roughly 15% equity. Stabilized campuses are sized on value, and Aligned's ABS master trust, which added $1.18bn in July, caps senior notes at 70% of appraised value. GPU lenders lend less against depreciating collateral, and Apollo's $3.5bn for the xAI chip leasing vehicle equals about 65% of a $5.4bn purchase. KBRA cut the cash flow on the single tenant Ohio campus behind BX 2026 VLT10 to 18.9% below the issuer's figure and its value to 27.2% below appraisal, lifting leverage on the $1.26bn loan to 108.4%.</w:t>
       </w:r>
     </w:p>
     <w:p>
@@ -270,7 +270,7 @@
           <w:sz w:val="21"/>
           <w:szCs w:val="21"/>
         </w:rPr>
-        <w:t xml:space="preserve">The debt is only as long as the lease behind it, and hyperscaler leases are short. Hyperion and El Paso both carry four year initial terms against bonds amortizing to 2049 and 2048, and Meta's residual value guarantee on Hyperion, about $28bn and covering the first 16 years, is what bridges the gap. Moody's counted $662bn of hyperscaler data center leases not yet commenced at the end of 2025, held off balance sheet and equal to 113% of their adjusted debt, and says it will treat part of them as debt, while S&amp;P accepted Hyperion as off balance sheet for Meta. The divergence is that one obligation is a lease to one agency and debt to another, and any tenant downgrade passes straight through to the structures built on it.</w:t>
+        <w:t xml:space="preserve">The debt is only as long as the lease behind it, and hyperscaler leases are short. Hyperion and El Paso both carry four year initial terms against bonds amortizing to 2049 and 2048, and Meta's residual value guarantee on Hyperion, about $28bn and covering the first 16 years, bridges the gap. Moody's counted $662bn of hyperscaler data center leases not yet commenced at the end of 2025, held off balance sheet and equal to 113% of their adjusted debt, and says it will treat part as debt, while S&amp;P accepted Hyperion as off balance sheet for Meta. The divergence is that one obligation is a lease to one agency and debt to another, so a tenant downgrade passes straight through.</w:t>
       </w:r>
     </w:p>
     <w:tbl>
@@ -415,7 +415,7 @@
                 <w:sz w:val="18"/>
                 <w:szCs w:val="18"/>
               </w:rPr>
-              <w:t xml:space="preserve">Beacon Point, Saline, Aligned ABS, Abilene, xAI chip vehicle</w:t>
+              <w:t xml:space="preserve">Beacon Point, Saline, Aligned ABS, xAI chip vehicle</w:t>
             </w:r>
           </w:p>
         </w:tc>
@@ -542,7 +542,7 @@
           <w:sz w:val="21"/>
           <w:szCs w:val="21"/>
         </w:rPr>
-        <w:t xml:space="preserve">Investors are still funding the buildout, but they are charging more for it. Apollo estimates that order cover on hyperscaler bonds fell from about five times in February to below two times by July. Meta's El Paso joint venture priced $12.5bn of A+ rated amortizing notes on July 27 at 7.534%, or T+287.5, with orders peaking near $20bn, about 1.6 times the deal, while the average bond sale this year drew close to four times. That was 62.5bps wider than Hyperion's T+225 in October 2025 on the same tenant, rating, and template. On September 23 a Blue Owl affiliated campus in Virginia leased to CoreWeave sold $1.1bn of BB- rated five year notes at 98.5 to yield 9.25%, about 270bps above similarly rated debt. GPU loans show the same split. CoreWeave borrowed at SOFR plus 225 in March on an A3 rated facility backed by its Meta contract, then paid SOFR plus 550 in August on a Ba2 facility, 100bps wider than its May loan at the same ratings.</w:t>
+        <w:t xml:space="preserve">Investors keep funding the buildout but charging more for it. Apollo estimates order cover on hyperscaler bonds fell from about five times in February to below two times by July. Meta's El Paso joint venture priced $12.5bn of A+ rated amortizing notes on July 27 at 7.534%, or T+287.5, with orders peaking near $20bn, about 1.6 times the deal, while the average bond sale this year drew close to four times. That was 62.5bps wider than Hyperion's T+225 in October 2025 on the same tenant, rating, and template. On September 23 a Blue Owl affiliated campus in Virginia leased to CoreWeave sold $1.1bn of BB- rated five year notes at 98.5 to yield 9.25%, about 270bps above similarly rated debt. GPU loans split the same way. CoreWeave borrowed at SOFR plus 225 in March on an A3 rated facility backed by its Meta contract, then paid SOFR plus 550 in August on a Ba2 facility, 100bps wider than its May loan at the same ratings.</w:t>
       </w:r>
     </w:p>
     <w:p>
@@ -1529,7 +1529,7 @@
                 <w:sz w:val="18"/>
                 <w:szCs w:val="18"/>
               </w:rPr>
-              <w:t xml:space="preserve">Meta lease, ~$28bn RVG</w:t>
+              <w:t xml:space="preserve">Lease, ~$28bn RVG</w:t>
             </w:r>
           </w:p>
         </w:tc>
@@ -3463,7 +3463,7 @@
           <w:sz w:val="21"/>
           <w:szCs w:val="21"/>
         </w:rPr>
-        <w:t xml:space="preserve">The table shows that the tenant sets the starting point and tenor and timing set the rest. Beacon Point, with a tenant rated AA- or better and bonds that amortize to 2042, priced at T+165 despite 95% leverage. El Paso, with A+ rated notes backed by Meta's lease and a 2048 final maturity, needed T+287.5 nine months after Hyperion, by which time order books for hyperscaler debt had thinned. Below investment grade the step is larger, and CoreWeave linked paper now clears near 9.25% even on a secured basis. Hyperscaler corporate bonds are repricing as well. Amazon paid a new issue concession of 10 to 12bps on its $25bn July deal against a 2026 average near 4bps, and Meta's $25bn April deal drew a $96bn book against $125bn for its October 2025 deal. Oracle's $25bn February deal drew a $129bn book, yet its 10 year priced near T+145 while the US BBB index traded around T+95. The divergence is between steady demand for the largest tickets and a rising price for every notch of tenant risk.</w:t>
+        <w:t xml:space="preserve">The tenant sets the starting point, and tenor and timing set the rest. Beacon Point, with a tenant rated AA- or better and bonds amortizing to 2042, priced at T+165 despite 95% leverage. El Paso, with A+ rated notes backed by Meta's lease and a 2048 final maturity, needed T+287.5 nine months after Hyperion, as order books thinned. Below investment grade the step is larger, and CoreWeave linked paper clears near 9.25% even on a secured basis. Hyperscaler corporate bonds are repricing as well. Amazon paid a new issue concession of 10 to 12bps on its $25bn July deal against a 2026 average near 4bps, and Meta's $25bn April deal drew a $96bn book against $125bn for its October 2025 deal. Oracle's $25bn February deal drew a $129bn book, yet its 10 year priced near T+145 while the US BBB index traded around T+95. The divergence is between steady demand for the largest tickets and a rising price for every notch of tenant risk.</w:t>
       </w:r>
     </w:p>
     <w:p>
@@ -3519,7 +3519,7 @@
           <w:sz w:val="21"/>
           <w:szCs w:val="21"/>
         </w:rPr>
-        <w:t xml:space="preserve">Oracle is the clearest test of what happens when the tenant weakens. S&amp;P cut Oracle to BBB- on July 9, citing OpenAI as about half of its contracted backlog and a projected fiscal 2027 free operating cash flow deficit of about $42bn, and said another downgrade is possible if leverage stays above 4.5x. Oracle's September 10 results showed remaining performance obligations of $664bn, quarterly capex of $28.5bn, and fiscal 2027 capex guidance of $90bn to $95bn. The strain has reached project debt. The $18bn construction loan on Project Jupiter, a 2.45 gigawatt campus in New Mexico developed by a Blue Owl unit and leased to Oracle, was quoted at 89 to 91 cents in September, with syndicate banks holding more of it than planned. On September 24 Oracle sent the developer a force majeure notice after a gas pipeline slipped to February 2027, which could let it defer rent for up to three years. Oracle says the project remains on schedule.</w:t>
+        <w:t xml:space="preserve">Oracle is the clearest test of what happens when the tenant weakens. S&amp;P cut Oracle to BBB- on July 9, citing OpenAI as about half of its contracted backlog and a projected fiscal 2027 free operating cash flow deficit of about $42bn, and said another downgrade is possible if leverage stays above 4.5x. Oracle's September 10 results showed remaining performance obligations of $664bn, quarterly capex of $28.5bn, and fiscal 2027 capex guidance of $90bn to $95bn. The strain has reached project debt. The $18bn construction loan on Project Jupiter, a 2.45 gigawatt New Mexico campus developed by a Blue Owl unit and leased to Oracle, was quoted at 89 to 91 cents in September, with syndicate banks holding more of it than planned. On September 24 Oracle sent the developer a force majeure notice after a gas pipeline slipped to February 2027, which could let it defer rent for up to three years. Oracle says the project is on schedule.</w:t>
       </w:r>
     </w:p>
     <w:tbl>
@@ -3883,7 +3883,7 @@
                 <w:sz w:val="21"/>
                 <w:szCs w:val="21"/>
               </w:rPr>
-              <w:t xml:space="preserve">CoreWeave borrows across the credit spectrum, and its pricing depends on who pays. Its $8.5bn DDTL 4.0, backed by GPUs serving Meta, is rated A3 by Moody's and priced at SOFR plus 225. DDTL 3.0, tied to OpenAI, priced at SOFR plus 400. The $3.1bn DDTL 5.0 in May priced at SOFR plus 450 with Ba2 and BB+ ratings, and the $2.6bn DDTL 5.5 in August priced at SOFR plus 550 at the same ratings. The company itself is rated B+ by S&amp;P. The 325bps gap between its A3 and Ba2 facilities this year mostly prices counterparty risk, though the 100bps move between May and August shows timing matters too.</w:t>
+              <w:t xml:space="preserve">CoreWeave's pricing depends on who pays. Its $8.5bn DDTL 4.0, backed by GPUs serving Meta, is rated A3 by Moody's and priced at SOFR plus 225. DDTL 3.0, tied to OpenAI, priced at SOFR plus 400. The $3.1bn DDTL 5.0 in May priced at SOFR plus 450 with Ba2 and BB+ ratings, and the $2.6bn DDTL 5.5 in August priced at SOFR plus 550 at the same ratings. The company itself is rated B+ by S&amp;P. The 325bps gap between its A3 and Ba2 facilities mostly prices counterparty risk, though the 100bps move between May and August shows timing matters too.</w:t>
             </w:r>
           </w:p>
         </w:tc>
@@ -4631,7 +4631,7 @@
         </w:numPr>
         <w:spacing w:after="50" w:before="0"/>
       </w:pPr>
-      <w:hyperlink w:history="1" r:id="rIdj7xvquc0tdat-8lf2uusl">
+      <w:hyperlink w:history="1" r:id="rIdg1gk3hq5w97ih8orcxsao">
         <w:r>
           <w:rPr>
             <w:rFonts w:ascii="Times New Roman" w:cs="Times New Roman" w:eastAsia="Times New Roman" w:hAnsi="Times New Roman"/>
@@ -4653,7 +4653,7 @@
         </w:numPr>
         <w:spacing w:after="50" w:before="0"/>
       </w:pPr>
-      <w:hyperlink w:history="1" r:id="rId8s-3p1eyvheegdmj-yjts">
+      <w:hyperlink w:history="1" r:id="rIddyhcnadbvx9pzuopvc0gs">
         <w:r>
           <w:rPr>
             <w:rFonts w:ascii="Times New Roman" w:cs="Times New Roman" w:eastAsia="Times New Roman" w:hAnsi="Times New Roman"/>
@@ -4675,7 +4675,7 @@
         </w:numPr>
         <w:spacing w:after="50" w:before="0"/>
       </w:pPr>
-      <w:hyperlink w:history="1" r:id="rId3hytzsn1c8nvusx5gq-ia">
+      <w:hyperlink w:history="1" r:id="rIdrwunrm-n3bonrwbnt_npq">
         <w:r>
           <w:rPr>
             <w:rFonts w:ascii="Times New Roman" w:cs="Times New Roman" w:eastAsia="Times New Roman" w:hAnsi="Times New Roman"/>
@@ -4697,7 +4697,7 @@
         </w:numPr>
         <w:spacing w:after="50" w:before="0"/>
       </w:pPr>
-      <w:hyperlink w:history="1" r:id="rIdwx8ceg7est19_hpscmijv">
+      <w:hyperlink w:history="1" r:id="rIdhdrzdlkzryfx5rnkasw4v">
         <w:r>
           <w:rPr>
             <w:rFonts w:ascii="Times New Roman" w:cs="Times New Roman" w:eastAsia="Times New Roman" w:hAnsi="Times New Roman"/>
@@ -4719,7 +4719,7 @@
         </w:numPr>
         <w:spacing w:after="50" w:before="0"/>
       </w:pPr>
-      <w:hyperlink w:history="1" r:id="rIddf_tvzrum0xsxbxpjyvnn">
+      <w:hyperlink w:history="1" r:id="rIda_zi2ntpteldpptknmprg">
         <w:r>
           <w:rPr>
             <w:rFonts w:ascii="Times New Roman" w:cs="Times New Roman" w:eastAsia="Times New Roman" w:hAnsi="Times New Roman"/>
@@ -4741,7 +4741,7 @@
         </w:numPr>
         <w:spacing w:after="50" w:before="0"/>
       </w:pPr>
-      <w:hyperlink w:history="1" r:id="rIdsalboc4kyphgos2ept6vv">
+      <w:hyperlink w:history="1" r:id="rId_cdfgvhvfpq8leasabbm5">
         <w:r>
           <w:rPr>
             <w:rFonts w:ascii="Times New Roman" w:cs="Times New Roman" w:eastAsia="Times New Roman" w:hAnsi="Times New Roman"/>
@@ -5350,7 +5350,7 @@
         </w:numPr>
         <w:spacing w:after="50" w:before="0"/>
       </w:pPr>
-      <w:hyperlink w:history="1" r:id="rIddusc2n2txrnko1_3pzuq2">
+      <w:hyperlink w:history="1" r:id="rIdyd6rqtfx-yjsiycclbmvh">
         <w:r>
           <w:rPr>
             <w:rFonts w:ascii="Times New Roman" w:cs="Times New Roman" w:eastAsia="Times New Roman" w:hAnsi="Times New Roman"/>
@@ -5372,7 +5372,7 @@
         </w:numPr>
         <w:spacing w:after="50" w:before="0"/>
       </w:pPr>
-      <w:hyperlink w:history="1" r:id="rIdxdjwgqannqna2gfkvvnmj">
+      <w:hyperlink w:history="1" r:id="rIdjmfbp9qexjao3ksbxqxbv">
         <w:r>
           <w:rPr>
             <w:rFonts w:ascii="Times New Roman" w:cs="Times New Roman" w:eastAsia="Times New Roman" w:hAnsi="Times New Roman"/>
@@ -5981,7 +5981,7 @@
         </w:numPr>
         <w:spacing w:after="50" w:before="0"/>
       </w:pPr>
-      <w:hyperlink w:history="1" r:id="rIddegpbozb8vvzi7ocm2i0q">
+      <w:hyperlink w:history="1" r:id="rIdp3iq_4qu_o4etcupb0qzw">
         <w:r>
           <w:rPr>
             <w:rFonts w:ascii="Times New Roman" w:cs="Times New Roman" w:eastAsia="Times New Roman" w:hAnsi="Times New Roman"/>
@@ -6003,7 +6003,7 @@
         </w:numPr>
         <w:spacing w:after="50" w:before="0"/>
       </w:pPr>
-      <w:hyperlink w:history="1" r:id="rId0xlezxcw4szfy2absj3zd">
+      <w:hyperlink w:history="1" r:id="rIdaoeirqyz8etgn_w6z_rwe">
         <w:r>
           <w:rPr>
             <w:rFonts w:ascii="Times New Roman" w:cs="Times New Roman" w:eastAsia="Times New Roman" w:hAnsi="Times New Roman"/>
@@ -6025,7 +6025,7 @@
         </w:numPr>
         <w:spacing w:after="50" w:before="0"/>
       </w:pPr>
-      <w:hyperlink w:history="1" r:id="rIdcgh3miwtnmkaubu0q9-cv">
+      <w:hyperlink w:history="1" r:id="rIdd0rrcvsuja8xwnqpk51hg">
         <w:r>
           <w:rPr>
             <w:rFonts w:ascii="Times New Roman" w:cs="Times New Roman" w:eastAsia="Times New Roman" w:hAnsi="Times New Roman"/>
@@ -6047,7 +6047,7 @@
         </w:numPr>
         <w:spacing w:after="50" w:before="0"/>
       </w:pPr>
-      <w:hyperlink w:history="1" r:id="rIdlqqzimf3-srg5nhpqasgr">
+      <w:hyperlink w:history="1" r:id="rIdeujfz0sbi9foqfsfspqmy">
         <w:r>
           <w:rPr>
             <w:rFonts w:ascii="Times New Roman" w:cs="Times New Roman" w:eastAsia="Times New Roman" w:hAnsi="Times New Roman"/>
@@ -6760,7 +6760,7 @@
         </w:numPr>
         <w:spacing w:after="50" w:before="0"/>
       </w:pPr>
-      <w:hyperlink w:history="1" r:id="rIdjg6xkp09gliwx9kr1rmcx">
+      <w:hyperlink w:history="1" r:id="rId0yj9g45-nysqmbuhah7zv">
         <w:r>
           <w:rPr>
             <w:rFonts w:ascii="Times New Roman" w:cs="Times New Roman" w:eastAsia="Times New Roman" w:hAnsi="Times New Roman"/>
@@ -6782,7 +6782,7 @@
         </w:numPr>
         <w:spacing w:after="50" w:before="0"/>
       </w:pPr>
-      <w:hyperlink w:history="1" r:id="rIdgfxrke3a9apa5ayyqohin">
+      <w:hyperlink w:history="1" r:id="rIdtsgyddhozw3pt-pvom-ig">
         <w:r>
           <w:rPr>
             <w:rFonts w:ascii="Times New Roman" w:cs="Times New Roman" w:eastAsia="Times New Roman" w:hAnsi="Times New Roman"/>
@@ -6804,7 +6804,7 @@
         </w:numPr>
         <w:spacing w:after="50" w:before="0"/>
       </w:pPr>
-      <w:hyperlink w:history="1" r:id="rIdexbuoemp50tvnd3wkax6y">
+      <w:hyperlink w:history="1" r:id="rIdduqw6prxr3nruykky_61h">
         <w:r>
           <w:rPr>
             <w:rFonts w:ascii="Times New Roman" w:cs="Times New Roman" w:eastAsia="Times New Roman" w:hAnsi="Times New Roman"/>
@@ -6826,7 +6826,7 @@
         </w:numPr>
         <w:spacing w:after="50" w:before="0"/>
       </w:pPr>
-      <w:hyperlink w:history="1" r:id="rId2uj2f4m_k98ceupxeij-9">
+      <w:hyperlink w:history="1" r:id="rIdajtiscvt3pg0j2loxmfns">
         <w:r>
           <w:rPr>
             <w:rFonts w:ascii="Times New Roman" w:cs="Times New Roman" w:eastAsia="Times New Roman" w:hAnsi="Times New Roman"/>
@@ -6848,7 +6848,7 @@
         </w:numPr>
         <w:spacing w:after="50" w:before="0"/>
       </w:pPr>
-      <w:hyperlink w:history="1" r:id="rIdimojwomusd-o_4xqj0h_j">
+      <w:hyperlink w:history="1" r:id="rIdyk-579bo01aetdlqrpee1">
         <w:r>
           <w:rPr>
             <w:rFonts w:ascii="Times New Roman" w:cs="Times New Roman" w:eastAsia="Times New Roman" w:hAnsi="Times New Roman"/>
@@ -7665,7 +7665,7 @@
         </w:numPr>
         <w:spacing w:after="50" w:before="0"/>
       </w:pPr>
-      <w:hyperlink w:history="1" r:id="rIdgp5q-gkayhruyg68lg9eu">
+      <w:hyperlink w:history="1" r:id="rIdmiduhxulcpulxbl2zkuh_">
         <w:r>
           <w:rPr>
             <w:rFonts w:ascii="Times New Roman" w:cs="Times New Roman" w:eastAsia="Times New Roman" w:hAnsi="Times New Roman"/>
@@ -7687,7 +7687,7 @@
         </w:numPr>
         <w:spacing w:after="50" w:before="0"/>
       </w:pPr>
-      <w:hyperlink w:history="1" r:id="rIdf3zclwvmtafhwxbwj1our">
+      <w:hyperlink w:history="1" r:id="rIdmff0sxm8lj9urtcli1nsz">
         <w:r>
           <w:rPr>
             <w:rFonts w:ascii="Times New Roman" w:cs="Times New Roman" w:eastAsia="Times New Roman" w:hAnsi="Times New Roman"/>
@@ -7709,7 +7709,7 @@
         </w:numPr>
         <w:spacing w:after="50" w:before="0"/>
       </w:pPr>
-      <w:hyperlink w:history="1" r:id="rIdgg2amiyyitqqv0yamlkdx">
+      <w:hyperlink w:history="1" r:id="rId67cxiah_laquyjuht99pd">
         <w:r>
           <w:rPr>
             <w:rFonts w:ascii="Times New Roman" w:cs="Times New Roman" w:eastAsia="Times New Roman" w:hAnsi="Times New Roman"/>
@@ -8110,7 +8110,7 @@
         </w:numPr>
         <w:spacing w:after="50" w:before="0"/>
       </w:pPr>
-      <w:hyperlink w:history="1" r:id="rIdviiy-ufxcvl9qtmx9n8nn">
+      <w:hyperlink w:history="1" r:id="rIdbpimxjhfxf2c2fvxfx6fa">
         <w:r>
           <w:rPr>
             <w:rFonts w:ascii="Times New Roman" w:cs="Times New Roman" w:eastAsia="Times New Roman" w:hAnsi="Times New Roman"/>
@@ -8132,7 +8132,7 @@
         </w:numPr>
         <w:spacing w:after="50" w:before="0"/>
       </w:pPr>
-      <w:hyperlink w:history="1" r:id="rIdlfjtdiizotnsu3sxhme1j">
+      <w:hyperlink w:history="1" r:id="rIdvzkztwpe4yrg6mqlvbr2v">
         <w:r>
           <w:rPr>
             <w:rFonts w:ascii="Times New Roman" w:cs="Times New Roman" w:eastAsia="Times New Roman" w:hAnsi="Times New Roman"/>

</xml_diff>

<commit_message>
Committee v2 final: 2 rounds complete on the three page rewrite
Round count: 2 (round 1 fact check, skeptic and continuity with chair
merge; round 2 style, charts, build, layout QA; fact checker rerun with
final fixes). Charts A and C verified; B and D held pending sources.

Co-Authored-By: Claude Opus 5.5 <noreply@anthropic.com>
Claude-Session: https://claude.ai/code/session_011SJZihQQoizcK7ApWgRNEa
</commit_message>
<xml_diff>
--- a/outputs/LLC_AI_Infrastructure_Case_Study.docx
+++ b/outputs/LLC_AI_Infrastructure_Case_Study.docx
@@ -242,7 +242,7 @@
           <w:sz w:val="21"/>
           <w:szCs w:val="21"/>
         </w:rPr>
-        <w:t xml:space="preserve">Lease backed debt is sized so contracted rent covers debt service with a thin cushion and bonds amortize before the lease and its renewals run out, so leverage rises with tenant strength. Hut 8's $4.25bn Beacon Point bonds, backed by a tenant rated AA- or better, financed 95% of project cost at T+165, which Hut 8 calls the highest loan to cost for an HPC data center bond. Oracle's Saline Township campus in Michigan raised about $14bn of bonds against $16.3bn of cost, or roughly 15% equity. Stabilized campuses are sized on value, and Aligned's ABS master trust, which added $1.18bn in July, caps senior notes at 70% of appraised value. GPU lenders lend less against depreciating collateral, and Apollo's $3.5bn for the xAI chip leasing vehicle equals about 65% of a $5.4bn purchase. KBRA cut the cash flow on the single tenant Ohio campus behind BX 2026 VLT10 to 18.9% below the issuer's figure and its value to 27.2% below appraisal, lifting leverage on the $1.26bn loan to 108.4%.</w:t>
+        <w:t xml:space="preserve">Lease backed debt is sized so contracted rent covers debt service and bonds amortize before the lease and its renewals run out, so leverage rises with tenant strength. Hut 8's $4.25bn Beacon Point bonds, backed by a tenant rated AA- or better, financed 95% of project cost at T+165, which Hut 8 calls the highest loan to cost for an HPC data center bond. Oracle's Saline Township campus raised about $14bn of bonds against $16.3bn of cost, or roughly 15% equity. Stabilized campuses are sized on value, and S&amp;P has put senior notes in Aligned's ABS master trust, which added $1.18bn in July, at about 70% of appraised value in past series. GPU lenders lend less against depreciating collateral, and Apollo's $3.5bn for the xAI chip leasing vehicle equals about 65% of a $5.4bn purchase. KBRA cut the cash flow on the single tenant campus behind BX 2026 VLT10 to 18.9% below the issuer's figure and its value to 27.2% below appraisal, lifting leverage on the $1.26bn loan to 108.4%.</w:t>
       </w:r>
     </w:p>
     <w:p>
@@ -270,7 +270,7 @@
           <w:sz w:val="21"/>
           <w:szCs w:val="21"/>
         </w:rPr>
-        <w:t xml:space="preserve">The debt is only as long as the lease behind it, and hyperscaler leases are short. Hyperion and El Paso both carry four year initial terms against bonds amortizing to 2049 and 2048, and Meta's residual value guarantee on Hyperion, about $28bn and covering the first 16 years, bridges the gap. Moody's counted $662bn of hyperscaler data center leases not yet commenced at the end of 2025, held off balance sheet and equal to 113% of their adjusted debt, and says it will treat part as debt, while S&amp;P accepted Hyperion as off balance sheet for Meta. The divergence is that one obligation is a lease to one agency and debt to another, so a tenant downgrade passes straight through.</w:t>
+        <w:t xml:space="preserve">The debt is only as long as the lease behind it, and hyperscaler leases are short. Hyperion and El Paso carry four year initial terms against bonds amortizing to 2049 and 2048, and Meta's residual value guarantee on Hyperion, capped at about $28bn and covering the first 16 years, bridges most of the gap. Moody's counted $662bn of hyperscaler data center leases not yet commenced at end 2025, held off balance sheet and equal to 113% of their adjusted debt, and says it will treat part as debt, while S&amp;P accepted Hyperion as off balance sheet for Meta. The divergence is that one obligation is a lease to one agency and debt to another, so a tenant downgrade passes through.</w:t>
       </w:r>
     </w:p>
     <w:tbl>
@@ -2237,7 +2237,7 @@
                 <w:sz w:val="18"/>
                 <w:szCs w:val="18"/>
               </w:rPr>
-              <w:t xml:space="preserve">70% LTV cap</w:t>
+              <w:t xml:space="preserve">~70% LTV (past series)</w:t>
             </w:r>
           </w:p>
         </w:tc>
@@ -3435,7 +3435,7 @@
           <w:sz w:val="14"/>
           <w:szCs w:val="14"/>
         </w:rPr>
-        <w:t xml:space="preserve">LTC is loan to cost and LTV is loan to value. Ratings are S&amp;P, Moody's, Fitch or KBRA as reported, and El Paso shows S&amp;P then Fitch. Saline LTC is derived from the reported 15% equity.</w:t>
+        <w:t xml:space="preserve">LTC is loan to cost and LTV is loan to value. Ratings are S&amp;P, Moody's, Fitch or KBRA as reported, and El Paso shows S&amp;P then Fitch. Saline LTC is derived from $14bn of bonds against $16.3bn of cost.</w:t>
       </w:r>
     </w:p>
     <w:p>
@@ -3463,7 +3463,7 @@
           <w:sz w:val="21"/>
           <w:szCs w:val="21"/>
         </w:rPr>
-        <w:t xml:space="preserve">The tenant sets the starting point, and tenor and timing set the rest. Beacon Point, with a tenant rated AA- or better and bonds amortizing to 2042, priced at T+165 despite 95% leverage. El Paso, with A+ rated notes backed by Meta's lease and a 2048 final maturity, needed T+287.5 nine months after Hyperion, as order books thinned. Below investment grade the step is larger, and CoreWeave linked paper clears near 9.25% even on a secured basis. Hyperscaler corporate bonds are repricing as well. Amazon paid a new issue concession of 10 to 12bps on its $25bn July deal against a 2026 average near 4bps, and Meta's $25bn April deal drew a $96bn book against $125bn for its October 2025 deal. Oracle's $25bn February deal drew a $129bn book, yet its 10 year priced near T+145 while the US BBB index traded around T+95. The divergence is between steady demand for the largest tickets and a rising price for every notch of tenant risk.</w:t>
+        <w:t xml:space="preserve">The tenant sets the starting point, and tenor and timing set the rest. Beacon Point, with a tenant rated AA- or better and bonds amortizing to 2042, priced at T+165 despite 95% leverage. El Paso, with A+ rated notes backed by Meta's lease and a 2048 final maturity, needed T+287.5 nine months after Hyperion, as order books thinned. Below investment grade the step is larger, and CoreWeave linked paper clears near 9.25% even when secured. Among corporates, Amazon paid a new issue concession of 10 to 12bps on its $25bn July deal against a 2026 average near 4bps, and Meta's $25bn April deal drew a $96bn book against $125bn for its October 2025 deal. Oracle's $25bn February deal drew a $129bn book, yet its 10 year priced near T+145 while TwentyFour Asset Management put the US BBB index near T+95. The divergence is between steady demand for the largest tickets and a rising price for every notch of tenant risk.</w:t>
       </w:r>
     </w:p>
     <w:p>
@@ -3826,7 +3826,7 @@
                 <w:sz w:val="21"/>
                 <w:szCs w:val="21"/>
               </w:rPr>
-              <w:t xml:space="preserve">Meta's two joint ventures share one template, a four year initial lease, a residual value guarantee covering the first 16 years, and A+ rated amortizing bonds. On Hyperion the guarantee totals about $28bn against $27.3bn of bonds, and rent begins in June 2029. Hyperion priced at 6.581%, or T+225, in October 2025. El Paso priced $12.5bn at 7.534%, or T+287.5, in July, with Fitch one notch higher at AA-. The 62.5bps wider spread on the same tenant shows that investors now price supply, structure, and timing on top of Meta's credit.</w:t>
+              <w:t xml:space="preserve">Meta's two joint ventures share one template, a four year initial lease, a residual value guarantee covering the first 16 years, and A+ rated amortizing bonds. On Hyperion the guarantee totals about $28bn against $27.3bn of bonds, and rent begins in 2029. Hyperion priced at 6.581%, or T+225, in October 2025. El Paso priced $12.5bn at 7.534%, or T+287.5, in July, with Fitch one notch higher at AA-. The 62.5bps wider spread on the same tenant suggests that investors now price supply and timing on top of Meta's credit.</w:t>
             </w:r>
           </w:p>
         </w:tc>
@@ -3883,7 +3883,7 @@
                 <w:sz w:val="21"/>
                 <w:szCs w:val="21"/>
               </w:rPr>
-              <w:t xml:space="preserve">CoreWeave's pricing depends on who pays. Its $8.5bn DDTL 4.0, backed by GPUs serving Meta, is rated A3 by Moody's and priced at SOFR plus 225. DDTL 3.0, tied to OpenAI, priced at SOFR plus 400. The $3.1bn DDTL 5.0 in May priced at SOFR plus 450 with Ba2 and BB+ ratings, and the $2.6bn DDTL 5.5 in August priced at SOFR plus 550 at the same ratings. The company itself is rated B+ by S&amp;P. The 325bps gap between its A3 and Ba2 facilities mostly prices counterparty risk, though the 100bps move between May and August shows timing matters too.</w:t>
+              <w:t xml:space="preserve">CoreWeave's pricing depends on who pays. Its $8.5bn DDTL 4.0, backed by GPUs serving Meta, is rated A3 by Moody's and priced at SOFR plus 225. DDTL 3.0, tied to OpenAI, priced at SOFR plus 400. The $3.1bn DDTL 5.0 in May priced at SOFR plus 450 with Ba2 and BB+ ratings, and the $2.6bn DDTL 5.5 in August priced at SOFR plus 550 at the same ratings. The 325bps gap between its A3 and Ba2 facilities mostly prices counterparty risk, though the 100bps step from May to August, on shorter customer contracts, shows contract length and timing matter too.</w:t>
             </w:r>
           </w:p>
         </w:tc>
@@ -4327,7 +4327,7 @@
                 <w:sz w:val="18"/>
                 <w:szCs w:val="18"/>
               </w:rPr>
-              <w:t xml:space="preserve">Aligned data center ABS, loan to value</w:t>
+              <w:t xml:space="preserve">Aligned ABS master trust, senior LTV</w:t>
             </w:r>
           </w:p>
         </w:tc>
@@ -4360,7 +4360,7 @@
                 <w:sz w:val="18"/>
                 <w:szCs w:val="18"/>
               </w:rPr>
-              <w:t xml:space="preserve">70.0</w:t>
+              <w:t xml:space="preserve">about 70 (S&amp;P wording on past series)</w:t>
             </w:r>
           </w:p>
         </w:tc>
@@ -4393,7 +4393,7 @@
                 <w:sz w:val="18"/>
                 <w:szCs w:val="18"/>
               </w:rPr>
-              <w:t xml:space="preserve">Aligned release, S&amp;P presale</w:t>
+              <w:t xml:space="preserve">S&amp;P via trade press</w:t>
             </w:r>
           </w:p>
         </w:tc>
@@ -4631,7 +4631,7 @@
         </w:numPr>
         <w:spacing w:after="50" w:before="0"/>
       </w:pPr>
-      <w:hyperlink w:history="1" r:id="rIdg1gk3hq5w97ih8orcxsao">
+      <w:hyperlink w:history="1" r:id="rIdeemcc7evgonbkrdupt_s_">
         <w:r>
           <w:rPr>
             <w:rFonts w:ascii="Times New Roman" w:cs="Times New Roman" w:eastAsia="Times New Roman" w:hAnsi="Times New Roman"/>
@@ -4653,7 +4653,7 @@
         </w:numPr>
         <w:spacing w:after="50" w:before="0"/>
       </w:pPr>
-      <w:hyperlink w:history="1" r:id="rIddyhcnadbvx9pzuopvc0gs">
+      <w:hyperlink w:history="1" r:id="rIdvd4rs5y26ufpsm1hjnz11">
         <w:r>
           <w:rPr>
             <w:rFonts w:ascii="Times New Roman" w:cs="Times New Roman" w:eastAsia="Times New Roman" w:hAnsi="Times New Roman"/>
@@ -4675,7 +4675,7 @@
         </w:numPr>
         <w:spacing w:after="50" w:before="0"/>
       </w:pPr>
-      <w:hyperlink w:history="1" r:id="rIdrwunrm-n3bonrwbnt_npq">
+      <w:hyperlink w:history="1" r:id="rId62tt8rdzwprqfv0z2dt4u">
         <w:r>
           <w:rPr>
             <w:rFonts w:ascii="Times New Roman" w:cs="Times New Roman" w:eastAsia="Times New Roman" w:hAnsi="Times New Roman"/>
@@ -4697,7 +4697,7 @@
         </w:numPr>
         <w:spacing w:after="50" w:before="0"/>
       </w:pPr>
-      <w:hyperlink w:history="1" r:id="rIdhdrzdlkzryfx5rnkasw4v">
+      <w:hyperlink w:history="1" r:id="rIdfbfain0xspt9q3syczt4u">
         <w:r>
           <w:rPr>
             <w:rFonts w:ascii="Times New Roman" w:cs="Times New Roman" w:eastAsia="Times New Roman" w:hAnsi="Times New Roman"/>
@@ -4719,7 +4719,7 @@
         </w:numPr>
         <w:spacing w:after="50" w:before="0"/>
       </w:pPr>
-      <w:hyperlink w:history="1" r:id="rIda_zi2ntpteldpptknmprg">
+      <w:hyperlink w:history="1" r:id="rIdhibq5iuujik-pswnw2vnt">
         <w:r>
           <w:rPr>
             <w:rFonts w:ascii="Times New Roman" w:cs="Times New Roman" w:eastAsia="Times New Roman" w:hAnsi="Times New Roman"/>
@@ -4741,7 +4741,7 @@
         </w:numPr>
         <w:spacing w:after="50" w:before="0"/>
       </w:pPr>
-      <w:hyperlink w:history="1" r:id="rId_cdfgvhvfpq8leasabbm5">
+      <w:hyperlink w:history="1" r:id="rIdpkebar3rqcxnpmrezr-pk">
         <w:r>
           <w:rPr>
             <w:rFonts w:ascii="Times New Roman" w:cs="Times New Roman" w:eastAsia="Times New Roman" w:hAnsi="Times New Roman"/>
@@ -5350,7 +5350,7 @@
         </w:numPr>
         <w:spacing w:after="50" w:before="0"/>
       </w:pPr>
-      <w:hyperlink w:history="1" r:id="rIdyd6rqtfx-yjsiycclbmvh">
+      <w:hyperlink w:history="1" r:id="rIde9korhnlrqomdccaukns_">
         <w:r>
           <w:rPr>
             <w:rFonts w:ascii="Times New Roman" w:cs="Times New Roman" w:eastAsia="Times New Roman" w:hAnsi="Times New Roman"/>
@@ -5372,7 +5372,7 @@
         </w:numPr>
         <w:spacing w:after="50" w:before="0"/>
       </w:pPr>
-      <w:hyperlink w:history="1" r:id="rIdjmfbp9qexjao3ksbxqxbv">
+      <w:hyperlink w:history="1" r:id="rId8jpakr153z-mfyzjyvetn">
         <w:r>
           <w:rPr>
             <w:rFonts w:ascii="Times New Roman" w:cs="Times New Roman" w:eastAsia="Times New Roman" w:hAnsi="Times New Roman"/>
@@ -5981,7 +5981,7 @@
         </w:numPr>
         <w:spacing w:after="50" w:before="0"/>
       </w:pPr>
-      <w:hyperlink w:history="1" r:id="rIdp3iq_4qu_o4etcupb0qzw">
+      <w:hyperlink w:history="1" r:id="rIdjxfqdw3hf3bygphtodc4l">
         <w:r>
           <w:rPr>
             <w:rFonts w:ascii="Times New Roman" w:cs="Times New Roman" w:eastAsia="Times New Roman" w:hAnsi="Times New Roman"/>
@@ -6003,7 +6003,7 @@
         </w:numPr>
         <w:spacing w:after="50" w:before="0"/>
       </w:pPr>
-      <w:hyperlink w:history="1" r:id="rIdaoeirqyz8etgn_w6z_rwe">
+      <w:hyperlink w:history="1" r:id="rIdcgfl-lurumnx7ak9o8rfk">
         <w:r>
           <w:rPr>
             <w:rFonts w:ascii="Times New Roman" w:cs="Times New Roman" w:eastAsia="Times New Roman" w:hAnsi="Times New Roman"/>
@@ -6025,7 +6025,7 @@
         </w:numPr>
         <w:spacing w:after="50" w:before="0"/>
       </w:pPr>
-      <w:hyperlink w:history="1" r:id="rIdd0rrcvsuja8xwnqpk51hg">
+      <w:hyperlink w:history="1" r:id="rIdpjpqvahni0inugf9zod7p">
         <w:r>
           <w:rPr>
             <w:rFonts w:ascii="Times New Roman" w:cs="Times New Roman" w:eastAsia="Times New Roman" w:hAnsi="Times New Roman"/>
@@ -6047,7 +6047,7 @@
         </w:numPr>
         <w:spacing w:after="50" w:before="0"/>
       </w:pPr>
-      <w:hyperlink w:history="1" r:id="rIdeujfz0sbi9foqfsfspqmy">
+      <w:hyperlink w:history="1" r:id="rIdfoqd99segm7i4ajp9jzac">
         <w:r>
           <w:rPr>
             <w:rFonts w:ascii="Times New Roman" w:cs="Times New Roman" w:eastAsia="Times New Roman" w:hAnsi="Times New Roman"/>
@@ -6748,7 +6748,7 @@
           <w:sz w:val="20"/>
           <w:szCs w:val="20"/>
         </w:rPr>
-        <w:t xml:space="preserve">DDTL 4.0's SOFR plus 225 appears in the company release per the research notes, but one research pass rated it aggregator only. Confirm in the release before verifying.</w:t>
+        <w:t xml:space="preserve">All five margins confirmed against company releases and filings in reviews/fact-check-v2.md. DDTL 5.5 also reflects shorter customer contracts, not only timing.</w:t>
       </w:r>
     </w:p>
     <w:p>
@@ -6760,7 +6760,7 @@
         </w:numPr>
         <w:spacing w:after="50" w:before="0"/>
       </w:pPr>
-      <w:hyperlink w:history="1" r:id="rId0yj9g45-nysqmbuhah7zv">
+      <w:hyperlink w:history="1" r:id="rIdfiyw9yeptcg21kmhhsfyb">
         <w:r>
           <w:rPr>
             <w:rFonts w:ascii="Times New Roman" w:cs="Times New Roman" w:eastAsia="Times New Roman" w:hAnsi="Times New Roman"/>
@@ -6782,7 +6782,7 @@
         </w:numPr>
         <w:spacing w:after="50" w:before="0"/>
       </w:pPr>
-      <w:hyperlink w:history="1" r:id="rIdtsgyddhozw3pt-pvom-ig">
+      <w:hyperlink w:history="1" r:id="rIdhls-xggkfnv43adgxjexe">
         <w:r>
           <w:rPr>
             <w:rFonts w:ascii="Times New Roman" w:cs="Times New Roman" w:eastAsia="Times New Roman" w:hAnsi="Times New Roman"/>
@@ -6804,7 +6804,7 @@
         </w:numPr>
         <w:spacing w:after="50" w:before="0"/>
       </w:pPr>
-      <w:hyperlink w:history="1" r:id="rIdduqw6prxr3nruykky_61h">
+      <w:hyperlink w:history="1" r:id="rIdesbads_gwkifsv2_8n1i9">
         <w:r>
           <w:rPr>
             <w:rFonts w:ascii="Times New Roman" w:cs="Times New Roman" w:eastAsia="Times New Roman" w:hAnsi="Times New Roman"/>
@@ -6826,7 +6826,7 @@
         </w:numPr>
         <w:spacing w:after="50" w:before="0"/>
       </w:pPr>
-      <w:hyperlink w:history="1" r:id="rIdajtiscvt3pg0j2loxmfns">
+      <w:hyperlink w:history="1" r:id="rIdwid3laacobfew7yrtjnju">
         <w:r>
           <w:rPr>
             <w:rFonts w:ascii="Times New Roman" w:cs="Times New Roman" w:eastAsia="Times New Roman" w:hAnsi="Times New Roman"/>
@@ -6848,7 +6848,7 @@
         </w:numPr>
         <w:spacing w:after="50" w:before="0"/>
       </w:pPr>
-      <w:hyperlink w:history="1" r:id="rIdyk-579bo01aetdlqrpee1">
+      <w:hyperlink w:history="1" r:id="rIdoqeoolde40nqg5wnh0kob">
         <w:r>
           <w:rPr>
             <w:rFonts w:ascii="Times New Roman" w:cs="Times New Roman" w:eastAsia="Times New Roman" w:hAnsi="Times New Roman"/>
@@ -7665,7 +7665,7 @@
         </w:numPr>
         <w:spacing w:after="50" w:before="0"/>
       </w:pPr>
-      <w:hyperlink w:history="1" r:id="rIdmiduhxulcpulxbl2zkuh_">
+      <w:hyperlink w:history="1" r:id="rIdbhgleyc-t6hnaesq2ercv">
         <w:r>
           <w:rPr>
             <w:rFonts w:ascii="Times New Roman" w:cs="Times New Roman" w:eastAsia="Times New Roman" w:hAnsi="Times New Roman"/>
@@ -7687,7 +7687,7 @@
         </w:numPr>
         <w:spacing w:after="50" w:before="0"/>
       </w:pPr>
-      <w:hyperlink w:history="1" r:id="rIdmff0sxm8lj9urtcli1nsz">
+      <w:hyperlink w:history="1" r:id="rIdaqgvnlhf1alvl4mvswgfw">
         <w:r>
           <w:rPr>
             <w:rFonts w:ascii="Times New Roman" w:cs="Times New Roman" w:eastAsia="Times New Roman" w:hAnsi="Times New Roman"/>
@@ -7709,7 +7709,7 @@
         </w:numPr>
         <w:spacing w:after="50" w:before="0"/>
       </w:pPr>
-      <w:hyperlink w:history="1" r:id="rId67cxiah_laquyjuht99pd">
+      <w:hyperlink w:history="1" r:id="rIdc1qmtkjt3ujoo098dbkgt">
         <w:r>
           <w:rPr>
             <w:rFonts w:ascii="Times New Roman" w:cs="Times New Roman" w:eastAsia="Times New Roman" w:hAnsi="Times New Roman"/>
@@ -8110,7 +8110,7 @@
         </w:numPr>
         <w:spacing w:after="50" w:before="0"/>
       </w:pPr>
-      <w:hyperlink w:history="1" r:id="rIdbpimxjhfxf2c2fvxfx6fa">
+      <w:hyperlink w:history="1" r:id="rIdgozhut1p35uyde7i_lqr-">
         <w:r>
           <w:rPr>
             <w:rFonts w:ascii="Times New Roman" w:cs="Times New Roman" w:eastAsia="Times New Roman" w:hAnsi="Times New Roman"/>
@@ -8132,7 +8132,7 @@
         </w:numPr>
         <w:spacing w:after="50" w:before="0"/>
       </w:pPr>
-      <w:hyperlink w:history="1" r:id="rIdvzkztwpe4yrg6mqlvbr2v">
+      <w:hyperlink w:history="1" r:id="rIdbvswuexcy8ukg4ymrmftb">
         <w:r>
           <w:rPr>
             <w:rFonts w:ascii="Times New Roman" w:cs="Times New Roman" w:eastAsia="Times New Roman" w:hAnsi="Times New Roman"/>

</xml_diff>